<commit_message>
Finished documentation of scraping program
</commit_message>
<xml_diff>
--- a/(0) Disertation/Dissertation.docx
+++ b/(0) Disertation/Dissertation.docx
@@ -125,7 +125,7 @@
       <w:r>
         <w:fldChar w:fldCharType="separate"/>
       </w:r>
-      <w:hyperlink w:anchor="_Toc202900748" w:history="1">
+      <w:hyperlink w:anchor="_Toc203070809" w:history="1">
         <w:r>
           <w:rPr>
             <w:rStyle w:val="Hyperlink"/>
@@ -152,7 +152,7 @@
             <w:noProof/>
             <w:webHidden/>
           </w:rPr>
-          <w:instrText xml:space="preserve"> PAGEREF _Toc202900748 \h </w:instrText>
+          <w:instrText xml:space="preserve"> PAGEREF _Toc203070809 \h </w:instrText>
         </w:r>
         <w:r>
           <w:rPr>
@@ -195,7 +195,7 @@
           <w:lang w:eastAsia="en-GB"/>
         </w:rPr>
       </w:pPr>
-      <w:hyperlink w:anchor="_Toc202900749" w:history="1">
+      <w:hyperlink w:anchor="_Toc203070810" w:history="1">
         <w:r>
           <w:rPr>
             <w:rStyle w:val="Hyperlink"/>
@@ -222,7 +222,7 @@
             <w:noProof/>
             <w:webHidden/>
           </w:rPr>
-          <w:instrText xml:space="preserve"> PAGEREF _Toc202900749 \h </w:instrText>
+          <w:instrText xml:space="preserve"> PAGEREF _Toc203070810 \h </w:instrText>
         </w:r>
         <w:r>
           <w:rPr>
@@ -265,7 +265,7 @@
           <w:lang w:eastAsia="en-GB"/>
         </w:rPr>
       </w:pPr>
-      <w:hyperlink w:anchor="_Toc202900750" w:history="1">
+      <w:hyperlink w:anchor="_Toc203070811" w:history="1">
         <w:r>
           <w:rPr>
             <w:rStyle w:val="Hyperlink"/>
@@ -292,7 +292,7 @@
             <w:noProof/>
             <w:webHidden/>
           </w:rPr>
-          <w:instrText xml:space="preserve"> PAGEREF _Toc202900750 \h </w:instrText>
+          <w:instrText xml:space="preserve"> PAGEREF _Toc203070811 \h </w:instrText>
         </w:r>
         <w:r>
           <w:rPr>
@@ -335,7 +335,7 @@
           <w:lang w:eastAsia="en-GB"/>
         </w:rPr>
       </w:pPr>
-      <w:hyperlink w:anchor="_Toc202900751" w:history="1">
+      <w:hyperlink w:anchor="_Toc203070812" w:history="1">
         <w:r>
           <w:rPr>
             <w:rStyle w:val="Hyperlink"/>
@@ -362,7 +362,7 @@
             <w:noProof/>
             <w:webHidden/>
           </w:rPr>
-          <w:instrText xml:space="preserve"> PAGEREF _Toc202900751 \h </w:instrText>
+          <w:instrText xml:space="preserve"> PAGEREF _Toc203070812 \h </w:instrText>
         </w:r>
         <w:r>
           <w:rPr>
@@ -405,7 +405,7 @@
           <w:lang w:eastAsia="en-GB"/>
         </w:rPr>
       </w:pPr>
-      <w:hyperlink w:anchor="_Toc202900752" w:history="1">
+      <w:hyperlink w:anchor="_Toc203070813" w:history="1">
         <w:r>
           <w:rPr>
             <w:rStyle w:val="Hyperlink"/>
@@ -432,7 +432,7 @@
             <w:noProof/>
             <w:webHidden/>
           </w:rPr>
-          <w:instrText xml:space="preserve"> PAGEREF _Toc202900752 \h </w:instrText>
+          <w:instrText xml:space="preserve"> PAGEREF _Toc203070813 \h </w:instrText>
         </w:r>
         <w:r>
           <w:rPr>
@@ -475,7 +475,7 @@
           <w:lang w:eastAsia="en-GB"/>
         </w:rPr>
       </w:pPr>
-      <w:hyperlink w:anchor="_Toc202900753" w:history="1">
+      <w:hyperlink w:anchor="_Toc203070814" w:history="1">
         <w:r>
           <w:rPr>
             <w:rStyle w:val="Hyperlink"/>
@@ -502,7 +502,7 @@
             <w:noProof/>
             <w:webHidden/>
           </w:rPr>
-          <w:instrText xml:space="preserve"> PAGEREF _Toc202900753 \h </w:instrText>
+          <w:instrText xml:space="preserve"> PAGEREF _Toc203070814 \h </w:instrText>
         </w:r>
         <w:r>
           <w:rPr>
@@ -545,7 +545,7 @@
           <w:lang w:eastAsia="en-GB"/>
         </w:rPr>
       </w:pPr>
-      <w:hyperlink w:anchor="_Toc202900754" w:history="1">
+      <w:hyperlink w:anchor="_Toc203070815" w:history="1">
         <w:r>
           <w:rPr>
             <w:rStyle w:val="Hyperlink"/>
@@ -572,7 +572,7 @@
             <w:noProof/>
             <w:webHidden/>
           </w:rPr>
-          <w:instrText xml:space="preserve"> PAGEREF _Toc202900754 \h </w:instrText>
+          <w:instrText xml:space="preserve"> PAGEREF _Toc203070815 \h </w:instrText>
         </w:r>
         <w:r>
           <w:rPr>
@@ -615,7 +615,7 @@
           <w:lang w:eastAsia="en-GB"/>
         </w:rPr>
       </w:pPr>
-      <w:hyperlink w:anchor="_Toc202900755" w:history="1">
+      <w:hyperlink w:anchor="_Toc203070816" w:history="1">
         <w:r>
           <w:rPr>
             <w:rStyle w:val="Hyperlink"/>
@@ -642,7 +642,7 @@
             <w:noProof/>
             <w:webHidden/>
           </w:rPr>
-          <w:instrText xml:space="preserve"> PAGEREF _Toc202900755 \h </w:instrText>
+          <w:instrText xml:space="preserve"> PAGEREF _Toc203070816 \h </w:instrText>
         </w:r>
         <w:r>
           <w:rPr>
@@ -685,7 +685,7 @@
           <w:lang w:eastAsia="en-GB"/>
         </w:rPr>
       </w:pPr>
-      <w:hyperlink w:anchor="_Toc202900756" w:history="1">
+      <w:hyperlink w:anchor="_Toc203070817" w:history="1">
         <w:r>
           <w:rPr>
             <w:rStyle w:val="Hyperlink"/>
@@ -712,7 +712,7 @@
             <w:noProof/>
             <w:webHidden/>
           </w:rPr>
-          <w:instrText xml:space="preserve"> PAGEREF _Toc202900756 \h </w:instrText>
+          <w:instrText xml:space="preserve"> PAGEREF _Toc203070817 \h </w:instrText>
         </w:r>
         <w:r>
           <w:rPr>
@@ -755,7 +755,7 @@
           <w:lang w:eastAsia="en-GB"/>
         </w:rPr>
       </w:pPr>
-      <w:hyperlink w:anchor="_Toc202900757" w:history="1">
+      <w:hyperlink w:anchor="_Toc203070818" w:history="1">
         <w:r>
           <w:rPr>
             <w:rStyle w:val="Hyperlink"/>
@@ -782,7 +782,7 @@
             <w:noProof/>
             <w:webHidden/>
           </w:rPr>
-          <w:instrText xml:space="preserve"> PAGEREF _Toc202900757 \h </w:instrText>
+          <w:instrText xml:space="preserve"> PAGEREF _Toc203070818 \h </w:instrText>
         </w:r>
         <w:r>
           <w:rPr>
@@ -825,7 +825,7 @@
           <w:lang w:eastAsia="en-GB"/>
         </w:rPr>
       </w:pPr>
-      <w:hyperlink w:anchor="_Toc202900758" w:history="1">
+      <w:hyperlink w:anchor="_Toc203070819" w:history="1">
         <w:r>
           <w:rPr>
             <w:rStyle w:val="Hyperlink"/>
@@ -852,7 +852,7 @@
             <w:noProof/>
             <w:webHidden/>
           </w:rPr>
-          <w:instrText xml:space="preserve"> PAGEREF _Toc202900758 \h </w:instrText>
+          <w:instrText xml:space="preserve"> PAGEREF _Toc203070819 \h </w:instrText>
         </w:r>
         <w:r>
           <w:rPr>
@@ -895,7 +895,7 @@
           <w:lang w:eastAsia="en-GB"/>
         </w:rPr>
       </w:pPr>
-      <w:hyperlink w:anchor="_Toc202900759" w:history="1">
+      <w:hyperlink w:anchor="_Toc203070820" w:history="1">
         <w:r>
           <w:rPr>
             <w:rStyle w:val="Hyperlink"/>
@@ -922,7 +922,7 @@
             <w:noProof/>
             <w:webHidden/>
           </w:rPr>
-          <w:instrText xml:space="preserve"> PAGEREF _Toc202900759 \h </w:instrText>
+          <w:instrText xml:space="preserve"> PAGEREF _Toc203070820 \h </w:instrText>
         </w:r>
         <w:r>
           <w:rPr>
@@ -965,7 +965,7 @@
           <w:lang w:eastAsia="en-GB"/>
         </w:rPr>
       </w:pPr>
-      <w:hyperlink w:anchor="_Toc202900760" w:history="1">
+      <w:hyperlink w:anchor="_Toc203070821" w:history="1">
         <w:r>
           <w:rPr>
             <w:rStyle w:val="Hyperlink"/>
@@ -992,7 +992,7 @@
             <w:noProof/>
             <w:webHidden/>
           </w:rPr>
-          <w:instrText xml:space="preserve"> PAGEREF _Toc202900760 \h </w:instrText>
+          <w:instrText xml:space="preserve"> PAGEREF _Toc203070821 \h </w:instrText>
         </w:r>
         <w:r>
           <w:rPr>
@@ -1035,7 +1035,7 @@
           <w:lang w:eastAsia="en-GB"/>
         </w:rPr>
       </w:pPr>
-      <w:hyperlink w:anchor="_Toc202900761" w:history="1">
+      <w:hyperlink w:anchor="_Toc203070822" w:history="1">
         <w:r>
           <w:rPr>
             <w:rStyle w:val="Hyperlink"/>
@@ -1062,7 +1062,7 @@
             <w:noProof/>
             <w:webHidden/>
           </w:rPr>
-          <w:instrText xml:space="preserve"> PAGEREF _Toc202900761 \h </w:instrText>
+          <w:instrText xml:space="preserve"> PAGEREF _Toc203070822 \h </w:instrText>
         </w:r>
         <w:r>
           <w:rPr>
@@ -1105,7 +1105,7 @@
           <w:lang w:eastAsia="en-GB"/>
         </w:rPr>
       </w:pPr>
-      <w:hyperlink w:anchor="_Toc202900762" w:history="1">
+      <w:hyperlink w:anchor="_Toc203070823" w:history="1">
         <w:r>
           <w:rPr>
             <w:rStyle w:val="Hyperlink"/>
@@ -1132,7 +1132,7 @@
             <w:noProof/>
             <w:webHidden/>
           </w:rPr>
-          <w:instrText xml:space="preserve"> PAGEREF _Toc202900762 \h </w:instrText>
+          <w:instrText xml:space="preserve"> PAGEREF _Toc203070823 \h </w:instrText>
         </w:r>
         <w:r>
           <w:rPr>
@@ -1175,7 +1175,7 @@
           <w:lang w:eastAsia="en-GB"/>
         </w:rPr>
       </w:pPr>
-      <w:hyperlink w:anchor="_Toc202900763" w:history="1">
+      <w:hyperlink w:anchor="_Toc203070824" w:history="1">
         <w:r>
           <w:rPr>
             <w:rStyle w:val="Hyperlink"/>
@@ -1202,7 +1202,7 @@
             <w:noProof/>
             <w:webHidden/>
           </w:rPr>
-          <w:instrText xml:space="preserve"> PAGEREF _Toc202900763 \h </w:instrText>
+          <w:instrText xml:space="preserve"> PAGEREF _Toc203070824 \h </w:instrText>
         </w:r>
         <w:r>
           <w:rPr>
@@ -1245,7 +1245,7 @@
           <w:lang w:eastAsia="en-GB"/>
         </w:rPr>
       </w:pPr>
-      <w:hyperlink w:anchor="_Toc202900764" w:history="1">
+      <w:hyperlink w:anchor="_Toc203070825" w:history="1">
         <w:r>
           <w:rPr>
             <w:rStyle w:val="Hyperlink"/>
@@ -1272,7 +1272,7 @@
             <w:noProof/>
             <w:webHidden/>
           </w:rPr>
-          <w:instrText xml:space="preserve"> PAGEREF _Toc202900764 \h </w:instrText>
+          <w:instrText xml:space="preserve"> PAGEREF _Toc203070825 \h </w:instrText>
         </w:r>
         <w:r>
           <w:rPr>
@@ -1315,7 +1315,7 @@
           <w:lang w:eastAsia="en-GB"/>
         </w:rPr>
       </w:pPr>
-      <w:hyperlink w:anchor="_Toc202900765" w:history="1">
+      <w:hyperlink w:anchor="_Toc203070826" w:history="1">
         <w:r>
           <w:rPr>
             <w:rStyle w:val="Hyperlink"/>
@@ -1342,7 +1342,7 @@
             <w:noProof/>
             <w:webHidden/>
           </w:rPr>
-          <w:instrText xml:space="preserve"> PAGEREF _Toc202900765 \h </w:instrText>
+          <w:instrText xml:space="preserve"> PAGEREF _Toc203070826 \h </w:instrText>
         </w:r>
         <w:r>
           <w:rPr>
@@ -1385,7 +1385,7 @@
           <w:lang w:eastAsia="en-GB"/>
         </w:rPr>
       </w:pPr>
-      <w:hyperlink w:anchor="_Toc202900766" w:history="1">
+      <w:hyperlink w:anchor="_Toc203070827" w:history="1">
         <w:r>
           <w:rPr>
             <w:rStyle w:val="Hyperlink"/>
@@ -1412,7 +1412,7 @@
             <w:noProof/>
             <w:webHidden/>
           </w:rPr>
-          <w:instrText xml:space="preserve"> PAGEREF _Toc202900766 \h </w:instrText>
+          <w:instrText xml:space="preserve"> PAGEREF _Toc203070827 \h </w:instrText>
         </w:r>
         <w:r>
           <w:rPr>
@@ -1455,7 +1455,7 @@
           <w:lang w:eastAsia="en-GB"/>
         </w:rPr>
       </w:pPr>
-      <w:hyperlink w:anchor="_Toc202900767" w:history="1">
+      <w:hyperlink w:anchor="_Toc203070828" w:history="1">
         <w:r>
           <w:rPr>
             <w:rStyle w:val="Hyperlink"/>
@@ -1482,7 +1482,7 @@
             <w:noProof/>
             <w:webHidden/>
           </w:rPr>
-          <w:instrText xml:space="preserve"> PAGEREF _Toc202900767 \h </w:instrText>
+          <w:instrText xml:space="preserve"> PAGEREF _Toc203070828 \h </w:instrText>
         </w:r>
         <w:r>
           <w:rPr>
@@ -1503,6 +1503,216 @@
             <w:webHidden/>
           </w:rPr>
           <w:t>23</w:t>
+        </w:r>
+        <w:r>
+          <w:rPr>
+            <w:noProof/>
+            <w:webHidden/>
+          </w:rPr>
+          <w:fldChar w:fldCharType="end"/>
+        </w:r>
+      </w:hyperlink>
+    </w:p>
+    <w:p>
+      <w:pPr>
+        <w:pStyle w:val="TOC3"/>
+        <w:tabs>
+          <w:tab w:val="right" w:leader="dot" w:pos="9016"/>
+        </w:tabs>
+        <w:rPr>
+          <w:rFonts w:asciiTheme="minorHAnsi" w:eastAsiaTheme="minorEastAsia" w:hAnsiTheme="minorHAnsi"/>
+          <w:noProof/>
+          <w:lang w:eastAsia="en-GB"/>
+        </w:rPr>
+      </w:pPr>
+      <w:hyperlink w:anchor="_Toc203070829" w:history="1">
+        <w:r>
+          <w:rPr>
+            <w:rStyle w:val="Hyperlink"/>
+            <w:noProof/>
+          </w:rPr>
+          <w:t>Main Loop and Infinite URL</w:t>
+        </w:r>
+        <w:r>
+          <w:rPr>
+            <w:noProof/>
+            <w:webHidden/>
+          </w:rPr>
+          <w:tab/>
+        </w:r>
+        <w:r>
+          <w:rPr>
+            <w:noProof/>
+            <w:webHidden/>
+          </w:rPr>
+          <w:fldChar w:fldCharType="begin"/>
+        </w:r>
+        <w:r>
+          <w:rPr>
+            <w:noProof/>
+            <w:webHidden/>
+          </w:rPr>
+          <w:instrText xml:space="preserve"> PAGEREF _Toc203070829 \h </w:instrText>
+        </w:r>
+        <w:r>
+          <w:rPr>
+            <w:noProof/>
+            <w:webHidden/>
+          </w:rPr>
+        </w:r>
+        <w:r>
+          <w:rPr>
+            <w:noProof/>
+            <w:webHidden/>
+          </w:rPr>
+          <w:fldChar w:fldCharType="separate"/>
+        </w:r>
+        <w:r>
+          <w:rPr>
+            <w:noProof/>
+            <w:webHidden/>
+          </w:rPr>
+          <w:t>23</w:t>
+        </w:r>
+        <w:r>
+          <w:rPr>
+            <w:noProof/>
+            <w:webHidden/>
+          </w:rPr>
+          <w:fldChar w:fldCharType="end"/>
+        </w:r>
+      </w:hyperlink>
+    </w:p>
+    <w:p>
+      <w:pPr>
+        <w:pStyle w:val="TOC3"/>
+        <w:tabs>
+          <w:tab w:val="right" w:leader="dot" w:pos="9016"/>
+        </w:tabs>
+        <w:rPr>
+          <w:rFonts w:asciiTheme="minorHAnsi" w:eastAsiaTheme="minorEastAsia" w:hAnsiTheme="minorHAnsi"/>
+          <w:noProof/>
+          <w:lang w:eastAsia="en-GB"/>
+        </w:rPr>
+      </w:pPr>
+      <w:hyperlink w:anchor="_Toc203070830" w:history="1">
+        <w:r>
+          <w:rPr>
+            <w:rStyle w:val="Hyperlink"/>
+            <w:noProof/>
+          </w:rPr>
+          <w:t>Per Game Page Scraping</w:t>
+        </w:r>
+        <w:r>
+          <w:rPr>
+            <w:noProof/>
+            <w:webHidden/>
+          </w:rPr>
+          <w:tab/>
+        </w:r>
+        <w:r>
+          <w:rPr>
+            <w:noProof/>
+            <w:webHidden/>
+          </w:rPr>
+          <w:fldChar w:fldCharType="begin"/>
+        </w:r>
+        <w:r>
+          <w:rPr>
+            <w:noProof/>
+            <w:webHidden/>
+          </w:rPr>
+          <w:instrText xml:space="preserve"> PAGEREF _Toc203070830 \h </w:instrText>
+        </w:r>
+        <w:r>
+          <w:rPr>
+            <w:noProof/>
+            <w:webHidden/>
+          </w:rPr>
+        </w:r>
+        <w:r>
+          <w:rPr>
+            <w:noProof/>
+            <w:webHidden/>
+          </w:rPr>
+          <w:fldChar w:fldCharType="separate"/>
+        </w:r>
+        <w:r>
+          <w:rPr>
+            <w:noProof/>
+            <w:webHidden/>
+          </w:rPr>
+          <w:t>26</w:t>
+        </w:r>
+        <w:r>
+          <w:rPr>
+            <w:noProof/>
+            <w:webHidden/>
+          </w:rPr>
+          <w:fldChar w:fldCharType="end"/>
+        </w:r>
+      </w:hyperlink>
+    </w:p>
+    <w:p>
+      <w:pPr>
+        <w:pStyle w:val="TOC3"/>
+        <w:tabs>
+          <w:tab w:val="right" w:leader="dot" w:pos="9016"/>
+        </w:tabs>
+        <w:rPr>
+          <w:rFonts w:asciiTheme="minorHAnsi" w:eastAsiaTheme="minorEastAsia" w:hAnsiTheme="minorHAnsi"/>
+          <w:noProof/>
+          <w:lang w:eastAsia="en-GB"/>
+        </w:rPr>
+      </w:pPr>
+      <w:hyperlink w:anchor="_Toc203070831" w:history="1">
+        <w:r>
+          <w:rPr>
+            <w:rStyle w:val="Hyperlink"/>
+            <w:noProof/>
+          </w:rPr>
+          <w:t>Saving to CSV</w:t>
+        </w:r>
+        <w:r>
+          <w:rPr>
+            <w:noProof/>
+            <w:webHidden/>
+          </w:rPr>
+          <w:tab/>
+        </w:r>
+        <w:r>
+          <w:rPr>
+            <w:noProof/>
+            <w:webHidden/>
+          </w:rPr>
+          <w:fldChar w:fldCharType="begin"/>
+        </w:r>
+        <w:r>
+          <w:rPr>
+            <w:noProof/>
+            <w:webHidden/>
+          </w:rPr>
+          <w:instrText xml:space="preserve"> PAGEREF _Toc203070831 \h </w:instrText>
+        </w:r>
+        <w:r>
+          <w:rPr>
+            <w:noProof/>
+            <w:webHidden/>
+          </w:rPr>
+        </w:r>
+        <w:r>
+          <w:rPr>
+            <w:noProof/>
+            <w:webHidden/>
+          </w:rPr>
+          <w:fldChar w:fldCharType="separate"/>
+        </w:r>
+        <w:r>
+          <w:rPr>
+            <w:noProof/>
+            <w:webHidden/>
+          </w:rPr>
+          <w:t>30</w:t>
         </w:r>
         <w:r>
           <w:rPr>
@@ -1525,7 +1735,7 @@
           <w:lang w:eastAsia="en-GB"/>
         </w:rPr>
       </w:pPr>
-      <w:hyperlink w:anchor="_Toc202900768" w:history="1">
+      <w:hyperlink w:anchor="_Toc203070832" w:history="1">
         <w:r>
           <w:rPr>
             <w:rStyle w:val="Hyperlink"/>
@@ -1552,7 +1762,7 @@
             <w:noProof/>
             <w:webHidden/>
           </w:rPr>
-          <w:instrText xml:space="preserve"> PAGEREF _Toc202900768 \h </w:instrText>
+          <w:instrText xml:space="preserve"> PAGEREF _Toc203070832 \h </w:instrText>
         </w:r>
         <w:r>
           <w:rPr>
@@ -1572,7 +1782,7 @@
             <w:noProof/>
             <w:webHidden/>
           </w:rPr>
-          <w:t>24</w:t>
+          <w:t>31</w:t>
         </w:r>
         <w:r>
           <w:rPr>
@@ -1595,7 +1805,7 @@
           <w:lang w:eastAsia="en-GB"/>
         </w:rPr>
       </w:pPr>
-      <w:hyperlink w:anchor="_Toc202900769" w:history="1">
+      <w:hyperlink w:anchor="_Toc203070833" w:history="1">
         <w:r>
           <w:rPr>
             <w:rStyle w:val="Hyperlink"/>
@@ -1622,7 +1832,7 @@
             <w:noProof/>
             <w:webHidden/>
           </w:rPr>
-          <w:instrText xml:space="preserve"> PAGEREF _Toc202900769 \h </w:instrText>
+          <w:instrText xml:space="preserve"> PAGEREF _Toc203070833 \h </w:instrText>
         </w:r>
         <w:r>
           <w:rPr>
@@ -1642,7 +1852,7 @@
             <w:noProof/>
             <w:webHidden/>
           </w:rPr>
-          <w:t>25</w:t>
+          <w:t>32</w:t>
         </w:r>
         <w:r>
           <w:rPr>
@@ -1665,7 +1875,7 @@
           <w:lang w:eastAsia="en-GB"/>
         </w:rPr>
       </w:pPr>
-      <w:hyperlink w:anchor="_Toc202900770" w:history="1">
+      <w:hyperlink w:anchor="_Toc203070834" w:history="1">
         <w:r>
           <w:rPr>
             <w:rStyle w:val="Hyperlink"/>
@@ -1692,7 +1902,7 @@
             <w:noProof/>
             <w:webHidden/>
           </w:rPr>
-          <w:instrText xml:space="preserve"> PAGEREF _Toc202900770 \h </w:instrText>
+          <w:instrText xml:space="preserve"> PAGEREF _Toc203070834 \h </w:instrText>
         </w:r>
         <w:r>
           <w:rPr>
@@ -1712,7 +1922,7 @@
             <w:noProof/>
             <w:webHidden/>
           </w:rPr>
-          <w:t>26</w:t>
+          <w:t>33</w:t>
         </w:r>
         <w:r>
           <w:rPr>
@@ -1735,7 +1945,7 @@
           <w:lang w:eastAsia="en-GB"/>
         </w:rPr>
       </w:pPr>
-      <w:hyperlink w:anchor="_Toc202900771" w:history="1">
+      <w:hyperlink w:anchor="_Toc203070835" w:history="1">
         <w:r>
           <w:rPr>
             <w:rStyle w:val="Hyperlink"/>
@@ -1762,7 +1972,7 @@
             <w:noProof/>
             <w:webHidden/>
           </w:rPr>
-          <w:instrText xml:space="preserve"> PAGEREF _Toc202900771 \h </w:instrText>
+          <w:instrText xml:space="preserve"> PAGEREF _Toc203070835 \h </w:instrText>
         </w:r>
         <w:r>
           <w:rPr>
@@ -1782,7 +1992,7 @@
             <w:noProof/>
             <w:webHidden/>
           </w:rPr>
-          <w:t>26</w:t>
+          <w:t>33</w:t>
         </w:r>
         <w:r>
           <w:rPr>
@@ -1805,7 +2015,7 @@
           <w:lang w:eastAsia="en-GB"/>
         </w:rPr>
       </w:pPr>
-      <w:hyperlink w:anchor="_Toc202900772" w:history="1">
+      <w:hyperlink w:anchor="_Toc203070836" w:history="1">
         <w:r>
           <w:rPr>
             <w:rStyle w:val="Hyperlink"/>
@@ -1832,7 +2042,7 @@
             <w:noProof/>
             <w:webHidden/>
           </w:rPr>
-          <w:instrText xml:space="preserve"> PAGEREF _Toc202900772 \h </w:instrText>
+          <w:instrText xml:space="preserve"> PAGEREF _Toc203070836 \h </w:instrText>
         </w:r>
         <w:r>
           <w:rPr>
@@ -1852,7 +2062,7 @@
             <w:noProof/>
             <w:webHidden/>
           </w:rPr>
-          <w:t>27</w:t>
+          <w:t>34</w:t>
         </w:r>
         <w:r>
           <w:rPr>
@@ -1875,7 +2085,7 @@
           <w:lang w:eastAsia="en-GB"/>
         </w:rPr>
       </w:pPr>
-      <w:hyperlink w:anchor="_Toc202900773" w:history="1">
+      <w:hyperlink w:anchor="_Toc203070837" w:history="1">
         <w:r>
           <w:rPr>
             <w:rStyle w:val="Hyperlink"/>
@@ -1902,7 +2112,7 @@
             <w:noProof/>
             <w:webHidden/>
           </w:rPr>
-          <w:instrText xml:space="preserve"> PAGEREF _Toc202900773 \h </w:instrText>
+          <w:instrText xml:space="preserve"> PAGEREF _Toc203070837 \h </w:instrText>
         </w:r>
         <w:r>
           <w:rPr>
@@ -1922,7 +2132,7 @@
             <w:noProof/>
             <w:webHidden/>
           </w:rPr>
-          <w:t>28</w:t>
+          <w:t>35</w:t>
         </w:r>
         <w:r>
           <w:rPr>
@@ -1945,7 +2155,7 @@
           <w:lang w:eastAsia="en-GB"/>
         </w:rPr>
       </w:pPr>
-      <w:hyperlink w:anchor="_Toc202900774" w:history="1">
+      <w:hyperlink w:anchor="_Toc203070838" w:history="1">
         <w:r>
           <w:rPr>
             <w:rStyle w:val="Hyperlink"/>
@@ -1972,7 +2182,7 @@
             <w:noProof/>
             <w:webHidden/>
           </w:rPr>
-          <w:instrText xml:space="preserve"> PAGEREF _Toc202900774 \h </w:instrText>
+          <w:instrText xml:space="preserve"> PAGEREF _Toc203070838 \h </w:instrText>
         </w:r>
         <w:r>
           <w:rPr>
@@ -1992,7 +2202,7 @@
             <w:noProof/>
             <w:webHidden/>
           </w:rPr>
-          <w:t>29</w:t>
+          <w:t>36</w:t>
         </w:r>
         <w:r>
           <w:rPr>
@@ -2015,7 +2225,7 @@
           <w:lang w:eastAsia="en-GB"/>
         </w:rPr>
       </w:pPr>
-      <w:hyperlink w:anchor="_Toc202900775" w:history="1">
+      <w:hyperlink w:anchor="_Toc203070839" w:history="1">
         <w:r>
           <w:rPr>
             <w:rStyle w:val="Hyperlink"/>
@@ -2042,7 +2252,7 @@
             <w:noProof/>
             <w:webHidden/>
           </w:rPr>
-          <w:instrText xml:space="preserve"> PAGEREF _Toc202900775 \h </w:instrText>
+          <w:instrText xml:space="preserve"> PAGEREF _Toc203070839 \h </w:instrText>
         </w:r>
         <w:r>
           <w:rPr>
@@ -2062,7 +2272,7 @@
             <w:noProof/>
             <w:webHidden/>
           </w:rPr>
-          <w:t>30</w:t>
+          <w:t>37</w:t>
         </w:r>
         <w:r>
           <w:rPr>
@@ -2085,7 +2295,7 @@
       <w:pPr>
         <w:pStyle w:val="Heading1"/>
       </w:pPr>
-      <w:bookmarkStart w:id="0" w:name="_Toc202900748"/>
+      <w:bookmarkStart w:id="0" w:name="_Toc203070809"/>
       <w:r>
         <w:lastRenderedPageBreak/>
         <w:t>Figures</w:t>
@@ -2113,7 +2323,7 @@
       <w:r>
         <w:fldChar w:fldCharType="separate"/>
       </w:r>
-      <w:hyperlink w:anchor="_Toc202947664" w:history="1">
+      <w:hyperlink w:anchor="_Toc203070840" w:history="1">
         <w:r>
           <w:rPr>
             <w:rStyle w:val="Hyperlink"/>
@@ -2140,7 +2350,7 @@
             <w:noProof/>
             <w:webHidden/>
           </w:rPr>
-          <w:instrText xml:space="preserve"> PAGEREF _Toc202947664 \h </w:instrText>
+          <w:instrText xml:space="preserve"> PAGEREF _Toc203070840 \h </w:instrText>
         </w:r>
         <w:r>
           <w:rPr>
@@ -2183,7 +2393,7 @@
           <w:lang w:eastAsia="en-GB"/>
         </w:rPr>
       </w:pPr>
-      <w:hyperlink w:anchor="_Toc202947665" w:history="1">
+      <w:hyperlink w:anchor="_Toc203070841" w:history="1">
         <w:r>
           <w:rPr>
             <w:rStyle w:val="Hyperlink"/>
@@ -2210,7 +2420,7 @@
             <w:noProof/>
             <w:webHidden/>
           </w:rPr>
-          <w:instrText xml:space="preserve"> PAGEREF _Toc202947665 \h </w:instrText>
+          <w:instrText xml:space="preserve"> PAGEREF _Toc203070841 \h </w:instrText>
         </w:r>
         <w:r>
           <w:rPr>
@@ -2253,7 +2463,7 @@
           <w:lang w:eastAsia="en-GB"/>
         </w:rPr>
       </w:pPr>
-      <w:hyperlink w:anchor="_Toc202947666" w:history="1">
+      <w:hyperlink w:anchor="_Toc203070842" w:history="1">
         <w:r>
           <w:rPr>
             <w:rStyle w:val="Hyperlink"/>
@@ -2280,7 +2490,7 @@
             <w:noProof/>
             <w:webHidden/>
           </w:rPr>
-          <w:instrText xml:space="preserve"> PAGEREF _Toc202947666 \h </w:instrText>
+          <w:instrText xml:space="preserve"> PAGEREF _Toc203070842 \h </w:instrText>
         </w:r>
         <w:r>
           <w:rPr>
@@ -2323,7 +2533,7 @@
           <w:lang w:eastAsia="en-GB"/>
         </w:rPr>
       </w:pPr>
-      <w:hyperlink w:anchor="_Toc202947667" w:history="1">
+      <w:hyperlink w:anchor="_Toc203070843" w:history="1">
         <w:r>
           <w:rPr>
             <w:rStyle w:val="Hyperlink"/>
@@ -2350,7 +2560,7 @@
             <w:noProof/>
             <w:webHidden/>
           </w:rPr>
-          <w:instrText xml:space="preserve"> PAGEREF _Toc202947667 \h </w:instrText>
+          <w:instrText xml:space="preserve"> PAGEREF _Toc203070843 \h </w:instrText>
         </w:r>
         <w:r>
           <w:rPr>
@@ -2393,7 +2603,7 @@
           <w:lang w:eastAsia="en-GB"/>
         </w:rPr>
       </w:pPr>
-      <w:hyperlink w:anchor="_Toc202947668" w:history="1">
+      <w:hyperlink w:anchor="_Toc203070844" w:history="1">
         <w:r>
           <w:rPr>
             <w:rStyle w:val="Hyperlink"/>
@@ -2420,7 +2630,7 @@
             <w:noProof/>
             <w:webHidden/>
           </w:rPr>
-          <w:instrText xml:space="preserve"> PAGEREF _Toc202947668 \h </w:instrText>
+          <w:instrText xml:space="preserve"> PAGEREF _Toc203070844 \h </w:instrText>
         </w:r>
         <w:r>
           <w:rPr>
@@ -2463,7 +2673,7 @@
           <w:lang w:eastAsia="en-GB"/>
         </w:rPr>
       </w:pPr>
-      <w:hyperlink w:anchor="_Toc202947669" w:history="1">
+      <w:hyperlink w:anchor="_Toc203070845" w:history="1">
         <w:r>
           <w:rPr>
             <w:rStyle w:val="Hyperlink"/>
@@ -2490,7 +2700,7 @@
             <w:noProof/>
             <w:webHidden/>
           </w:rPr>
-          <w:instrText xml:space="preserve"> PAGEREF _Toc202947669 \h </w:instrText>
+          <w:instrText xml:space="preserve"> PAGEREF _Toc203070845 \h </w:instrText>
         </w:r>
         <w:r>
           <w:rPr>
@@ -2533,7 +2743,7 @@
           <w:lang w:eastAsia="en-GB"/>
         </w:rPr>
       </w:pPr>
-      <w:hyperlink w:anchor="_Toc202947670" w:history="1">
+      <w:hyperlink w:anchor="_Toc203070846" w:history="1">
         <w:r>
           <w:rPr>
             <w:rStyle w:val="Hyperlink"/>
@@ -2560,7 +2770,7 @@
             <w:noProof/>
             <w:webHidden/>
           </w:rPr>
-          <w:instrText xml:space="preserve"> PAGEREF _Toc202947670 \h </w:instrText>
+          <w:instrText xml:space="preserve"> PAGEREF _Toc203070846 \h </w:instrText>
         </w:r>
         <w:r>
           <w:rPr>
@@ -2603,7 +2813,7 @@
           <w:lang w:eastAsia="en-GB"/>
         </w:rPr>
       </w:pPr>
-      <w:hyperlink w:anchor="_Toc202947671" w:history="1">
+      <w:hyperlink w:anchor="_Toc203070847" w:history="1">
         <w:r>
           <w:rPr>
             <w:rStyle w:val="Hyperlink"/>
@@ -2630,7 +2840,7 @@
             <w:noProof/>
             <w:webHidden/>
           </w:rPr>
-          <w:instrText xml:space="preserve"> PAGEREF _Toc202947671 \h </w:instrText>
+          <w:instrText xml:space="preserve"> PAGEREF _Toc203070847 \h </w:instrText>
         </w:r>
         <w:r>
           <w:rPr>
@@ -2673,7 +2883,7 @@
           <w:lang w:eastAsia="en-GB"/>
         </w:rPr>
       </w:pPr>
-      <w:hyperlink w:anchor="_Toc202947672" w:history="1">
+      <w:hyperlink w:anchor="_Toc203070848" w:history="1">
         <w:r>
           <w:rPr>
             <w:rStyle w:val="Hyperlink"/>
@@ -2700,7 +2910,7 @@
             <w:noProof/>
             <w:webHidden/>
           </w:rPr>
-          <w:instrText xml:space="preserve"> PAGEREF _Toc202947672 \h </w:instrText>
+          <w:instrText xml:space="preserve"> PAGEREF _Toc203070848 \h </w:instrText>
         </w:r>
         <w:r>
           <w:rPr>
@@ -2721,6 +2931,496 @@
             <w:webHidden/>
           </w:rPr>
           <w:t>22</w:t>
+        </w:r>
+        <w:r>
+          <w:rPr>
+            <w:noProof/>
+            <w:webHidden/>
+          </w:rPr>
+          <w:fldChar w:fldCharType="end"/>
+        </w:r>
+      </w:hyperlink>
+    </w:p>
+    <w:p>
+      <w:pPr>
+        <w:pStyle w:val="TableofFigures"/>
+        <w:tabs>
+          <w:tab w:val="right" w:leader="dot" w:pos="9016"/>
+        </w:tabs>
+        <w:rPr>
+          <w:rFonts w:asciiTheme="minorHAnsi" w:eastAsiaTheme="minorEastAsia" w:hAnsiTheme="minorHAnsi"/>
+          <w:noProof/>
+          <w:lang w:eastAsia="en-GB"/>
+        </w:rPr>
+      </w:pPr>
+      <w:hyperlink w:anchor="_Toc203070849" w:history="1">
+        <w:r>
+          <w:rPr>
+            <w:rStyle w:val="Hyperlink"/>
+            <w:noProof/>
+          </w:rPr>
+          <w:t>Figure 10: Per Game HTML</w:t>
+        </w:r>
+        <w:r>
+          <w:rPr>
+            <w:noProof/>
+            <w:webHidden/>
+          </w:rPr>
+          <w:tab/>
+        </w:r>
+        <w:r>
+          <w:rPr>
+            <w:noProof/>
+            <w:webHidden/>
+          </w:rPr>
+          <w:fldChar w:fldCharType="begin"/>
+        </w:r>
+        <w:r>
+          <w:rPr>
+            <w:noProof/>
+            <w:webHidden/>
+          </w:rPr>
+          <w:instrText xml:space="preserve"> PAGEREF _Toc203070849 \h </w:instrText>
+        </w:r>
+        <w:r>
+          <w:rPr>
+            <w:noProof/>
+            <w:webHidden/>
+          </w:rPr>
+        </w:r>
+        <w:r>
+          <w:rPr>
+            <w:noProof/>
+            <w:webHidden/>
+          </w:rPr>
+          <w:fldChar w:fldCharType="separate"/>
+        </w:r>
+        <w:r>
+          <w:rPr>
+            <w:noProof/>
+            <w:webHidden/>
+          </w:rPr>
+          <w:t>23</w:t>
+        </w:r>
+        <w:r>
+          <w:rPr>
+            <w:noProof/>
+            <w:webHidden/>
+          </w:rPr>
+          <w:fldChar w:fldCharType="end"/>
+        </w:r>
+      </w:hyperlink>
+    </w:p>
+    <w:p>
+      <w:pPr>
+        <w:pStyle w:val="TableofFigures"/>
+        <w:tabs>
+          <w:tab w:val="right" w:leader="dot" w:pos="9016"/>
+        </w:tabs>
+        <w:rPr>
+          <w:rFonts w:asciiTheme="minorHAnsi" w:eastAsiaTheme="minorEastAsia" w:hAnsiTheme="minorHAnsi"/>
+          <w:noProof/>
+          <w:lang w:eastAsia="en-GB"/>
+        </w:rPr>
+      </w:pPr>
+      <w:hyperlink w:anchor="_Toc203070850" w:history="1">
+        <w:r>
+          <w:rPr>
+            <w:rStyle w:val="Hyperlink"/>
+            <w:noProof/>
+          </w:rPr>
+          <w:t>Figure 11: Steam XHR Requests</w:t>
+        </w:r>
+        <w:r>
+          <w:rPr>
+            <w:noProof/>
+            <w:webHidden/>
+          </w:rPr>
+          <w:tab/>
+        </w:r>
+        <w:r>
+          <w:rPr>
+            <w:noProof/>
+            <w:webHidden/>
+          </w:rPr>
+          <w:fldChar w:fldCharType="begin"/>
+        </w:r>
+        <w:r>
+          <w:rPr>
+            <w:noProof/>
+            <w:webHidden/>
+          </w:rPr>
+          <w:instrText xml:space="preserve"> PAGEREF _Toc203070850 \h </w:instrText>
+        </w:r>
+        <w:r>
+          <w:rPr>
+            <w:noProof/>
+            <w:webHidden/>
+          </w:rPr>
+        </w:r>
+        <w:r>
+          <w:rPr>
+            <w:noProof/>
+            <w:webHidden/>
+          </w:rPr>
+          <w:fldChar w:fldCharType="separate"/>
+        </w:r>
+        <w:r>
+          <w:rPr>
+            <w:noProof/>
+            <w:webHidden/>
+          </w:rPr>
+          <w:t>24</w:t>
+        </w:r>
+        <w:r>
+          <w:rPr>
+            <w:noProof/>
+            <w:webHidden/>
+          </w:rPr>
+          <w:fldChar w:fldCharType="end"/>
+        </w:r>
+      </w:hyperlink>
+    </w:p>
+    <w:p>
+      <w:pPr>
+        <w:pStyle w:val="TableofFigures"/>
+        <w:tabs>
+          <w:tab w:val="right" w:leader="dot" w:pos="9016"/>
+        </w:tabs>
+        <w:rPr>
+          <w:rFonts w:asciiTheme="minorHAnsi" w:eastAsiaTheme="minorEastAsia" w:hAnsiTheme="minorHAnsi"/>
+          <w:noProof/>
+          <w:lang w:eastAsia="en-GB"/>
+        </w:rPr>
+      </w:pPr>
+      <w:hyperlink w:anchor="_Toc203070851" w:history="1">
+        <w:r>
+          <w:rPr>
+            <w:rStyle w:val="Hyperlink"/>
+            <w:noProof/>
+          </w:rPr>
+          <w:t>Figure 12: XHR Returned JSON</w:t>
+        </w:r>
+        <w:r>
+          <w:rPr>
+            <w:noProof/>
+            <w:webHidden/>
+          </w:rPr>
+          <w:tab/>
+        </w:r>
+        <w:r>
+          <w:rPr>
+            <w:noProof/>
+            <w:webHidden/>
+          </w:rPr>
+          <w:fldChar w:fldCharType="begin"/>
+        </w:r>
+        <w:r>
+          <w:rPr>
+            <w:noProof/>
+            <w:webHidden/>
+          </w:rPr>
+          <w:instrText xml:space="preserve"> PAGEREF _Toc203070851 \h </w:instrText>
+        </w:r>
+        <w:r>
+          <w:rPr>
+            <w:noProof/>
+            <w:webHidden/>
+          </w:rPr>
+        </w:r>
+        <w:r>
+          <w:rPr>
+            <w:noProof/>
+            <w:webHidden/>
+          </w:rPr>
+          <w:fldChar w:fldCharType="separate"/>
+        </w:r>
+        <w:r>
+          <w:rPr>
+            <w:noProof/>
+            <w:webHidden/>
+          </w:rPr>
+          <w:t>24</w:t>
+        </w:r>
+        <w:r>
+          <w:rPr>
+            <w:noProof/>
+            <w:webHidden/>
+          </w:rPr>
+          <w:fldChar w:fldCharType="end"/>
+        </w:r>
+      </w:hyperlink>
+    </w:p>
+    <w:p>
+      <w:pPr>
+        <w:pStyle w:val="TableofFigures"/>
+        <w:tabs>
+          <w:tab w:val="right" w:leader="dot" w:pos="9016"/>
+        </w:tabs>
+        <w:rPr>
+          <w:rFonts w:asciiTheme="minorHAnsi" w:eastAsiaTheme="minorEastAsia" w:hAnsiTheme="minorHAnsi"/>
+          <w:noProof/>
+          <w:lang w:eastAsia="en-GB"/>
+        </w:rPr>
+      </w:pPr>
+      <w:hyperlink w:anchor="_Toc203070852" w:history="1">
+        <w:r>
+          <w:rPr>
+            <w:rStyle w:val="Hyperlink"/>
+            <w:noProof/>
+          </w:rPr>
+          <w:t>Figure 13: Tag Collection</w:t>
+        </w:r>
+        <w:r>
+          <w:rPr>
+            <w:noProof/>
+            <w:webHidden/>
+          </w:rPr>
+          <w:tab/>
+        </w:r>
+        <w:r>
+          <w:rPr>
+            <w:noProof/>
+            <w:webHidden/>
+          </w:rPr>
+          <w:fldChar w:fldCharType="begin"/>
+        </w:r>
+        <w:r>
+          <w:rPr>
+            <w:noProof/>
+            <w:webHidden/>
+          </w:rPr>
+          <w:instrText xml:space="preserve"> PAGEREF _Toc203070852 \h </w:instrText>
+        </w:r>
+        <w:r>
+          <w:rPr>
+            <w:noProof/>
+            <w:webHidden/>
+          </w:rPr>
+        </w:r>
+        <w:r>
+          <w:rPr>
+            <w:noProof/>
+            <w:webHidden/>
+          </w:rPr>
+          <w:fldChar w:fldCharType="separate"/>
+        </w:r>
+        <w:r>
+          <w:rPr>
+            <w:noProof/>
+            <w:webHidden/>
+          </w:rPr>
+          <w:t>26</w:t>
+        </w:r>
+        <w:r>
+          <w:rPr>
+            <w:noProof/>
+            <w:webHidden/>
+          </w:rPr>
+          <w:fldChar w:fldCharType="end"/>
+        </w:r>
+      </w:hyperlink>
+    </w:p>
+    <w:p>
+      <w:pPr>
+        <w:pStyle w:val="TableofFigures"/>
+        <w:tabs>
+          <w:tab w:val="right" w:leader="dot" w:pos="9016"/>
+        </w:tabs>
+        <w:rPr>
+          <w:rFonts w:asciiTheme="minorHAnsi" w:eastAsiaTheme="minorEastAsia" w:hAnsiTheme="minorHAnsi"/>
+          <w:noProof/>
+          <w:lang w:eastAsia="en-GB"/>
+        </w:rPr>
+      </w:pPr>
+      <w:hyperlink w:anchor="_Toc203070853" w:history="1">
+        <w:r>
+          <w:rPr>
+            <w:rStyle w:val="Hyperlink"/>
+            <w:noProof/>
+          </w:rPr>
+          <w:t>Figure 14: Developer and Publisher Scraping</w:t>
+        </w:r>
+        <w:r>
+          <w:rPr>
+            <w:noProof/>
+            <w:webHidden/>
+          </w:rPr>
+          <w:tab/>
+        </w:r>
+        <w:r>
+          <w:rPr>
+            <w:noProof/>
+            <w:webHidden/>
+          </w:rPr>
+          <w:fldChar w:fldCharType="begin"/>
+        </w:r>
+        <w:r>
+          <w:rPr>
+            <w:noProof/>
+            <w:webHidden/>
+          </w:rPr>
+          <w:instrText xml:space="preserve"> PAGEREF _Toc203070853 \h </w:instrText>
+        </w:r>
+        <w:r>
+          <w:rPr>
+            <w:noProof/>
+            <w:webHidden/>
+          </w:rPr>
+        </w:r>
+        <w:r>
+          <w:rPr>
+            <w:noProof/>
+            <w:webHidden/>
+          </w:rPr>
+          <w:fldChar w:fldCharType="separate"/>
+        </w:r>
+        <w:r>
+          <w:rPr>
+            <w:noProof/>
+            <w:webHidden/>
+          </w:rPr>
+          <w:t>27</w:t>
+        </w:r>
+        <w:r>
+          <w:rPr>
+            <w:noProof/>
+            <w:webHidden/>
+          </w:rPr>
+          <w:fldChar w:fldCharType="end"/>
+        </w:r>
+      </w:hyperlink>
+    </w:p>
+    <w:p>
+      <w:pPr>
+        <w:pStyle w:val="TableofFigures"/>
+        <w:tabs>
+          <w:tab w:val="right" w:leader="dot" w:pos="9016"/>
+        </w:tabs>
+        <w:rPr>
+          <w:rFonts w:asciiTheme="minorHAnsi" w:eastAsiaTheme="minorEastAsia" w:hAnsiTheme="minorHAnsi"/>
+          <w:noProof/>
+          <w:lang w:eastAsia="en-GB"/>
+        </w:rPr>
+      </w:pPr>
+      <w:hyperlink w:anchor="_Toc203070854" w:history="1">
+        <w:r>
+          <w:rPr>
+            <w:rStyle w:val="Hyperlink"/>
+            <w:noProof/>
+          </w:rPr>
+          <w:t>Figure 15: Language Collection</w:t>
+        </w:r>
+        <w:r>
+          <w:rPr>
+            <w:noProof/>
+            <w:webHidden/>
+          </w:rPr>
+          <w:tab/>
+        </w:r>
+        <w:r>
+          <w:rPr>
+            <w:noProof/>
+            <w:webHidden/>
+          </w:rPr>
+          <w:fldChar w:fldCharType="begin"/>
+        </w:r>
+        <w:r>
+          <w:rPr>
+            <w:noProof/>
+            <w:webHidden/>
+          </w:rPr>
+          <w:instrText xml:space="preserve"> PAGEREF _Toc203070854 \h </w:instrText>
+        </w:r>
+        <w:r>
+          <w:rPr>
+            <w:noProof/>
+            <w:webHidden/>
+          </w:rPr>
+        </w:r>
+        <w:r>
+          <w:rPr>
+            <w:noProof/>
+            <w:webHidden/>
+          </w:rPr>
+          <w:fldChar w:fldCharType="separate"/>
+        </w:r>
+        <w:r>
+          <w:rPr>
+            <w:noProof/>
+            <w:webHidden/>
+          </w:rPr>
+          <w:t>28</w:t>
+        </w:r>
+        <w:r>
+          <w:rPr>
+            <w:noProof/>
+            <w:webHidden/>
+          </w:rPr>
+          <w:fldChar w:fldCharType="end"/>
+        </w:r>
+      </w:hyperlink>
+    </w:p>
+    <w:p>
+      <w:pPr>
+        <w:pStyle w:val="TableofFigures"/>
+        <w:tabs>
+          <w:tab w:val="right" w:leader="dot" w:pos="9016"/>
+        </w:tabs>
+        <w:rPr>
+          <w:rFonts w:asciiTheme="minorHAnsi" w:eastAsiaTheme="minorEastAsia" w:hAnsiTheme="minorHAnsi"/>
+          <w:noProof/>
+          <w:lang w:eastAsia="en-GB"/>
+        </w:rPr>
+      </w:pPr>
+      <w:hyperlink w:anchor="_Toc203070855" w:history="1">
+        <w:r>
+          <w:rPr>
+            <w:rStyle w:val="Hyperlink"/>
+            <w:noProof/>
+          </w:rPr>
+          <w:t>Figure 16: Game Type</w:t>
+        </w:r>
+        <w:r>
+          <w:rPr>
+            <w:noProof/>
+            <w:webHidden/>
+          </w:rPr>
+          <w:tab/>
+        </w:r>
+        <w:r>
+          <w:rPr>
+            <w:noProof/>
+            <w:webHidden/>
+          </w:rPr>
+          <w:fldChar w:fldCharType="begin"/>
+        </w:r>
+        <w:r>
+          <w:rPr>
+            <w:noProof/>
+            <w:webHidden/>
+          </w:rPr>
+          <w:instrText xml:space="preserve"> PAGEREF _Toc203070855 \h </w:instrText>
+        </w:r>
+        <w:r>
+          <w:rPr>
+            <w:noProof/>
+            <w:webHidden/>
+          </w:rPr>
+        </w:r>
+        <w:r>
+          <w:rPr>
+            <w:noProof/>
+            <w:webHidden/>
+          </w:rPr>
+          <w:fldChar w:fldCharType="separate"/>
+        </w:r>
+        <w:r>
+          <w:rPr>
+            <w:noProof/>
+            <w:webHidden/>
+          </w:rPr>
+          <w:t>29</w:t>
         </w:r>
         <w:r>
           <w:rPr>
@@ -2749,7 +3449,7 @@
       <w:pPr>
         <w:pStyle w:val="Heading1"/>
       </w:pPr>
-      <w:bookmarkStart w:id="1" w:name="_Toc202900749"/>
+      <w:bookmarkStart w:id="1" w:name="_Toc203070810"/>
       <w:r>
         <w:lastRenderedPageBreak/>
         <w:t>Introduction</w:t>
@@ -2758,19 +3458,56 @@
     </w:p>
     <w:p>
       <w:r>
-        <w:t xml:space="preserve">When searching for new video games, it can be hard for uses to find games that they might be interested in and it can be hard for businesses to </w:t>
-      </w:r>
-      <w:r>
-        <w:t>reach new users. To help with this, using publicly data from the internet, a database could be built that, with a user interface such as a web application, could help users find games they are interested in that are similar to ones they already like.</w:t>
-      </w:r>
-      <w:r>
-        <w:t xml:space="preserve"> With this in mind, this</w:t>
+        <w:t xml:space="preserve">When searching for new video games, it can be hard for uses to find games that they might be interested </w:t>
+      </w:r>
+      <w:proofErr w:type="gramStart"/>
+      <w:r>
+        <w:t>in</w:t>
+      </w:r>
+      <w:proofErr w:type="gramEnd"/>
+      <w:r>
+        <w:t xml:space="preserve"> and it can be hard for businesses to </w:t>
+      </w:r>
+      <w:r>
+        <w:t xml:space="preserve">reach new users. To help with this, using publicly data from the internet, a database could be built that, with a user interface such as a web application, could help users find games they are interested in that are </w:t>
+      </w:r>
+      <w:proofErr w:type="gramStart"/>
+      <w:r>
+        <w:t>similar to</w:t>
+      </w:r>
+      <w:proofErr w:type="gramEnd"/>
+      <w:r>
+        <w:t xml:space="preserve"> ones they already like.</w:t>
       </w:r>
       <w:r>
         <w:t xml:space="preserve"> </w:t>
       </w:r>
-      <w:r>
-        <w:t xml:space="preserve">project aims to create a web application that is able to help users find video games they may be interested in through the use of a tagging system. </w:t>
+      <w:proofErr w:type="gramStart"/>
+      <w:r>
+        <w:t>With this in mind, this</w:t>
+      </w:r>
+      <w:proofErr w:type="gramEnd"/>
+      <w:r>
+        <w:t xml:space="preserve"> </w:t>
+      </w:r>
+      <w:r>
+        <w:t xml:space="preserve">project aims to create a web application that </w:t>
+      </w:r>
+      <w:proofErr w:type="gramStart"/>
+      <w:r>
+        <w:t>is able to</w:t>
+      </w:r>
+      <w:proofErr w:type="gramEnd"/>
+      <w:r>
+        <w:t xml:space="preserve"> help users find video games they may be interested in </w:t>
+      </w:r>
+      <w:proofErr w:type="gramStart"/>
+      <w:r>
+        <w:t>through the use of</w:t>
+      </w:r>
+      <w:proofErr w:type="gramEnd"/>
+      <w:r>
+        <w:t xml:space="preserve"> a tagging system. </w:t>
       </w:r>
     </w:p>
     <w:p>
@@ -2811,7 +3548,7 @@
       <w:pPr>
         <w:pStyle w:val="Heading1"/>
       </w:pPr>
-      <w:bookmarkStart w:id="2" w:name="_Toc202900750"/>
+      <w:bookmarkStart w:id="2" w:name="_Toc203070811"/>
       <w:r>
         <w:lastRenderedPageBreak/>
         <w:t>Literature Review</w:t>
@@ -2822,7 +3559,7 @@
       <w:pPr>
         <w:pStyle w:val="Heading2"/>
       </w:pPr>
-      <w:bookmarkStart w:id="3" w:name="_Toc202900751"/>
+      <w:bookmarkStart w:id="3" w:name="_Toc203070812"/>
       <w:r>
         <w:t>Why a Tagging Website?</w:t>
       </w:r>
@@ -3085,7 +3822,7 @@
       <w:pPr>
         <w:pStyle w:val="Heading2"/>
       </w:pPr>
-      <w:bookmarkStart w:id="4" w:name="_Toc202900752"/>
+      <w:bookmarkStart w:id="4" w:name="_Toc203070813"/>
       <w:r>
         <w:lastRenderedPageBreak/>
         <w:t>What is</w:t>
@@ -3153,7 +3890,39 @@
         <w:t xml:space="preserve"> collect any personal information from any users, data privacy will still be considered by investigating the GDPR and its UK equivalent.</w:t>
       </w:r>
       <w:r>
-        <w:t xml:space="preserve"> However, this problem is not only limited to users’ personal data, but companies’ data as well along with scrapers potentially violating a company’s terms of service (Zhao, 2017). However, Zhao (2017) argues that it is difficult to prove the data’s copyright due to “only a specific section of the data [being] legally protected”, while arguing that terms of service fall into a “gray area”. Nonetheless, all of the data scraped in this project should have its source saved and, in the website, linked to in order to show that the data is from the target website and not from another source.</w:t>
+        <w:t xml:space="preserve"> However, this problem is not only limited to users’ personal data, but companies’ data as well along with scrapers potentially violating a company’s terms of service (Zhao, 2017). However, Zhao (2017) argues that it is difficult to prove the data’s copyright due to “only a specific section of the data [being] legally protected”, while arguing that terms of service fall into a “</w:t>
+      </w:r>
+      <w:proofErr w:type="spellStart"/>
+      <w:r>
+        <w:t>gray</w:t>
+      </w:r>
+      <w:proofErr w:type="spellEnd"/>
+      <w:r>
+        <w:t xml:space="preserve"> area”. Nonetheless, </w:t>
+      </w:r>
+      <w:proofErr w:type="gramStart"/>
+      <w:r>
+        <w:t>all of</w:t>
+      </w:r>
+      <w:proofErr w:type="gramEnd"/>
+      <w:r>
+        <w:t xml:space="preserve"> the data scraped in this project should have its source saved and, </w:t>
+      </w:r>
+      <w:proofErr w:type="gramStart"/>
+      <w:r>
+        <w:t>in</w:t>
+      </w:r>
+      <w:proofErr w:type="gramEnd"/>
+      <w:r>
+        <w:t xml:space="preserve"> the website, linked to </w:t>
+      </w:r>
+      <w:proofErr w:type="gramStart"/>
+      <w:r>
+        <w:t>in order to</w:t>
+      </w:r>
+      <w:proofErr w:type="gramEnd"/>
+      <w:r>
+        <w:t xml:space="preserve"> show that the data is from the target website and not from another source.</w:t>
       </w:r>
     </w:p>
     <w:p>
@@ -3170,7 +3939,7 @@
       <w:pPr>
         <w:pStyle w:val="Heading2"/>
       </w:pPr>
-      <w:bookmarkStart w:id="5" w:name="_Toc202900753"/>
+      <w:bookmarkStart w:id="5" w:name="_Toc203070814"/>
       <w:r>
         <w:lastRenderedPageBreak/>
         <w:t>Legal and Security Issues</w:t>
@@ -3181,7 +3950,7 @@
       <w:pPr>
         <w:pStyle w:val="Heading3"/>
       </w:pPr>
-      <w:bookmarkStart w:id="6" w:name="_Toc202900754"/>
+      <w:bookmarkStart w:id="6" w:name="_Toc203070815"/>
       <w:r>
         <w:t>GDPR</w:t>
       </w:r>
@@ -3438,7 +4207,15 @@
         <w:t xml:space="preserve">their email </w:t>
       </w:r>
       <w:r>
-        <w:t xml:space="preserve">at any time and </w:t>
+        <w:t xml:space="preserve">at any </w:t>
+      </w:r>
+      <w:proofErr w:type="gramStart"/>
+      <w:r>
+        <w:t>time</w:t>
+      </w:r>
+      <w:proofErr w:type="gramEnd"/>
+      <w:r>
+        <w:t xml:space="preserve"> and </w:t>
       </w:r>
       <w:r>
         <w:t xml:space="preserve">they should be able </w:t>
@@ -3454,7 +4231,7 @@
       <w:pPr>
         <w:pStyle w:val="Heading3"/>
       </w:pPr>
-      <w:bookmarkStart w:id="7" w:name="_Toc202900755"/>
+      <w:bookmarkStart w:id="7" w:name="_Toc203070816"/>
       <w:r>
         <w:lastRenderedPageBreak/>
         <w:t>Computer Misuse Act 1990</w:t>
@@ -3502,7 +4279,15 @@
     </w:p>
     <w:p>
       <w:r>
-        <w:t>Once a person creates something, they have copyright over their creation for a number of years depending on what kind of creation it is (for example, literary, dramatic, musical or artistic works have a copyright of 70 years, while sound recordings have 50 years instead). This copyright gives the person the right to control how their work is used and allows them to object to distortions of their work due to being identified as the author</w:t>
+        <w:t xml:space="preserve">Once a person creates something, they have copyright over their creation for </w:t>
+      </w:r>
+      <w:proofErr w:type="gramStart"/>
+      <w:r>
+        <w:t>a number of</w:t>
+      </w:r>
+      <w:proofErr w:type="gramEnd"/>
+      <w:r>
+        <w:t xml:space="preserve"> years depending on what kind of creation it is (for example, literary, dramatic, musical or artistic works have a copyright of 70 years, while sound recordings have 50 years instead). This copyright gives the person the right to control how their work is used and allows them to object to distortions of their work due to being identified as the author</w:t>
       </w:r>
       <w:r>
         <w:t xml:space="preserve"> (UKCS, n.d.)</w:t>
@@ -3525,7 +4310,7 @@
       <w:pPr>
         <w:pStyle w:val="Heading3"/>
       </w:pPr>
-      <w:bookmarkStart w:id="8" w:name="_Toc202900756"/>
+      <w:bookmarkStart w:id="8" w:name="_Toc203070817"/>
       <w:r>
         <w:lastRenderedPageBreak/>
         <w:t>STRIDE</w:t>
@@ -3999,7 +4784,7 @@
           <w:szCs w:val="20"/>
         </w:rPr>
       </w:pPr>
-      <w:bookmarkStart w:id="9" w:name="_Toc202900757"/>
+      <w:bookmarkStart w:id="9" w:name="_Toc203070818"/>
       <w:r>
         <w:lastRenderedPageBreak/>
         <w:t>Ad-Hoc</w:t>
@@ -4017,7 +4802,15 @@
         <w:t xml:space="preserve"> or ethical issues. However, the main target for this program is the online video game distributor known as Steam. However, </w:t>
       </w:r>
       <w:r>
-        <w:t>when publishing a video game on Steam through the user of “Steamworks”, the author must build their video game’s store page. The only part Steam does in the creation of this store page is that they review it after submission in order to confirm that it is working and not harmful (Steamworks, n.d.). Because this information is submitted by the author themselves, this project assumes that each page contains mostly accurate information about the video games themselves.</w:t>
+        <w:t xml:space="preserve">when publishing a video game on Steam through the user of “Steamworks”, the author must build their video game’s store page. The only part Steam does in the creation of this store page is that they review it after submission </w:t>
+      </w:r>
+      <w:proofErr w:type="gramStart"/>
+      <w:r>
+        <w:t>in order to</w:t>
+      </w:r>
+      <w:proofErr w:type="gramEnd"/>
+      <w:r>
+        <w:t xml:space="preserve"> confirm that it is working and not harmful (Steamworks, n.d.). Because this information is submitted by the author themselves, this project assumes that each page contains mostly accurate information about the video games themselves.</w:t>
       </w:r>
       <w:r>
         <w:t xml:space="preserve"> Missing or erroneous information will be fixed after scraping through normalisation.</w:t>
@@ -4311,7 +5104,7 @@
       <w:pPr>
         <w:pStyle w:val="Heading1"/>
       </w:pPr>
-      <w:bookmarkStart w:id="10" w:name="_Toc202900758"/>
+      <w:bookmarkStart w:id="10" w:name="_Toc203070819"/>
       <w:r>
         <w:lastRenderedPageBreak/>
         <w:t>Methodology</w:t>
@@ -4384,7 +5177,7 @@
         <w:pStyle w:val="Caption"/>
         <w:jc w:val="center"/>
       </w:pPr>
-      <w:bookmarkStart w:id="11" w:name="_Toc202947664"/>
+      <w:bookmarkStart w:id="11" w:name="_Toc203070840"/>
       <w:r>
         <w:t xml:space="preserve">Figure </w:t>
       </w:r>
@@ -4403,7 +5196,15 @@
     </w:p>
     <w:p>
       <w:r>
-        <w:t>Overall, the main goal of this project is to create a website that allows for users to search for video games similar to ones they already like. To achieve this, this project will be split into the following parts which can be seen in the above diagram:</w:t>
+        <w:t xml:space="preserve">Overall, the main goal of this project is to create a website that allows for users to search for video games </w:t>
+      </w:r>
+      <w:proofErr w:type="gramStart"/>
+      <w:r>
+        <w:t>similar to</w:t>
+      </w:r>
+      <w:proofErr w:type="gramEnd"/>
+      <w:r>
+        <w:t xml:space="preserve"> ones they already like. To achieve this, this project will be split into the following parts which can be seen in the above diagram:</w:t>
       </w:r>
     </w:p>
     <w:p>
@@ -4415,7 +5216,15 @@
         </w:numPr>
       </w:pPr>
       <w:r>
-        <w:t>Scraping program: As previously described, this program will go over the target website (in this case, Steam), and collect data about various video games. This should be limited to low number of video games to avoid affecting Steam with high amounts of traffic and to avoid the possibility of running out of storage or the program taking too long.</w:t>
+        <w:t>Scraping program: As previously described, this program will go over the target website (in this case, Steam</w:t>
+      </w:r>
+      <w:proofErr w:type="gramStart"/>
+      <w:r>
+        <w:t>), and</w:t>
+      </w:r>
+      <w:proofErr w:type="gramEnd"/>
+      <w:r>
+        <w:t xml:space="preserve"> collect data about various video games. This should be limited to low number of video games to avoid affecting Steam with high amounts of traffic and to avoid the possibility of running out of storage or the program taking too long.</w:t>
       </w:r>
     </w:p>
     <w:p>
@@ -4477,7 +5286,7 @@
       <w:pPr>
         <w:pStyle w:val="Heading1"/>
       </w:pPr>
-      <w:bookmarkStart w:id="12" w:name="_Toc202900759"/>
+      <w:bookmarkStart w:id="12" w:name="_Toc203070820"/>
       <w:r>
         <w:lastRenderedPageBreak/>
         <w:t>Design/Plan</w:t>
@@ -4488,7 +5297,7 @@
       <w:pPr>
         <w:pStyle w:val="Heading2"/>
       </w:pPr>
-      <w:bookmarkStart w:id="13" w:name="_Toc202900760"/>
+      <w:bookmarkStart w:id="13" w:name="_Toc203070821"/>
       <w:r>
         <w:t>Data Plan</w:t>
       </w:r>
@@ -4498,7 +5307,7 @@
       <w:pPr>
         <w:pStyle w:val="Heading3"/>
       </w:pPr>
-      <w:bookmarkStart w:id="14" w:name="_Toc202900761"/>
+      <w:bookmarkStart w:id="14" w:name="_Toc203070822"/>
       <w:r>
         <w:t>Target Website</w:t>
       </w:r>
@@ -4569,7 +5378,7 @@
         <w:pStyle w:val="Caption"/>
         <w:jc w:val="center"/>
       </w:pPr>
-      <w:bookmarkStart w:id="15" w:name="_Toc202947665"/>
+      <w:bookmarkStart w:id="15" w:name="_Toc203070841"/>
       <w:r>
         <w:t xml:space="preserve">Figure </w:t>
       </w:r>
@@ -4610,7 +5419,7 @@
       <w:pPr>
         <w:pStyle w:val="Heading3"/>
       </w:pPr>
-      <w:bookmarkStart w:id="16" w:name="_Toc202900762"/>
+      <w:bookmarkStart w:id="16" w:name="_Toc203070823"/>
       <w:r>
         <w:lastRenderedPageBreak/>
         <w:t>Scraping</w:t>
@@ -4672,7 +5481,15 @@
         <w:t xml:space="preserve">in a programmatic way </w:t>
       </w:r>
       <w:r>
-        <w:t>which allows for web scraping like the requests library but i</w:t>
+        <w:t xml:space="preserve">which allows for web scraping like the </w:t>
+      </w:r>
+      <w:proofErr w:type="gramStart"/>
+      <w:r>
+        <w:t>requests</w:t>
+      </w:r>
+      <w:proofErr w:type="gramEnd"/>
+      <w:r>
+        <w:t xml:space="preserve"> library but i</w:t>
       </w:r>
       <w:r>
         <w:t>n a browser instead of just a HTML</w:t>
@@ -4731,6 +5548,7 @@
       <w:r>
         <w:t xml:space="preserve">For the scraping program itself, the target website must have a page that lists </w:t>
       </w:r>
+      <w:proofErr w:type="gramStart"/>
       <w:r>
         <w:rPr>
           <w:i/>
@@ -4739,7 +5557,11 @@
         <w:t>all</w:t>
       </w:r>
       <w:r>
-        <w:t xml:space="preserve"> of its games. Using this page, the following should be done for each game in the list:</w:t>
+        <w:t xml:space="preserve"> of</w:t>
+      </w:r>
+      <w:proofErr w:type="gramEnd"/>
+      <w:r>
+        <w:t xml:space="preserve"> its games. Using this page, the following should be done for each game in the list:</w:t>
       </w:r>
     </w:p>
     <w:p>
@@ -4819,7 +5641,15 @@
         <w:t xml:space="preserve"> is necessary for when each video game is put on the website.</w:t>
       </w:r>
       <w:r>
-        <w:t xml:space="preserve"> The title can be found on both the all games page and on each game’s page as well.</w:t>
+        <w:t xml:space="preserve"> The title can be found on both </w:t>
+      </w:r>
+      <w:proofErr w:type="gramStart"/>
+      <w:r>
+        <w:t>the all</w:t>
+      </w:r>
+      <w:proofErr w:type="gramEnd"/>
+      <w:r>
+        <w:t xml:space="preserve"> games page and on each game’s page as well.</w:t>
       </w:r>
     </w:p>
     <w:p>
@@ -4932,7 +5762,7 @@
         <w:pStyle w:val="Caption"/>
         <w:jc w:val="center"/>
       </w:pPr>
-      <w:bookmarkStart w:id="17" w:name="_Toc202947666"/>
+      <w:bookmarkStart w:id="17" w:name="_Toc203070842"/>
       <w:r>
         <w:t xml:space="preserve">Figure </w:t>
       </w:r>
@@ -4973,7 +5803,15 @@
         <w:t>, as shown above, have multiple developers</w:t>
       </w:r>
       <w:r>
-        <w:t xml:space="preserve"> separated by commas. Data analysis can be done on the developers to determine, for example, the developer with most expensive games. This will be included in the website.</w:t>
+        <w:t xml:space="preserve"> separated by commas. Data analysis can be done on the developers to determine, for example, the developer with most expensive games. This will be included </w:t>
+      </w:r>
+      <w:proofErr w:type="gramStart"/>
+      <w:r>
+        <w:t>in</w:t>
+      </w:r>
+      <w:proofErr w:type="gramEnd"/>
+      <w:r>
+        <w:t xml:space="preserve"> the website.</w:t>
       </w:r>
     </w:p>
     <w:p>
@@ -4985,7 +5823,15 @@
         </w:numPr>
       </w:pPr>
       <w:r>
-        <w:t>Publisher(s). The company or companies that help to publish each game. As with the developers, some games have multiple publishers. This will be used for data analysis for the same reason as the developers. This will be included in the website.</w:t>
+        <w:t xml:space="preserve">Publisher(s). The company or companies that help to publish each game. As with the developers, some games have multiple publishers. This will be used for data analysis for the same reason as the developers. This will be included </w:t>
+      </w:r>
+      <w:proofErr w:type="gramStart"/>
+      <w:r>
+        <w:t>in</w:t>
+      </w:r>
+      <w:proofErr w:type="gramEnd"/>
+      <w:r>
+        <w:t xml:space="preserve"> the website.</w:t>
       </w:r>
     </w:p>
     <w:p>
@@ -5002,11 +5848,24 @@
       <w:r>
         <w:t xml:space="preserve">user </w:t>
       </w:r>
-      <w:r>
-        <w:t>describe the content of each video game.</w:t>
-      </w:r>
-      <w:r>
-        <w:t xml:space="preserve"> This will mostly be useful in the website but will still be used in data analysis.</w:t>
+      <w:proofErr w:type="gramStart"/>
+      <w:r>
+        <w:t>describe</w:t>
+      </w:r>
+      <w:proofErr w:type="gramEnd"/>
+      <w:r>
+        <w:t xml:space="preserve"> the content of each video game.</w:t>
+      </w:r>
+      <w:r>
+        <w:t xml:space="preserve"> This will mostly be useful </w:t>
+      </w:r>
+      <w:proofErr w:type="gramStart"/>
+      <w:r>
+        <w:t>in</w:t>
+      </w:r>
+      <w:proofErr w:type="gramEnd"/>
+      <w:r>
+        <w:t xml:space="preserve"> the website but will still be used in data analysis.</w:t>
       </w:r>
     </w:p>
     <w:p>
@@ -5094,7 +5953,7 @@
         <w:pStyle w:val="Caption"/>
         <w:jc w:val="center"/>
       </w:pPr>
-      <w:bookmarkStart w:id="18" w:name="_Toc202947667"/>
+      <w:bookmarkStart w:id="18" w:name="_Toc203070843"/>
       <w:r>
         <w:t xml:space="preserve">Figure </w:t>
       </w:r>
@@ -5178,7 +6037,7 @@
       <w:pPr>
         <w:pStyle w:val="Heading3"/>
       </w:pPr>
-      <w:bookmarkStart w:id="19" w:name="_Toc202900763"/>
+      <w:bookmarkStart w:id="19" w:name="_Toc203070824"/>
       <w:r>
         <w:lastRenderedPageBreak/>
         <w:t>Saving Format (.CSV)</w:t>
@@ -5207,10 +6066,10 @@
         <w:t>can allow Python to handle files as lists of strings with each list representing a row</w:t>
       </w:r>
       <w:r>
-        <w:t xml:space="preserve"> (Python Documentation, n.d.)</w:t>
-      </w:r>
-      <w:r>
-        <w:t xml:space="preserve">. </w:t>
+        <w:t xml:space="preserve"> </w:t>
+      </w:r>
+      <w:r>
+        <w:t xml:space="preserve">(Python documentation, n.d. - a). </w:t>
       </w:r>
     </w:p>
     <w:p>
@@ -5227,7 +6086,7 @@
       <w:pPr>
         <w:pStyle w:val="Heading3"/>
       </w:pPr>
-      <w:bookmarkStart w:id="20" w:name="_Toc202900764"/>
+      <w:bookmarkStart w:id="20" w:name="_Toc203070825"/>
       <w:r>
         <w:lastRenderedPageBreak/>
         <w:t>Database (MySQL)</w:t>
@@ -5250,7 +6109,15 @@
         <w:t xml:space="preserve">. </w:t>
       </w:r>
       <w:r>
-        <w:t>This library allows Python to communicate with a MySQL database through an API which allows for the database to be connected to and, through the use of a cursor, allows for the execution of SQL commands on the database</w:t>
+        <w:t xml:space="preserve">This library allows Python to communicate with a MySQL database through an API which allows for the database to be connected to and, </w:t>
+      </w:r>
+      <w:proofErr w:type="gramStart"/>
+      <w:r>
+        <w:t>through the use of</w:t>
+      </w:r>
+      <w:proofErr w:type="gramEnd"/>
+      <w:r>
+        <w:t xml:space="preserve"> a cursor, allows for the execution of SQL commands on the database</w:t>
       </w:r>
       <w:r>
         <w:t xml:space="preserve"> (Pypi, n.d. -e)</w:t>
@@ -5335,7 +6202,7 @@
         <w:pStyle w:val="Caption"/>
         <w:jc w:val="center"/>
       </w:pPr>
-      <w:bookmarkStart w:id="21" w:name="_Toc202947668"/>
+      <w:bookmarkStart w:id="21" w:name="_Toc203070844"/>
       <w:r>
         <w:t xml:space="preserve">Figure </w:t>
       </w:r>
@@ -5354,7 +6221,15 @@
     </w:p>
     <w:p>
       <w:r>
-        <w:t xml:space="preserve">Above is a plan for the database. In it, the green boxes are regular tables that define different bits of data. The purple boxes, however, are link tables which describe how the data in two or more tables are linked. At the most basic level, the link tables hold the ids of the columns that are linked. For example, a user in the user table linked to their review in the review table will have a column in the link_user_review table that holds the user’s ID and their review’s ID. </w:t>
+        <w:t xml:space="preserve">Above is a plan for the database. In it, the green boxes are regular tables that define different bits of data. The purple boxes, however, are link tables which describe how the data in two or more tables are linked. At the most basic level, the link tables hold the ids of the columns that are linked. For example, a user in the user table linked to their review in the review table will have a column in the </w:t>
+      </w:r>
+      <w:proofErr w:type="spellStart"/>
+      <w:r>
+        <w:t>link_user_review</w:t>
+      </w:r>
+      <w:proofErr w:type="spellEnd"/>
+      <w:r>
+        <w:t xml:space="preserve"> table that holds the user’s ID and their review’s ID. </w:t>
       </w:r>
     </w:p>
     <w:p>
@@ -5433,7 +6308,7 @@
         <w:pStyle w:val="Caption"/>
         <w:jc w:val="center"/>
       </w:pPr>
-      <w:bookmarkStart w:id="22" w:name="_Toc202947669"/>
+      <w:bookmarkStart w:id="22" w:name="_Toc203070845"/>
       <w:r>
         <w:t xml:space="preserve">Figure </w:t>
       </w:r>
@@ -5464,7 +6339,7 @@
       <w:pPr>
         <w:pStyle w:val="Heading1"/>
       </w:pPr>
-      <w:bookmarkStart w:id="23" w:name="_Toc202900765"/>
+      <w:bookmarkStart w:id="23" w:name="_Toc203070826"/>
       <w:r>
         <w:lastRenderedPageBreak/>
         <w:t>Scraping Practice</w:t>
@@ -5473,12 +6348,68 @@
     </w:p>
     <w:p>
       <w:r>
-        <w:t>Before writing the actual scraping program, two practice scraping programs were made. One with the requests and Beautifulsoup libraries and the other with the selenium library. Primarily, this was to learn how all of those libraries work and how best to write them, but it also helped to show which was faster. For both practice programs, the special “All Pages” wiki page on Wikipedia was used. This page lists all of the wikis on the website as links. Due to this, both practice programs went through this wiki and then to each link and collected the data from each wiki page.</w:t>
-      </w:r>
-    </w:p>
-    <w:p>
-      <w:r>
-        <w:t>The page that lists all of the wikis is split into multiple pages, and on each page is a link to a single wiki page. Due to this, both programs get the HTML and search for a divider element with the class of “mw-allpages-nav” which holds all of the links. From there, all of the links are looped through and both programs visit the pages they hold. Once on each page, three elements are found, with those being:</w:t>
+        <w:t xml:space="preserve">Before writing the actual scraping program, two practice scraping programs were made. One with the requests and Beautifulsoup libraries and the other with the selenium library. Primarily, this was to learn how </w:t>
+      </w:r>
+      <w:proofErr w:type="gramStart"/>
+      <w:r>
+        <w:t>all of</w:t>
+      </w:r>
+      <w:proofErr w:type="gramEnd"/>
+      <w:r>
+        <w:t xml:space="preserve"> those libraries work and how best to write them, but it also helped to show which was faster. For both practice programs, the special “All Pages” wiki page on Wikipedia was used. This page lists </w:t>
+      </w:r>
+      <w:proofErr w:type="gramStart"/>
+      <w:r>
+        <w:t>all of</w:t>
+      </w:r>
+      <w:proofErr w:type="gramEnd"/>
+      <w:r>
+        <w:t xml:space="preserve"> the wikis on the website as links. Due to this, both practice programs went through this wiki and then to each link and collected the data from each wiki page.</w:t>
+      </w:r>
+    </w:p>
+    <w:p>
+      <w:r>
+        <w:t xml:space="preserve">The page that lists </w:t>
+      </w:r>
+      <w:proofErr w:type="gramStart"/>
+      <w:r>
+        <w:t>all of</w:t>
+      </w:r>
+      <w:proofErr w:type="gramEnd"/>
+      <w:r>
+        <w:t xml:space="preserve"> the wikis is split into multiple pages, and on each page is a link to a single wiki page. Due to this, both programs get the HTML and search for a divider element with the class of “mw-</w:t>
+      </w:r>
+      <w:proofErr w:type="spellStart"/>
+      <w:r>
+        <w:t>allpages</w:t>
+      </w:r>
+      <w:proofErr w:type="spellEnd"/>
+      <w:r>
+        <w:t xml:space="preserve">-nav” which holds </w:t>
+      </w:r>
+      <w:proofErr w:type="gramStart"/>
+      <w:r>
+        <w:t>all of</w:t>
+      </w:r>
+      <w:proofErr w:type="gramEnd"/>
+      <w:r>
+        <w:t xml:space="preserve"> the links. From there, </w:t>
+      </w:r>
+      <w:proofErr w:type="gramStart"/>
+      <w:r>
+        <w:t>all of</w:t>
+      </w:r>
+      <w:proofErr w:type="gramEnd"/>
+      <w:r>
+        <w:t xml:space="preserve"> the links are looped </w:t>
+      </w:r>
+      <w:proofErr w:type="gramStart"/>
+      <w:r>
+        <w:t>through</w:t>
+      </w:r>
+      <w:proofErr w:type="gramEnd"/>
+      <w:r>
+        <w:t xml:space="preserve"> and both programs visit the pages they hold. Once on each page, three elements are found, with those being:</w:t>
       </w:r>
     </w:p>
     <w:p>
@@ -5490,7 +6421,15 @@
         </w:numPr>
       </w:pPr>
       <w:r>
-        <w:t>The title. This is sometimes a span element with the class of “mw-page-title-main” and other times it is instead a “h1” element with the id of “firstHeading”.</w:t>
+        <w:t>The title. This is sometimes a span element with the class of “mw-page-title-main” and other times it is instead a “h1” element with the id of “</w:t>
+      </w:r>
+      <w:proofErr w:type="spellStart"/>
+      <w:r>
+        <w:t>firstHeading</w:t>
+      </w:r>
+      <w:proofErr w:type="spellEnd"/>
+      <w:r>
+        <w:t>”.</w:t>
       </w:r>
     </w:p>
     <w:p>
@@ -5528,10 +6467,42 @@
     </w:p>
     <w:p>
       <w:r>
-        <w:t xml:space="preserve">Along with these elements, the page’s URL is also saved and after looping through all of the pages, both programs return to the all wikis page and search for a link that contains the text “Next page” and go to the next all wikis page. </w:t>
-      </w:r>
-      <w:r>
-        <w:t>After doing this for a certain amount of pages specified at the start of the code, both programs save the list containing each page’s elements to a CSV file</w:t>
+        <w:t xml:space="preserve">Along with these elements, the page’s URL is also saved and after looping through </w:t>
+      </w:r>
+      <w:proofErr w:type="gramStart"/>
+      <w:r>
+        <w:t>all of</w:t>
+      </w:r>
+      <w:proofErr w:type="gramEnd"/>
+      <w:r>
+        <w:t xml:space="preserve"> the pages, both programs return to </w:t>
+      </w:r>
+      <w:proofErr w:type="gramStart"/>
+      <w:r>
+        <w:t>the all</w:t>
+      </w:r>
+      <w:proofErr w:type="gramEnd"/>
+      <w:r>
+        <w:t xml:space="preserve"> wikis page and search for a link that contains the text “Next page” and go to the next all wikis </w:t>
+      </w:r>
+      <w:proofErr w:type="gramStart"/>
+      <w:r>
+        <w:t>page</w:t>
+      </w:r>
+      <w:proofErr w:type="gramEnd"/>
+      <w:r>
+        <w:t xml:space="preserve">. </w:t>
+      </w:r>
+      <w:r>
+        <w:t xml:space="preserve">After doing this for a certain </w:t>
+      </w:r>
+      <w:proofErr w:type="gramStart"/>
+      <w:r>
+        <w:t>amount</w:t>
+      </w:r>
+      <w:proofErr w:type="gramEnd"/>
+      <w:r>
+        <w:t xml:space="preserve"> of pages specified at the start of the code, both programs save the list containing each page’s elements to a CSV file</w:t>
       </w:r>
       <w:r>
         <w:t xml:space="preserve"> using the CSV library.</w:t>
@@ -5614,7 +6585,7 @@
         <w:pStyle w:val="Caption"/>
         <w:jc w:val="center"/>
       </w:pPr>
-      <w:bookmarkStart w:id="24" w:name="_Toc202947670"/>
+      <w:bookmarkStart w:id="24" w:name="_Toc203070846"/>
       <w:r>
         <w:t xml:space="preserve">Figure </w:t>
       </w:r>
@@ -5639,7 +6610,15 @@
         <w:t>elements could be found with the “find all” method (after initialising beautiful soup on a request’s HTML) which returns all instances of the element requested</w:t>
       </w:r>
       <w:r>
-        <w:t xml:space="preserve"> (of which elements with specific classes or ids can be requested with the attrs attribute)</w:t>
+        <w:t xml:space="preserve"> (of which elements with specific classes or ids can be requested with the </w:t>
+      </w:r>
+      <w:proofErr w:type="spellStart"/>
+      <w:r>
+        <w:t>attrs</w:t>
+      </w:r>
+      <w:proofErr w:type="spellEnd"/>
+      <w:r>
+        <w:t xml:space="preserve"> attribute)</w:t>
       </w:r>
       <w:r>
         <w:t xml:space="preserve"> which can then be looped through to handle child elements</w:t>
@@ -5661,7 +6640,7 @@
           <w:noProof/>
         </w:rPr>
         <w:drawing>
-          <wp:inline distT="0" distB="0" distL="0" distR="0" wp14:anchorId="40ABE2E5" wp14:editId="7229993B">
+          <wp:inline distT="0" distB="0" distL="0" distR="0" wp14:anchorId="40ABE2E5" wp14:editId="1309C562">
             <wp:extent cx="4162425" cy="1246650"/>
             <wp:effectExtent l="38100" t="38100" r="28575" b="29845"/>
             <wp:docPr id="1701288164" name="Picture 2" descr="A computer screen with text on it&#10;&#10;AI-generated content may be incorrect."/>
@@ -5717,7 +6696,7 @@
         <w:pStyle w:val="Caption"/>
         <w:jc w:val="center"/>
       </w:pPr>
-      <w:bookmarkStart w:id="25" w:name="_Toc202947671"/>
+      <w:bookmarkStart w:id="25" w:name="_Toc203070847"/>
       <w:r>
         <w:t xml:space="preserve">Figure </w:t>
       </w:r>
@@ -5736,7 +6715,15 @@
     </w:p>
     <w:p>
       <w:r>
-        <w:t>However, from experimentation, Beautiful Soup does not allow for further searches on elements returned from a search. This lead to the multiple nested for loops shown above which were simply trying to find the contents elements of each page. Allowing for another search would have made this egregious looping unneeded.</w:t>
+        <w:t xml:space="preserve">However, from experimentation, Beautiful Soup does not allow for further searches on elements returned from a search. This </w:t>
+      </w:r>
+      <w:proofErr w:type="gramStart"/>
+      <w:r>
+        <w:t>lead</w:t>
+      </w:r>
+      <w:proofErr w:type="gramEnd"/>
+      <w:r>
+        <w:t xml:space="preserve"> to the multiple nested for loops shown above which were simply trying to find the contents elements of each page. Allowing for another search would have made this egregious looping unneeded.</w:t>
       </w:r>
     </w:p>
     <w:p>
@@ -5816,7 +6803,7 @@
         <w:pStyle w:val="Caption"/>
         <w:jc w:val="center"/>
       </w:pPr>
-      <w:bookmarkStart w:id="26" w:name="_Toc202947672"/>
+      <w:bookmarkStart w:id="26" w:name="_Toc203070848"/>
       <w:r>
         <w:t xml:space="preserve">Figure </w:t>
       </w:r>
@@ -5835,7 +6822,15 @@
     </w:p>
     <w:p>
       <w:r>
-        <w:t>For the selenium program (using the Firefox web browser), the code is quite similar to beautiful soup. Selenium allows for the search of elements through different tag attributes rather than searching for a specific element like in beautiful soup</w:t>
+        <w:t xml:space="preserve">For the selenium program (using the Firefox web browser), the code is quite </w:t>
+      </w:r>
+      <w:proofErr w:type="gramStart"/>
+      <w:r>
+        <w:t>similar to</w:t>
+      </w:r>
+      <w:proofErr w:type="gramEnd"/>
+      <w:r>
+        <w:t xml:space="preserve"> beautiful soup. Selenium allows for the search of elements through different tag attributes rather than searching for a specific element like in beautiful soup</w:t>
       </w:r>
       <w:r>
         <w:t xml:space="preserve"> (Selenium)</w:t>
@@ -5855,7 +6850,15 @@
         <w:t xml:space="preserve">However, while this makes Selenium a good option for scraping, there is one major issue with its use. It takes a lot longer to scrape than the requests library. </w:t>
       </w:r>
       <w:r>
-        <w:t xml:space="preserve">Using the time library, both programs were timed on how long it took them to scrape the links from five pages of the all pages wiki. </w:t>
+        <w:t xml:space="preserve">Using the time library, both programs were timed on how long it took them to scrape the links from five pages of </w:t>
+      </w:r>
+      <w:proofErr w:type="gramStart"/>
+      <w:r>
+        <w:t>the all</w:t>
+      </w:r>
+      <w:proofErr w:type="gramEnd"/>
+      <w:r>
+        <w:t xml:space="preserve"> pages wiki. </w:t>
       </w:r>
       <w:r>
         <w:t xml:space="preserve">The Beautiful Soup program took 220 seconds (about 3 minutes), while the Selenium program took 1606 seconds (about 26 minutes). </w:t>
@@ -5880,7 +6883,7 @@
       <w:pPr>
         <w:pStyle w:val="Heading1"/>
       </w:pPr>
-      <w:bookmarkStart w:id="27" w:name="_Toc202900766"/>
+      <w:bookmarkStart w:id="27" w:name="_Toc203070827"/>
       <w:r>
         <w:lastRenderedPageBreak/>
         <w:t>Development</w:t>
@@ -5891,7 +6894,7 @@
       <w:pPr>
         <w:pStyle w:val="Heading2"/>
       </w:pPr>
-      <w:bookmarkStart w:id="28" w:name="_Toc202900767"/>
+      <w:bookmarkStart w:id="28" w:name="_Toc203070828"/>
       <w:r>
         <w:t>Scraping Program</w:t>
       </w:r>
@@ -5901,6 +6904,7 @@
       <w:pPr>
         <w:pStyle w:val="Heading3"/>
       </w:pPr>
+      <w:bookmarkStart w:id="29" w:name="_Toc203070829"/>
       <w:r>
         <w:t xml:space="preserve">Main </w:t>
       </w:r>
@@ -5910,6 +6914,7 @@
       <w:r>
         <w:t xml:space="preserve"> and Infinite URL</w:t>
       </w:r>
+      <w:bookmarkEnd w:id="29"/>
     </w:p>
     <w:p>
       <w:r>
@@ -5976,7 +6981,7 @@
           <w:noProof/>
         </w:rPr>
         <w:drawing>
-          <wp:inline distT="0" distB="0" distL="0" distR="0" wp14:anchorId="5F05F26C" wp14:editId="73EE572C">
+          <wp:inline distT="0" distB="0" distL="0" distR="0" wp14:anchorId="5F05F26C" wp14:editId="1E508BA4">
             <wp:extent cx="5731510" cy="637540"/>
             <wp:effectExtent l="38100" t="38100" r="40640" b="29210"/>
             <wp:docPr id="1908628895" name="Picture 2"/>
@@ -6110,6 +7115,7 @@
         <w:pStyle w:val="Caption"/>
         <w:jc w:val="center"/>
       </w:pPr>
+      <w:bookmarkStart w:id="30" w:name="_Toc203070849"/>
       <w:r>
         <w:t xml:space="preserve">Figure </w:t>
       </w:r>
@@ -6124,6 +7130,7 @@
       <w:r>
         <w:t>: Per Game HTML</w:t>
       </w:r>
+      <w:bookmarkEnd w:id="30"/>
     </w:p>
     <w:p>
       <w:r>
@@ -6350,6 +7357,7 @@
         <w:pStyle w:val="Caption"/>
         <w:jc w:val="center"/>
       </w:pPr>
+      <w:bookmarkStart w:id="31" w:name="_Toc203070850"/>
       <w:r>
         <w:t xml:space="preserve">Figure </w:t>
       </w:r>
@@ -6364,6 +7372,7 @@
       <w:r>
         <w:t>: Steam XHR Requests</w:t>
       </w:r>
+      <w:bookmarkEnd w:id="31"/>
     </w:p>
     <w:p>
       <w:r>
@@ -6416,7 +7425,7 @@
           <w:noProof/>
         </w:rPr>
         <w:drawing>
-          <wp:inline distT="0" distB="0" distL="0" distR="0" wp14:anchorId="1F65946C" wp14:editId="1E4D71C7">
+          <wp:inline distT="0" distB="0" distL="0" distR="0" wp14:anchorId="1F65946C" wp14:editId="34F46196">
             <wp:extent cx="5731510" cy="530860"/>
             <wp:effectExtent l="38100" t="38100" r="40640" b="40640"/>
             <wp:docPr id="1929413245" name="Picture 5"/>
@@ -6468,6 +7477,7 @@
         <w:pStyle w:val="Caption"/>
         <w:jc w:val="center"/>
       </w:pPr>
+      <w:bookmarkStart w:id="32" w:name="_Toc203070851"/>
       <w:r>
         <w:t xml:space="preserve">Figure </w:t>
       </w:r>
@@ -6482,6 +7492,7 @@
       <w:r>
         <w:t>: XHR Returned JSON</w:t>
       </w:r>
+      <w:bookmarkEnd w:id="32"/>
     </w:p>
     <w:p>
       <w:r>
@@ -6503,7 +7514,15 @@
         <w:t xml:space="preserve">Though the XHR URL </w:t>
       </w:r>
       <w:r>
-        <w:t xml:space="preserve">returned the data as a JSON file, the JSON method of the requests library which decodes JSON for it to be used like a dictionary in Python (Requests Documentation, n.d.). From this, the HTML could be accessed with the key of “results_html” which </w:t>
+        <w:t>returned the data as a JSON file, the JSON method of the requests library which decodes JSON for it to be used like a dictionary in Python (Requests Documentation, n.d.). From this, the HTML could be accessed with the key of “</w:t>
+      </w:r>
+      <w:proofErr w:type="spellStart"/>
+      <w:r>
+        <w:t>results_html</w:t>
+      </w:r>
+      <w:proofErr w:type="spellEnd"/>
+      <w:r>
+        <w:t xml:space="preserve">” which </w:t>
       </w:r>
       <w:r>
         <w:t xml:space="preserve">finally </w:t>
@@ -6612,14 +7631,51 @@
         <w:t xml:space="preserve"> anchor tags mentioned at the beginning of this section are found using </w:t>
       </w:r>
       <w:r>
-        <w:t>Beautiful Soup’s find_all method which finds the requested elements</w:t>
-      </w:r>
-      <w:r>
-        <w:t xml:space="preserve"> (Tedboy, n.d.). In this case, the class attribute is included in the search due to the anchors having the classname of </w:t>
-      </w:r>
-      <w:r>
-        <w:t>"search_result_row ds_collapse_flag</w:t>
-      </w:r>
+        <w:t xml:space="preserve">Beautiful Soup’s </w:t>
+      </w:r>
+      <w:proofErr w:type="spellStart"/>
+      <w:r>
+        <w:t>find_all</w:t>
+      </w:r>
+      <w:proofErr w:type="spellEnd"/>
+      <w:r>
+        <w:t xml:space="preserve"> method which finds the requested elements</w:t>
+      </w:r>
+      <w:r>
+        <w:t xml:space="preserve"> (</w:t>
+      </w:r>
+      <w:proofErr w:type="spellStart"/>
+      <w:r>
+        <w:t>Tedboy</w:t>
+      </w:r>
+      <w:proofErr w:type="spellEnd"/>
+      <w:r>
+        <w:t xml:space="preserve">, n.d.). In this case, the class attribute is included in the search due to the anchors having the </w:t>
+      </w:r>
+      <w:proofErr w:type="spellStart"/>
+      <w:r>
+        <w:t>classname</w:t>
+      </w:r>
+      <w:proofErr w:type="spellEnd"/>
+      <w:r>
+        <w:t xml:space="preserve"> of </w:t>
+      </w:r>
+      <w:r>
+        <w:t>"</w:t>
+      </w:r>
+      <w:proofErr w:type="spellStart"/>
+      <w:r>
+        <w:t>search_result_row</w:t>
+      </w:r>
+      <w:proofErr w:type="spellEnd"/>
+      <w:r>
+        <w:t xml:space="preserve"> </w:t>
+      </w:r>
+      <w:proofErr w:type="spellStart"/>
+      <w:r>
+        <w:t>ds_collapse_flag</w:t>
+      </w:r>
+      <w:proofErr w:type="spellEnd"/>
       <w:r>
         <w:t xml:space="preserve">”. </w:t>
       </w:r>
@@ -6644,14 +7700,645 @@
     </w:p>
     <w:p>
       <w:pPr>
+        <w:pStyle w:val="Heading3"/>
+      </w:pPr>
+      <w:bookmarkStart w:id="33" w:name="_Toc203070830"/>
+      <w:r>
+        <w:lastRenderedPageBreak/>
+        <w:t>Per Game Page Scraping</w:t>
+      </w:r>
+      <w:bookmarkEnd w:id="33"/>
+    </w:p>
+    <w:p>
+      <w:pPr>
+        <w:keepNext/>
+        <w:jc w:val="center"/>
+      </w:pPr>
+      <w:r>
+        <w:rPr>
+          <w:noProof/>
+        </w:rPr>
+        <w:drawing>
+          <wp:inline distT="0" distB="0" distL="0" distR="0" wp14:anchorId="24E31E84" wp14:editId="321B9E2D">
+            <wp:extent cx="5724525" cy="2343150"/>
+            <wp:effectExtent l="38100" t="38100" r="47625" b="38100"/>
+            <wp:docPr id="1441160641" name="Picture 1"/>
+            <wp:cNvGraphicFramePr>
+              <a:graphicFrameLocks xmlns:a="http://schemas.openxmlformats.org/drawingml/2006/main" noChangeAspect="1"/>
+            </wp:cNvGraphicFramePr>
+            <a:graphic xmlns:a="http://schemas.openxmlformats.org/drawingml/2006/main">
+              <a:graphicData uri="http://schemas.openxmlformats.org/drawingml/2006/picture">
+                <pic:pic xmlns:pic="http://schemas.openxmlformats.org/drawingml/2006/picture">
+                  <pic:nvPicPr>
+                    <pic:cNvPr id="0" name="Picture 1"/>
+                    <pic:cNvPicPr>
+                      <a:picLocks noChangeAspect="1" noChangeArrowheads="1"/>
+                    </pic:cNvPicPr>
+                  </pic:nvPicPr>
+                  <pic:blipFill>
+                    <a:blip r:embed="rId24">
+                      <a:extLst>
+                        <a:ext uri="{28A0092B-C50C-407E-A947-70E740481C1C}">
+                          <a14:useLocalDpi xmlns:a14="http://schemas.microsoft.com/office/drawing/2010/main" val="0"/>
+                        </a:ext>
+                      </a:extLst>
+                    </a:blip>
+                    <a:srcRect/>
+                    <a:stretch>
+                      <a:fillRect/>
+                    </a:stretch>
+                  </pic:blipFill>
+                  <pic:spPr bwMode="auto">
+                    <a:xfrm>
+                      <a:off x="0" y="0"/>
+                      <a:ext cx="5724525" cy="2343150"/>
+                    </a:xfrm>
+                    <a:prstGeom prst="rect">
+                      <a:avLst/>
+                    </a:prstGeom>
+                    <a:noFill/>
+                    <a:ln w="38100">
+                      <a:solidFill>
+                        <a:schemeClr val="accent4"/>
+                      </a:solidFill>
+                    </a:ln>
+                  </pic:spPr>
+                </pic:pic>
+              </a:graphicData>
+            </a:graphic>
+          </wp:inline>
+        </w:drawing>
+      </w:r>
+    </w:p>
+    <w:p>
+      <w:pPr>
+        <w:pStyle w:val="Caption"/>
+        <w:jc w:val="center"/>
+      </w:pPr>
+      <w:bookmarkStart w:id="34" w:name="_Toc203070852"/>
+      <w:r>
+        <w:t xml:space="preserve">Figure </w:t>
+      </w:r>
+      <w:fldSimple w:instr=" SEQ Figure \* ARABIC ">
+        <w:r>
+          <w:rPr>
+            <w:noProof/>
+          </w:rPr>
+          <w:t>13</w:t>
+        </w:r>
+      </w:fldSimple>
+      <w:r>
+        <w:t>: Tag Collection</w:t>
+      </w:r>
+      <w:bookmarkEnd w:id="34"/>
+    </w:p>
+    <w:p>
+      <w:r>
+        <w:t>For each game page, a list is created that holds the data that will be collected called “</w:t>
+      </w:r>
+      <w:proofErr w:type="spellStart"/>
+      <w:r>
+        <w:t>current_game_data</w:t>
+      </w:r>
+      <w:proofErr w:type="spellEnd"/>
+      <w:r>
+        <w:t xml:space="preserve">”. Then, for each data point that needs be collected, the program attempts to find where the data is stored in the HTML using HTML </w:t>
+      </w:r>
+      <w:proofErr w:type="spellStart"/>
+      <w:r>
+        <w:t>classnames</w:t>
+      </w:r>
+      <w:proofErr w:type="spellEnd"/>
+      <w:r>
+        <w:t xml:space="preserve"> and looping through the results found and adding them to their own list which is then appended to </w:t>
+      </w:r>
+      <w:proofErr w:type="spellStart"/>
+      <w:r>
+        <w:t>current_game_data</w:t>
+      </w:r>
+      <w:proofErr w:type="spellEnd"/>
+      <w:r>
+        <w:t>. Unless no data is found, in which case “N/A” is appended instead.</w:t>
+      </w:r>
+      <w:r>
+        <w:t xml:space="preserve"> An example of this can be seen in the above image in which the code attempts to find the divider that contains user tags, loops through them if they are found and appends them to </w:t>
+      </w:r>
+      <w:proofErr w:type="spellStart"/>
+      <w:r>
+        <w:t>user_tags</w:t>
+      </w:r>
+      <w:proofErr w:type="spellEnd"/>
+      <w:r>
+        <w:t xml:space="preserve">. </w:t>
+      </w:r>
+      <w:proofErr w:type="spellStart"/>
+      <w:r>
+        <w:t>user_tags</w:t>
+      </w:r>
+      <w:proofErr w:type="spellEnd"/>
+      <w:r>
+        <w:t xml:space="preserve"> is then appended to </w:t>
+      </w:r>
+      <w:proofErr w:type="spellStart"/>
+      <w:r>
+        <w:t>current_game_data</w:t>
+      </w:r>
+      <w:proofErr w:type="spellEnd"/>
+      <w:r>
+        <w:t>.</w:t>
+      </w:r>
+    </w:p>
+    <w:p>
+      <w:r>
+        <w:t>(Continued…)</w:t>
+      </w:r>
+    </w:p>
+    <w:p>
+      <w:r>
+        <w:br w:type="page"/>
+      </w:r>
+    </w:p>
+    <w:p>
+      <w:pPr>
+        <w:keepNext/>
+      </w:pPr>
+      <w:r>
+        <w:rPr>
+          <w:noProof/>
+        </w:rPr>
+        <w:lastRenderedPageBreak/>
+        <w:drawing>
+          <wp:inline distT="0" distB="0" distL="0" distR="0" wp14:anchorId="402AF708" wp14:editId="275F8162">
+            <wp:extent cx="5734050" cy="5238750"/>
+            <wp:effectExtent l="38100" t="38100" r="38100" b="38100"/>
+            <wp:docPr id="574755444" name="Picture 2"/>
+            <wp:cNvGraphicFramePr>
+              <a:graphicFrameLocks xmlns:a="http://schemas.openxmlformats.org/drawingml/2006/main" noChangeAspect="1"/>
+            </wp:cNvGraphicFramePr>
+            <a:graphic xmlns:a="http://schemas.openxmlformats.org/drawingml/2006/main">
+              <a:graphicData uri="http://schemas.openxmlformats.org/drawingml/2006/picture">
+                <pic:pic xmlns:pic="http://schemas.openxmlformats.org/drawingml/2006/picture">
+                  <pic:nvPicPr>
+                    <pic:cNvPr id="0" name="Picture 2"/>
+                    <pic:cNvPicPr>
+                      <a:picLocks noChangeAspect="1" noChangeArrowheads="1"/>
+                    </pic:cNvPicPr>
+                  </pic:nvPicPr>
+                  <pic:blipFill>
+                    <a:blip r:embed="rId25">
+                      <a:extLst>
+                        <a:ext uri="{28A0092B-C50C-407E-A947-70E740481C1C}">
+                          <a14:useLocalDpi xmlns:a14="http://schemas.microsoft.com/office/drawing/2010/main" val="0"/>
+                        </a:ext>
+                      </a:extLst>
+                    </a:blip>
+                    <a:srcRect/>
+                    <a:stretch>
+                      <a:fillRect/>
+                    </a:stretch>
+                  </pic:blipFill>
+                  <pic:spPr bwMode="auto">
+                    <a:xfrm>
+                      <a:off x="0" y="0"/>
+                      <a:ext cx="5734050" cy="5238750"/>
+                    </a:xfrm>
+                    <a:prstGeom prst="rect">
+                      <a:avLst/>
+                    </a:prstGeom>
+                    <a:noFill/>
+                    <a:ln w="38100">
+                      <a:solidFill>
+                        <a:schemeClr val="accent4"/>
+                      </a:solidFill>
+                    </a:ln>
+                  </pic:spPr>
+                </pic:pic>
+              </a:graphicData>
+            </a:graphic>
+          </wp:inline>
+        </w:drawing>
+      </w:r>
+    </w:p>
+    <w:p>
+      <w:pPr>
+        <w:pStyle w:val="Caption"/>
+        <w:jc w:val="center"/>
+      </w:pPr>
+      <w:bookmarkStart w:id="35" w:name="_Toc203070853"/>
+      <w:r>
+        <w:t xml:space="preserve">Figure </w:t>
+      </w:r>
+      <w:fldSimple w:instr=" SEQ Figure \* ARABIC ">
+        <w:r>
+          <w:rPr>
+            <w:noProof/>
+          </w:rPr>
+          <w:t>14</w:t>
+        </w:r>
+      </w:fldSimple>
+      <w:r>
+        <w:t>: Developer and Publisher Scraping</w:t>
+      </w:r>
+      <w:bookmarkEnd w:id="35"/>
+    </w:p>
+    <w:p>
+      <w:r>
+        <w:t xml:space="preserve">However, for the developers, publishers and language data points, it was not as simple. For the developers and publishers, </w:t>
+      </w:r>
+      <w:r>
+        <w:t>originally, they were differentiated by checking for “developer” or “publisher” in their hypertext reference (HREF) URLs, but this led to a lot of games having blanks for developers and publishers. Instead, the “subtitle column” divider class is checked for developer or publisher. This worked, but some games do not have publishers and so, if this is the case, the publisher is set to be N/A.</w:t>
+      </w:r>
+    </w:p>
+    <w:p>
+      <w:r>
+        <w:t>(Continued…)</w:t>
+      </w:r>
+    </w:p>
+    <w:p>
+      <w:r>
+        <w:br w:type="page"/>
+      </w:r>
+    </w:p>
+    <w:p>
+      <w:pPr>
+        <w:keepNext/>
+        <w:jc w:val="center"/>
+      </w:pPr>
+      <w:r>
+        <w:rPr>
+          <w:noProof/>
+        </w:rPr>
+        <w:lastRenderedPageBreak/>
+        <w:drawing>
+          <wp:inline distT="0" distB="0" distL="0" distR="0" wp14:anchorId="25875628" wp14:editId="54D2506A">
+            <wp:extent cx="5724525" cy="4772025"/>
+            <wp:effectExtent l="38100" t="38100" r="47625" b="47625"/>
+            <wp:docPr id="2117322569" name="Picture 3"/>
+            <wp:cNvGraphicFramePr>
+              <a:graphicFrameLocks xmlns:a="http://schemas.openxmlformats.org/drawingml/2006/main" noChangeAspect="1"/>
+            </wp:cNvGraphicFramePr>
+            <a:graphic xmlns:a="http://schemas.openxmlformats.org/drawingml/2006/main">
+              <a:graphicData uri="http://schemas.openxmlformats.org/drawingml/2006/picture">
+                <pic:pic xmlns:pic="http://schemas.openxmlformats.org/drawingml/2006/picture">
+                  <pic:nvPicPr>
+                    <pic:cNvPr id="0" name="Picture 3"/>
+                    <pic:cNvPicPr>
+                      <a:picLocks noChangeAspect="1" noChangeArrowheads="1"/>
+                    </pic:cNvPicPr>
+                  </pic:nvPicPr>
+                  <pic:blipFill>
+                    <a:blip r:embed="rId26">
+                      <a:extLst>
+                        <a:ext uri="{28A0092B-C50C-407E-A947-70E740481C1C}">
+                          <a14:useLocalDpi xmlns:a14="http://schemas.microsoft.com/office/drawing/2010/main" val="0"/>
+                        </a:ext>
+                      </a:extLst>
+                    </a:blip>
+                    <a:srcRect/>
+                    <a:stretch>
+                      <a:fillRect/>
+                    </a:stretch>
+                  </pic:blipFill>
+                  <pic:spPr bwMode="auto">
+                    <a:xfrm>
+                      <a:off x="0" y="0"/>
+                      <a:ext cx="5724525" cy="4772025"/>
+                    </a:xfrm>
+                    <a:prstGeom prst="rect">
+                      <a:avLst/>
+                    </a:prstGeom>
+                    <a:noFill/>
+                    <a:ln w="38100">
+                      <a:solidFill>
+                        <a:schemeClr val="accent4"/>
+                      </a:solidFill>
+                    </a:ln>
+                  </pic:spPr>
+                </pic:pic>
+              </a:graphicData>
+            </a:graphic>
+          </wp:inline>
+        </w:drawing>
+      </w:r>
+    </w:p>
+    <w:p>
+      <w:pPr>
+        <w:pStyle w:val="Caption"/>
+        <w:jc w:val="center"/>
+      </w:pPr>
+      <w:bookmarkStart w:id="36" w:name="_Toc203070854"/>
+      <w:r>
+        <w:t xml:space="preserve">Figure </w:t>
+      </w:r>
+      <w:fldSimple w:instr=" SEQ Figure \* ARABIC ">
+        <w:r>
+          <w:rPr>
+            <w:noProof/>
+          </w:rPr>
+          <w:t>15</w:t>
+        </w:r>
+      </w:fldSimple>
+      <w:r>
+        <w:t>: Language Collection</w:t>
+      </w:r>
+      <w:bookmarkEnd w:id="36"/>
+    </w:p>
+    <w:p>
+      <w:r>
+        <w:t xml:space="preserve">Similarly, since the language data point is a table, collecting the supported languages within it meant having to create an algorithm to read the table. Unfortunately, as will be discussed in the data analysis, </w:t>
+      </w:r>
+      <w:r>
+        <w:t>while t</w:t>
+      </w:r>
+      <w:r>
+        <w:t>his worked, most games have the same available languages.</w:t>
+      </w:r>
+    </w:p>
+    <w:p>
+      <w:r>
+        <w:t>(Continued…)</w:t>
+      </w:r>
+    </w:p>
+    <w:p>
+      <w:r>
+        <w:br w:type="page"/>
+      </w:r>
+    </w:p>
+    <w:p>
+      <w:pPr>
+        <w:keepNext/>
+      </w:pPr>
+      <w:r>
+        <w:rPr>
+          <w:noProof/>
+        </w:rPr>
+        <w:lastRenderedPageBreak/>
+        <w:drawing>
+          <wp:inline distT="0" distB="0" distL="0" distR="0" wp14:anchorId="33BDDA79" wp14:editId="656D1952">
+            <wp:extent cx="5591175" cy="3933825"/>
+            <wp:effectExtent l="38100" t="38100" r="47625" b="47625"/>
+            <wp:docPr id="544899246" name="Picture 4"/>
+            <wp:cNvGraphicFramePr>
+              <a:graphicFrameLocks xmlns:a="http://schemas.openxmlformats.org/drawingml/2006/main" noChangeAspect="1"/>
+            </wp:cNvGraphicFramePr>
+            <a:graphic xmlns:a="http://schemas.openxmlformats.org/drawingml/2006/main">
+              <a:graphicData uri="http://schemas.openxmlformats.org/drawingml/2006/picture">
+                <pic:pic xmlns:pic="http://schemas.openxmlformats.org/drawingml/2006/picture">
+                  <pic:nvPicPr>
+                    <pic:cNvPr id="0" name="Picture 4"/>
+                    <pic:cNvPicPr>
+                      <a:picLocks noChangeAspect="1" noChangeArrowheads="1"/>
+                    </pic:cNvPicPr>
+                  </pic:nvPicPr>
+                  <pic:blipFill>
+                    <a:blip r:embed="rId27">
+                      <a:extLst>
+                        <a:ext uri="{28A0092B-C50C-407E-A947-70E740481C1C}">
+                          <a14:useLocalDpi xmlns:a14="http://schemas.microsoft.com/office/drawing/2010/main" val="0"/>
+                        </a:ext>
+                      </a:extLst>
+                    </a:blip>
+                    <a:srcRect/>
+                    <a:stretch>
+                      <a:fillRect/>
+                    </a:stretch>
+                  </pic:blipFill>
+                  <pic:spPr bwMode="auto">
+                    <a:xfrm>
+                      <a:off x="0" y="0"/>
+                      <a:ext cx="5591175" cy="3933825"/>
+                    </a:xfrm>
+                    <a:prstGeom prst="rect">
+                      <a:avLst/>
+                    </a:prstGeom>
+                    <a:noFill/>
+                    <a:ln w="38100">
+                      <a:solidFill>
+                        <a:schemeClr val="accent4"/>
+                      </a:solidFill>
+                    </a:ln>
+                  </pic:spPr>
+                </pic:pic>
+              </a:graphicData>
+            </a:graphic>
+          </wp:inline>
+        </w:drawing>
+      </w:r>
+    </w:p>
+    <w:p>
+      <w:pPr>
+        <w:pStyle w:val="Caption"/>
+        <w:jc w:val="center"/>
+      </w:pPr>
+      <w:bookmarkStart w:id="37" w:name="_Toc203070855"/>
+      <w:r>
+        <w:t xml:space="preserve">Figure </w:t>
+      </w:r>
+      <w:fldSimple w:instr=" SEQ Figure \* ARABIC ">
+        <w:r>
+          <w:rPr>
+            <w:noProof/>
+          </w:rPr>
+          <w:t>16</w:t>
+        </w:r>
+      </w:fldSimple>
+      <w:r>
+        <w:t>: Game Type</w:t>
+      </w:r>
+      <w:bookmarkEnd w:id="37"/>
+    </w:p>
+    <w:p>
+      <w:r>
+        <w:t>After experimenting with this scraping program, it was found that Steam does not just sell video games, but it also sells software, hardware and game bundles. Before the data collected is saved, the type is determined by checking the page location found at the top of the page with the class name of “</w:t>
+      </w:r>
+      <w:proofErr w:type="spellStart"/>
+      <w:r>
+        <w:t>blockbg</w:t>
+      </w:r>
+      <w:proofErr w:type="spellEnd"/>
+      <w:r>
+        <w:t xml:space="preserve">” which contains the type. </w:t>
+      </w:r>
+    </w:p>
+    <w:p>
+      <w:r>
+        <w:t xml:space="preserve">After the data has been collected, the </w:t>
+      </w:r>
+      <w:proofErr w:type="spellStart"/>
+      <w:r>
+        <w:t>current_game_data</w:t>
+      </w:r>
+      <w:proofErr w:type="spellEnd"/>
+      <w:r>
+        <w:t xml:space="preserve"> list is appended to the “</w:t>
+      </w:r>
+      <w:proofErr w:type="spellStart"/>
+      <w:r>
+        <w:t>game_data</w:t>
+      </w:r>
+      <w:proofErr w:type="spellEnd"/>
+      <w:r>
+        <w:t xml:space="preserve">” list which contains </w:t>
+      </w:r>
+      <w:proofErr w:type="gramStart"/>
+      <w:r>
+        <w:t>all of</w:t>
+      </w:r>
+      <w:proofErr w:type="gramEnd"/>
+      <w:r>
+        <w:t xml:space="preserve"> the game data collected.</w:t>
+      </w:r>
+    </w:p>
+    <w:p>
+      <w:r>
+        <w:t xml:space="preserve">One thing to note is </w:t>
+      </w:r>
+      <w:proofErr w:type="gramStart"/>
+      <w:r>
+        <w:t>that,</w:t>
+      </w:r>
+      <w:proofErr w:type="gramEnd"/>
+      <w:r>
+        <w:t xml:space="preserve"> the only hardware sold on Steam is Valve’s (the company that runs Steam) own hardware. </w:t>
+      </w:r>
+      <w:proofErr w:type="gramStart"/>
+      <w:r>
+        <w:t>All of</w:t>
+      </w:r>
+      <w:proofErr w:type="gramEnd"/>
+      <w:r>
+        <w:t xml:space="preserve"> this hardware has a completely different page layout with completely different class names. Because of this, all hardware data is N/A apart from the price.</w:t>
+      </w:r>
+    </w:p>
+    <w:p>
+      <w:r>
+        <w:br w:type="page"/>
+      </w:r>
+    </w:p>
+    <w:p>
+      <w:pPr>
+        <w:pStyle w:val="Heading3"/>
+      </w:pPr>
+      <w:bookmarkStart w:id="38" w:name="_Toc203070831"/>
+      <w:r>
+        <w:lastRenderedPageBreak/>
+        <w:t>Saving to CSV</w:t>
+      </w:r>
+      <w:bookmarkEnd w:id="38"/>
+    </w:p>
+    <w:p>
+      <w:r>
+        <w:rPr>
+          <w:noProof/>
+        </w:rPr>
+        <w:drawing>
+          <wp:inline distT="0" distB="0" distL="0" distR="0" wp14:anchorId="38EC3512" wp14:editId="111A6EFA">
+            <wp:extent cx="5724525" cy="3152775"/>
+            <wp:effectExtent l="38100" t="38100" r="47625" b="47625"/>
+            <wp:docPr id="330224126" name="Picture 5"/>
+            <wp:cNvGraphicFramePr>
+              <a:graphicFrameLocks xmlns:a="http://schemas.openxmlformats.org/drawingml/2006/main" noChangeAspect="1"/>
+            </wp:cNvGraphicFramePr>
+            <a:graphic xmlns:a="http://schemas.openxmlformats.org/drawingml/2006/main">
+              <a:graphicData uri="http://schemas.openxmlformats.org/drawingml/2006/picture">
+                <pic:pic xmlns:pic="http://schemas.openxmlformats.org/drawingml/2006/picture">
+                  <pic:nvPicPr>
+                    <pic:cNvPr id="0" name="Picture 5"/>
+                    <pic:cNvPicPr>
+                      <a:picLocks noChangeAspect="1" noChangeArrowheads="1"/>
+                    </pic:cNvPicPr>
+                  </pic:nvPicPr>
+                  <pic:blipFill>
+                    <a:blip r:embed="rId28">
+                      <a:extLst>
+                        <a:ext uri="{28A0092B-C50C-407E-A947-70E740481C1C}">
+                          <a14:useLocalDpi xmlns:a14="http://schemas.microsoft.com/office/drawing/2010/main" val="0"/>
+                        </a:ext>
+                      </a:extLst>
+                    </a:blip>
+                    <a:srcRect/>
+                    <a:stretch>
+                      <a:fillRect/>
+                    </a:stretch>
+                  </pic:blipFill>
+                  <pic:spPr bwMode="auto">
+                    <a:xfrm>
+                      <a:off x="0" y="0"/>
+                      <a:ext cx="5724525" cy="3152775"/>
+                    </a:xfrm>
+                    <a:prstGeom prst="rect">
+                      <a:avLst/>
+                    </a:prstGeom>
+                    <a:noFill/>
+                    <a:ln w="38100">
+                      <a:solidFill>
+                        <a:schemeClr val="accent4"/>
+                      </a:solidFill>
+                    </a:ln>
+                  </pic:spPr>
+                </pic:pic>
+              </a:graphicData>
+            </a:graphic>
+          </wp:inline>
+        </w:drawing>
+      </w:r>
+    </w:p>
+    <w:p>
+      <w:r>
+        <w:t xml:space="preserve">Finally, once all game data has been collected, it is saved to a CSV file using </w:t>
+      </w:r>
+      <w:r>
+        <w:t xml:space="preserve">Python’s CSV reader method as part of the CSV library (Python documentation, n.d. - a). One important part to note is that at first, the CSV files contained odd symbols before certain parts such as the prices. </w:t>
+      </w:r>
+      <w:r>
+        <w:t>It was found that this was because of incorrect encoding causing the wrong characters to be displayed (</w:t>
+      </w:r>
+      <w:proofErr w:type="spellStart"/>
+      <w:r>
+        <w:t>LabEx</w:t>
+      </w:r>
+      <w:proofErr w:type="spellEnd"/>
+      <w:r>
+        <w:t>, n.d.). With research, a page of Python Documentation (</w:t>
+      </w:r>
+      <w:proofErr w:type="spellStart"/>
+      <w:r>
+        <w:t>n.d</w:t>
+      </w:r>
+      <w:proofErr w:type="spellEnd"/>
+      <w:r>
+        <w:t>) titled “Unicode HOWTO”</w:t>
+      </w:r>
+      <w:r>
+        <w:t xml:space="preserve"> helped to understand some of the encoding types. Through experimentation, it was found that the UFT-8-SIG encoding method prevented encoding errors.</w:t>
+      </w:r>
+    </w:p>
+    <w:p>
+      <w:r>
+        <w:t xml:space="preserve">After this, the program then saves the time it took to run. When requesting that the program collect ten thousand games, the final time it took was 1 hour and 34 minutes (or </w:t>
+      </w:r>
+      <w:r>
+        <w:t>5651.02890920639 seconds</w:t>
+      </w:r>
+      <w:r>
+        <w:t xml:space="preserve">). </w:t>
+      </w:r>
+    </w:p>
+    <w:p>
+      <w:r>
+        <w:br w:type="page"/>
+      </w:r>
+    </w:p>
+    <w:p>
+      <w:pPr>
         <w:pStyle w:val="Heading2"/>
       </w:pPr>
-      <w:bookmarkStart w:id="29" w:name="_Toc202900768"/>
+      <w:bookmarkStart w:id="39" w:name="_Toc203070832"/>
       <w:r>
         <w:lastRenderedPageBreak/>
         <w:t>MySQL Database</w:t>
       </w:r>
-      <w:bookmarkEnd w:id="29"/>
+      <w:bookmarkEnd w:id="39"/>
     </w:p>
     <w:p/>
     <w:p>
@@ -6663,12 +8350,12 @@
       <w:pPr>
         <w:pStyle w:val="Heading2"/>
       </w:pPr>
-      <w:bookmarkStart w:id="30" w:name="_Toc202900769"/>
+      <w:bookmarkStart w:id="40" w:name="_Toc203070833"/>
       <w:r>
         <w:lastRenderedPageBreak/>
         <w:t>Website</w:t>
       </w:r>
-      <w:bookmarkEnd w:id="30"/>
+      <w:bookmarkEnd w:id="40"/>
     </w:p>
     <w:p/>
     <w:p>
@@ -6680,25 +8367,25 @@
       <w:pPr>
         <w:pStyle w:val="Heading1"/>
       </w:pPr>
-      <w:bookmarkStart w:id="31" w:name="_Toc202900770"/>
+      <w:bookmarkStart w:id="41" w:name="_Toc203070834"/>
       <w:r>
         <w:lastRenderedPageBreak/>
         <w:t>Results/Findings</w:t>
       </w:r>
-      <w:bookmarkEnd w:id="31"/>
+      <w:bookmarkEnd w:id="41"/>
     </w:p>
     <w:p>
       <w:pPr>
         <w:pStyle w:val="Heading2"/>
       </w:pPr>
-      <w:bookmarkStart w:id="32" w:name="_Toc202900771"/>
+      <w:bookmarkStart w:id="42" w:name="_Toc203070835"/>
       <w:r>
         <w:t>Scraping Program</w:t>
       </w:r>
       <w:r>
         <w:t xml:space="preserve"> &amp; Data Analysis</w:t>
       </w:r>
-      <w:bookmarkEnd w:id="32"/>
+      <w:bookmarkEnd w:id="42"/>
     </w:p>
     <w:p/>
     <w:p>
@@ -6710,12 +8397,12 @@
       <w:pPr>
         <w:pStyle w:val="Heading2"/>
       </w:pPr>
-      <w:bookmarkStart w:id="33" w:name="_Toc202900772"/>
+      <w:bookmarkStart w:id="43" w:name="_Toc203070836"/>
       <w:r>
         <w:lastRenderedPageBreak/>
         <w:t>MySQL Database</w:t>
       </w:r>
-      <w:bookmarkEnd w:id="33"/>
+      <w:bookmarkEnd w:id="43"/>
     </w:p>
     <w:p/>
     <w:p>
@@ -6727,12 +8414,12 @@
       <w:pPr>
         <w:pStyle w:val="Heading2"/>
       </w:pPr>
-      <w:bookmarkStart w:id="34" w:name="_Toc202900773"/>
+      <w:bookmarkStart w:id="44" w:name="_Toc203070837"/>
       <w:r>
         <w:lastRenderedPageBreak/>
         <w:t>Website</w:t>
       </w:r>
-      <w:bookmarkEnd w:id="34"/>
+      <w:bookmarkEnd w:id="44"/>
     </w:p>
     <w:p/>
     <w:p>
@@ -6744,12 +8431,12 @@
       <w:pPr>
         <w:pStyle w:val="Heading1"/>
       </w:pPr>
-      <w:bookmarkStart w:id="35" w:name="_Toc202900774"/>
+      <w:bookmarkStart w:id="45" w:name="_Toc203070838"/>
       <w:r>
         <w:lastRenderedPageBreak/>
         <w:t>Conclusion</w:t>
       </w:r>
-      <w:bookmarkEnd w:id="35"/>
+      <w:bookmarkEnd w:id="45"/>
     </w:p>
     <w:p/>
     <w:p>
@@ -6761,12 +8448,12 @@
       <w:pPr>
         <w:pStyle w:val="Heading1"/>
       </w:pPr>
-      <w:bookmarkStart w:id="36" w:name="_Toc202900775"/>
+      <w:bookmarkStart w:id="46" w:name="_Toc203070839"/>
       <w:r>
         <w:lastRenderedPageBreak/>
         <w:t>References</w:t>
       </w:r>
-      <w:bookmarkEnd w:id="36"/>
+      <w:bookmarkEnd w:id="46"/>
     </w:p>
     <w:p>
       <w:pPr>
@@ -6785,7 +8472,7 @@
       <w:r>
         <w:t xml:space="preserve">. Beautiful Soup. </w:t>
       </w:r>
-      <w:hyperlink r:id="rId24" w:history="1">
+      <w:hyperlink r:id="rId29" w:history="1">
         <w:r>
           <w:rPr>
             <w:rStyle w:val="Hyperlink"/>
@@ -6812,9 +8499,17 @@
         <w:t>, Jun</w:t>
       </w:r>
       <w:r>
-        <w:t xml:space="preserve">). Overwhelmed by Choices. American Journal of Neuroradiology : AJNR, 34(6), 1111–1112. </w:t>
-      </w:r>
-      <w:hyperlink r:id="rId25" w:history="1">
+        <w:t xml:space="preserve">). Overwhelmed by Choices. American Journal of </w:t>
+      </w:r>
+      <w:proofErr w:type="gramStart"/>
+      <w:r>
+        <w:t>Neuroradiology :</w:t>
+      </w:r>
+      <w:proofErr w:type="gramEnd"/>
+      <w:r>
+        <w:t xml:space="preserve"> AJNR, 34(6), 1111–1112. </w:t>
+      </w:r>
+      <w:hyperlink r:id="rId30" w:history="1">
         <w:r>
           <w:rPr>
             <w:rStyle w:val="Hyperlink"/>
@@ -6835,12 +8530,36 @@
         </w:numPr>
       </w:pPr>
       <w:r>
-        <w:t>Conklin, L., Drake, V., Strittmatter, Sven., Braiterman, Z., &amp; Shostack, A. (n.d.). Threat Modeling Process</w:t>
+        <w:t xml:space="preserve">Conklin, L., Drake, V., Strittmatter, Sven., </w:t>
+      </w:r>
+      <w:proofErr w:type="spellStart"/>
+      <w:r>
+        <w:t>Braiterman</w:t>
+      </w:r>
+      <w:proofErr w:type="spellEnd"/>
+      <w:r>
+        <w:t xml:space="preserve">, Z., &amp; </w:t>
+      </w:r>
+      <w:proofErr w:type="spellStart"/>
+      <w:r>
+        <w:t>Shostack</w:t>
+      </w:r>
+      <w:proofErr w:type="spellEnd"/>
+      <w:r>
+        <w:t xml:space="preserve">, A. (n.d.). Threat </w:t>
+      </w:r>
+      <w:proofErr w:type="spellStart"/>
+      <w:r>
+        <w:t>Modeling</w:t>
+      </w:r>
+      <w:proofErr w:type="spellEnd"/>
+      <w:r>
+        <w:t xml:space="preserve"> Process</w:t>
       </w:r>
       <w:r>
         <w:t xml:space="preserve">. OWASP. </w:t>
       </w:r>
-      <w:hyperlink r:id="rId26" w:history="1">
+      <w:hyperlink r:id="rId31" w:history="1">
         <w:r>
           <w:rPr>
             <w:rStyle w:val="Hyperlink"/>
@@ -6872,7 +8591,7 @@
       <w:r>
         <w:t xml:space="preserve">). Computer Misuse Act. The Code for Crown Prosecutors. </w:t>
       </w:r>
-      <w:hyperlink r:id="rId27" w:history="1">
+      <w:hyperlink r:id="rId32" w:history="1">
         <w:r>
           <w:rPr>
             <w:rStyle w:val="Hyperlink"/>
@@ -6904,7 +8623,7 @@
       <w:r>
         <w:t xml:space="preserve">, b). Fraud Act 2006. The Code for Crown Prosecutors. </w:t>
       </w:r>
-      <w:hyperlink r:id="rId28" w:history="1">
+      <w:hyperlink r:id="rId33" w:history="1">
         <w:r>
           <w:rPr>
             <w:rStyle w:val="Hyperlink"/>
@@ -6927,7 +8646,7 @@
       <w:r>
         <w:t xml:space="preserve">GDPR. (n.d.). What is GDPR, the EU’s new data protection law? GDPR. </w:t>
       </w:r>
-      <w:hyperlink r:id="rId29" w:history="1">
+      <w:hyperlink r:id="rId34" w:history="1">
         <w:r>
           <w:rPr>
             <w:rStyle w:val="Hyperlink"/>
@@ -6950,7 +8669,7 @@
       <w:r>
         <w:t xml:space="preserve">Creativyst Software. (n.d.). How To: The Comma Separated Value (CSV) File Format. Creativyst Software. </w:t>
       </w:r>
-      <w:hyperlink r:id="rId30" w:history="1">
+      <w:hyperlink r:id="rId35" w:history="1">
         <w:r>
           <w:rPr>
             <w:rStyle w:val="Hyperlink"/>
@@ -6973,7 +8692,7 @@
       <w:r>
         <w:t xml:space="preserve">GeeksForGeeks. (2025). Python Web Scraping Tutorial. GeeksForGeeks. </w:t>
       </w:r>
-      <w:hyperlink r:id="rId31" w:history="1">
+      <w:hyperlink r:id="rId36" w:history="1">
         <w:r>
           <w:rPr>
             <w:rStyle w:val="Hyperlink"/>
@@ -6994,15 +8713,9 @@
         </w:numPr>
       </w:pPr>
       <w:r>
-        <w:t xml:space="preserve">Interaction Design Foundation. (n.d.). Infinite Scrolling. </w:t>
-      </w:r>
-      <w:r>
-        <w:t>Interaction Design Foundation</w:t>
-      </w:r>
-      <w:r>
-        <w:t xml:space="preserve">. </w:t>
-      </w:r>
-      <w:hyperlink r:id="rId32" w:history="1">
+        <w:t xml:space="preserve">Interaction Design Foundation. (n.d.). Infinite Scrolling. Interaction Design Foundation. </w:t>
+      </w:r>
+      <w:hyperlink r:id="rId37" w:history="1">
         <w:r>
           <w:rPr>
             <w:rStyle w:val="Hyperlink"/>
@@ -7025,7 +8738,7 @@
       <w:r>
         <w:t xml:space="preserve">Iwanna, B., Rizvi, S., Ahmed, S., Dengel, A., &amp; Uchida, S. Judging a Book By its Cover. Cornell University. </w:t>
       </w:r>
-      <w:hyperlink r:id="rId33" w:history="1">
+      <w:hyperlink r:id="rId38" w:history="1">
         <w:r>
           <w:rPr>
             <w:rStyle w:val="Hyperlink"/>
@@ -7049,9 +8762,17 @@
         <w:t xml:space="preserve">Jones, K., &amp; Martin, L. (2016). </w:t>
       </w:r>
       <w:r>
-        <w:t xml:space="preserve">Adapting infinite-scroll with user experience in mind. DiVA. </w:t>
-      </w:r>
-      <w:hyperlink r:id="rId34" w:history="1">
+        <w:t xml:space="preserve">Adapting infinite-scroll with user experience in mind. </w:t>
+      </w:r>
+      <w:proofErr w:type="spellStart"/>
+      <w:r>
+        <w:t>DiVA</w:t>
+      </w:r>
+      <w:proofErr w:type="spellEnd"/>
+      <w:r>
+        <w:t xml:space="preserve">. </w:t>
+      </w:r>
+      <w:hyperlink r:id="rId39" w:history="1">
         <w:r>
           <w:rPr>
             <w:rStyle w:val="Hyperlink"/>
@@ -7071,21 +8792,28 @@
           <w:numId w:val="1"/>
         </w:numPr>
       </w:pPr>
-      <w:r>
-        <w:t>Landuyt, D., &amp; Joosen, W. (202</w:t>
-      </w:r>
-      <w:r>
-        <w:t>2</w:t>
-      </w:r>
-      <w:r>
-        <w:t xml:space="preserve">). A descriptive study of assumptions in STRIDE security threat modelling. Software and Systems Modelling, 21(6), 2311-2328. </w:t>
-      </w:r>
-      <w:hyperlink r:id="rId35" w:history="1">
+      <w:proofErr w:type="spellStart"/>
+      <w:r>
+        <w:t>LabEx</w:t>
+      </w:r>
+      <w:proofErr w:type="spellEnd"/>
+      <w:r>
+        <w:t xml:space="preserve">. (n.d.). How to manage CSV file encoding. </w:t>
+      </w:r>
+      <w:proofErr w:type="spellStart"/>
+      <w:r>
+        <w:t>LabEx</w:t>
+      </w:r>
+      <w:proofErr w:type="spellEnd"/>
+      <w:r>
+        <w:t xml:space="preserve">. </w:t>
+      </w:r>
+      <w:hyperlink r:id="rId40" w:history="1">
         <w:r>
           <w:rPr>
             <w:rStyle w:val="Hyperlink"/>
           </w:rPr>
-          <w:t>https://doi.org/10.1007/s10270-021-00941-7</w:t>
+          <w:t>https://labex.io/tutorials/python-how-to-manage-csv-file-encoding-418947</w:t>
         </w:r>
       </w:hyperlink>
       <w:r>
@@ -7101,20 +8829,20 @@
         </w:numPr>
       </w:pPr>
       <w:r>
-        <w:t xml:space="preserve">MDN Web Docs. (n.d.). </w:t>
-      </w:r>
-      <w:r>
-        <w:t>XMLHttpRequest</w:t>
-      </w:r>
-      <w:r>
-        <w:t xml:space="preserve">. MDN Web Docs. </w:t>
-      </w:r>
-      <w:hyperlink r:id="rId36" w:history="1">
+        <w:t>Landuyt, D., &amp; Joosen, W. (202</w:t>
+      </w:r>
+      <w:r>
+        <w:t>2</w:t>
+      </w:r>
+      <w:r>
+        <w:t xml:space="preserve">). A descriptive study of assumptions in STRIDE security threat modelling. Software and Systems Modelling, 21(6), 2311-2328. </w:t>
+      </w:r>
+      <w:hyperlink r:id="rId41" w:history="1">
         <w:r>
           <w:rPr>
             <w:rStyle w:val="Hyperlink"/>
           </w:rPr>
-          <w:t>https://developer.mozilla.org/en-US/docs/Web/API/XMLHttpRequest</w:t>
+          <w:t>https://doi.org/10.1007/s10270-021-00941-7</w:t>
         </w:r>
       </w:hyperlink>
       <w:r>
@@ -7130,14 +8858,20 @@
         </w:numPr>
       </w:pPr>
       <w:r>
-        <w:t xml:space="preserve">Microsoft Learn. (2009). The STRIDE Threat Model. Microsoft Learn. </w:t>
-      </w:r>
-      <w:hyperlink r:id="rId37" w:history="1">
+        <w:t xml:space="preserve">MDN Web Docs. (n.d.). </w:t>
+      </w:r>
+      <w:r>
+        <w:t>XMLHttpRequest</w:t>
+      </w:r>
+      <w:r>
+        <w:t xml:space="preserve">. MDN Web Docs. </w:t>
+      </w:r>
+      <w:hyperlink r:id="rId42" w:history="1">
         <w:r>
           <w:rPr>
             <w:rStyle w:val="Hyperlink"/>
           </w:rPr>
-          <w:t>https://learn.microsoft.com/en-us/previous-versions/commerce-server/ee823878(v=cs.20)?redirectedfrom=MSDN</w:t>
+          <w:t>https://developer.mozilla.org/en-US/docs/Web/API/XMLHttpRequest</w:t>
         </w:r>
       </w:hyperlink>
       <w:r>
@@ -7153,16 +8887,19 @@
         </w:numPr>
       </w:pPr>
       <w:r>
-        <w:t xml:space="preserve">Microsoft Support. (n.d.). Create or edit .csv files to import into Outlook. Microsoft Support. </w:t>
-      </w:r>
-      <w:hyperlink r:id="rId38" w:history="1">
+        <w:t xml:space="preserve">Microsoft Learn. (2009). The STRIDE Threat Model. Microsoft Learn. </w:t>
+      </w:r>
+      <w:hyperlink r:id="rId43" w:history="1">
         <w:r>
           <w:rPr>
             <w:rStyle w:val="Hyperlink"/>
           </w:rPr>
-          <w:t>https://support.microsoft.com/en-gb/office/create-or-edit-csv-files-to-import-into-outlook-4518d70d-8fe9-46ad-94fa-1494247193c7</w:t>
+          <w:t>https://learn.microsoft.com/en-us/previous-versions/commerce-server/ee823878(v=cs.20)?redirectedfrom=MSDN</w:t>
         </w:r>
       </w:hyperlink>
+      <w:r>
+        <w:t xml:space="preserve"> </w:t>
+      </w:r>
     </w:p>
     <w:p>
       <w:pPr>
@@ -7173,19 +8910,16 @@
         </w:numPr>
       </w:pPr>
       <w:r>
-        <w:t xml:space="preserve">MySQL. (n.d.). 1.2.1 What is MySQL? MySQL Documentation. </w:t>
-      </w:r>
-      <w:hyperlink r:id="rId39" w:history="1">
+        <w:t xml:space="preserve">Microsoft Support. (n.d.). Create or edit .csv files to import into Outlook. Microsoft Support. </w:t>
+      </w:r>
+      <w:hyperlink r:id="rId44" w:history="1">
         <w:r>
           <w:rPr>
             <w:rStyle w:val="Hyperlink"/>
           </w:rPr>
-          <w:t>https://dev.mysql.com/doc/refman/8.0/en/what-is-mysql.html</w:t>
+          <w:t>https://support.microsoft.com/en-gb/office/create-or-edit-csv-files-to-import-into-outlook-4518d70d-8fe9-46ad-94fa-1494247193c7</w:t>
         </w:r>
       </w:hyperlink>
-      <w:r>
-        <w:t xml:space="preserve"> </w:t>
-      </w:r>
     </w:p>
     <w:p>
       <w:pPr>
@@ -7196,14 +8930,14 @@
         </w:numPr>
       </w:pPr>
       <w:r>
-        <w:t xml:space="preserve">Pypi. (n.d. -a). requests 2.32.3. Pypi. </w:t>
-      </w:r>
-      <w:hyperlink r:id="rId40" w:history="1">
+        <w:t xml:space="preserve">MySQL. (n.d.). 1.2.1 What is MySQL? MySQL Documentation. </w:t>
+      </w:r>
+      <w:hyperlink r:id="rId45" w:history="1">
         <w:r>
           <w:rPr>
             <w:rStyle w:val="Hyperlink"/>
           </w:rPr>
-          <w:t>https://pypi.org/project/requests/</w:t>
+          <w:t>https://dev.mysql.com/doc/refman/8.0/en/what-is-mysql.html</w:t>
         </w:r>
       </w:hyperlink>
       <w:r>
@@ -7220,17 +8954,14 @@
       </w:pPr>
       <w:r>
         <w:lastRenderedPageBreak/>
-        <w:t>Pypi. (n.d. -b). beautiful</w:t>
-      </w:r>
-      <w:r>
-        <w:t xml:space="preserve">soup4 4.13.4. Pypi. </w:t>
-      </w:r>
-      <w:hyperlink r:id="rId41" w:history="1">
+        <w:t xml:space="preserve">Pypi. (n.d. -a). requests 2.32.3. Pypi. </w:t>
+      </w:r>
+      <w:hyperlink r:id="rId46" w:history="1">
         <w:r>
           <w:rPr>
             <w:rStyle w:val="Hyperlink"/>
           </w:rPr>
-          <w:t>https://pypi.org/project/beautifulsoup4/</w:t>
+          <w:t>https://pypi.org/project/requests/</w:t>
         </w:r>
       </w:hyperlink>
       <w:r>
@@ -7246,14 +8977,17 @@
         </w:numPr>
       </w:pPr>
       <w:r>
-        <w:t xml:space="preserve">Pypi. (n.d. -c). selenium 4.33.0. Pypi. </w:t>
-      </w:r>
-      <w:hyperlink r:id="rId42" w:history="1">
+        <w:t>Pypi. (n.d. -b). beautiful</w:t>
+      </w:r>
+      <w:r>
+        <w:t xml:space="preserve">soup4 4.13.4. Pypi. </w:t>
+      </w:r>
+      <w:hyperlink r:id="rId47" w:history="1">
         <w:r>
           <w:rPr>
             <w:rStyle w:val="Hyperlink"/>
           </w:rPr>
-          <w:t>https://pypi.org/project/selenium/</w:t>
+          <w:t>https://pypi.org/project/beautifulsoup4/</w:t>
         </w:r>
       </w:hyperlink>
       <w:r>
@@ -7269,14 +9003,14 @@
         </w:numPr>
       </w:pPr>
       <w:r>
-        <w:t xml:space="preserve">Pypi. (n.d. -d). schedule 1.2.2. Pypi. </w:t>
-      </w:r>
-      <w:hyperlink r:id="rId43" w:history="1">
+        <w:t xml:space="preserve">Pypi. (n.d. -c). selenium 4.33.0. Pypi. </w:t>
+      </w:r>
+      <w:hyperlink r:id="rId48" w:history="1">
         <w:r>
           <w:rPr>
             <w:rStyle w:val="Hyperlink"/>
           </w:rPr>
-          <w:t>https://pypi.org/project/schedule/</w:t>
+          <w:t>https://pypi.org/project/selenium/</w:t>
         </w:r>
       </w:hyperlink>
       <w:r>
@@ -7292,14 +9026,14 @@
         </w:numPr>
       </w:pPr>
       <w:r>
-        <w:t xml:space="preserve">Python Documentation. (n.d.). csv – CSV File Reading and Writing. Python. </w:t>
-      </w:r>
-      <w:hyperlink r:id="rId44" w:history="1">
+        <w:t xml:space="preserve">Pypi. (n.d. -d). schedule 1.2.2. Pypi. </w:t>
+      </w:r>
+      <w:hyperlink r:id="rId49" w:history="1">
         <w:r>
           <w:rPr>
             <w:rStyle w:val="Hyperlink"/>
           </w:rPr>
-          <w:t>https://docs.python.org/3/library/csv.html</w:t>
+          <w:t>https://pypi.org/project/schedule/</w:t>
         </w:r>
       </w:hyperlink>
       <w:r>
@@ -7315,9 +9049,17 @@
         </w:numPr>
       </w:pPr>
       <w:r>
-        <w:t xml:space="preserve">Pypi. (n.d. -e). mysql-connector-python 9.3.0. Pypi. </w:t>
-      </w:r>
-      <w:hyperlink r:id="rId45" w:history="1">
+        <w:t xml:space="preserve">Pypi. (n.d. -e). </w:t>
+      </w:r>
+      <w:proofErr w:type="spellStart"/>
+      <w:r>
+        <w:t>mysql</w:t>
+      </w:r>
+      <w:proofErr w:type="spellEnd"/>
+      <w:r>
+        <w:t xml:space="preserve">-connector-python 9.3.0. Pypi. </w:t>
+      </w:r>
+      <w:hyperlink r:id="rId50" w:history="1">
         <w:r>
           <w:rPr>
             <w:rStyle w:val="Hyperlink"/>
@@ -7338,14 +9080,20 @@
         </w:numPr>
       </w:pPr>
       <w:r>
-        <w:t xml:space="preserve">Raneri, P., Montag, C., Rozgonjuk, D., Satel, J., &amp; Pontes, H. (2022, June). The role of microtransactions in Internet Gaming Disorder and Gambling Disorder: A preregistered systematic review. Addictive Behaviors Reports. 15, 100415. </w:t>
-      </w:r>
-      <w:hyperlink r:id="rId46" w:history="1">
+        <w:t>Python Documentation. (n.d.</w:t>
+      </w:r>
+      <w:r>
+        <w:t xml:space="preserve"> -a</w:t>
+      </w:r>
+      <w:r>
+        <w:t xml:space="preserve">). csv – CSV File Reading and Writing. Python. </w:t>
+      </w:r>
+      <w:hyperlink r:id="rId51" w:history="1">
         <w:r>
           <w:rPr>
             <w:rStyle w:val="Hyperlink"/>
           </w:rPr>
-          <w:t>https://doi.org/10.1016/j.abrep.2022.100415</w:t>
+          <w:t>https://docs.python.org/3/library/csv.html</w:t>
         </w:r>
       </w:hyperlink>
       <w:r>
@@ -7361,14 +9109,23 @@
         </w:numPr>
       </w:pPr>
       <w:r>
-        <w:t xml:space="preserve">Requests Documentation. (n.d.). Quickstartn. Requests Documentation. </w:t>
-      </w:r>
-      <w:hyperlink r:id="rId47" w:history="1">
+        <w:t>Python Documentation. (n.d.</w:t>
+      </w:r>
+      <w:r>
+        <w:t xml:space="preserve"> -b</w:t>
+      </w:r>
+      <w:r>
+        <w:t xml:space="preserve">). </w:t>
+      </w:r>
+      <w:r>
+        <w:t xml:space="preserve">Unicode HOWTO. Python. </w:t>
+      </w:r>
+      <w:hyperlink r:id="rId52" w:history="1">
         <w:r>
           <w:rPr>
             <w:rStyle w:val="Hyperlink"/>
           </w:rPr>
-          <w:t>https://requests.readthedocs.io/en/latest/user/quickstart/</w:t>
+          <w:t>https://docs.python.org/3/howto/unicode.html</w:t>
         </w:r>
       </w:hyperlink>
       <w:r>
@@ -7384,14 +9141,22 @@
         </w:numPr>
       </w:pPr>
       <w:r>
-        <w:t xml:space="preserve">Samuli, K. (2022, January 19th). Pricing economics of video games: a panel data study on the effects of versioning on revenue. University of Oulu Repository. </w:t>
-      </w:r>
-      <w:hyperlink r:id="rId48" w:history="1">
+        <w:t xml:space="preserve">Raneri, P., Montag, C., Rozgonjuk, D., Satel, J., &amp; Pontes, H. (2022, June). The role of microtransactions in Internet Gaming Disorder and Gambling Disorder: A preregistered systematic review. Addictive </w:t>
+      </w:r>
+      <w:proofErr w:type="spellStart"/>
+      <w:r>
+        <w:t>Behaviors</w:t>
+      </w:r>
+      <w:proofErr w:type="spellEnd"/>
+      <w:r>
+        <w:t xml:space="preserve"> Reports. 15, 100415. </w:t>
+      </w:r>
+      <w:hyperlink r:id="rId53" w:history="1">
         <w:r>
           <w:rPr>
             <w:rStyle w:val="Hyperlink"/>
           </w:rPr>
-          <w:t>https://urn.fi/URN:NBN:fi:oulu-202201191079</w:t>
+          <w:t>https://doi.org/10.1016/j.abrep.2022.100415</w:t>
         </w:r>
       </w:hyperlink>
       <w:r>
@@ -7407,14 +9172,22 @@
         </w:numPr>
       </w:pPr>
       <w:r>
-        <w:t xml:space="preserve">Selenium. (n.d.). Locating Elements. Selenium. </w:t>
-      </w:r>
-      <w:hyperlink r:id="rId49" w:history="1">
+        <w:t xml:space="preserve">Requests Documentation. (n.d.). </w:t>
+      </w:r>
+      <w:proofErr w:type="spellStart"/>
+      <w:r>
+        <w:t>Quickstartn</w:t>
+      </w:r>
+      <w:proofErr w:type="spellEnd"/>
+      <w:r>
+        <w:t xml:space="preserve">. Requests Documentation. </w:t>
+      </w:r>
+      <w:hyperlink r:id="rId54" w:history="1">
         <w:r>
           <w:rPr>
             <w:rStyle w:val="Hyperlink"/>
           </w:rPr>
-          <w:t>https://selenium-python.readthedocs.io/locating-elements.html</w:t>
+          <w:t>https://requests.readthedocs.io/en/latest/user/quickstart/</w:t>
         </w:r>
       </w:hyperlink>
       <w:r>
@@ -7430,14 +9203,14 @@
         </w:numPr>
       </w:pPr>
       <w:r>
-        <w:t xml:space="preserve">ScrapeOps. (n.d.). How To Scroll Infinite Pages in Python. ScrapeOps. </w:t>
-      </w:r>
-      <w:hyperlink r:id="rId50" w:history="1">
+        <w:t xml:space="preserve">Samuli, K. (2022, January 19th). Pricing economics of video games: a panel data study on the effects of versioning on revenue. University of Oulu Repository. </w:t>
+      </w:r>
+      <w:hyperlink r:id="rId55" w:history="1">
         <w:r>
           <w:rPr>
             <w:rStyle w:val="Hyperlink"/>
           </w:rPr>
-          <w:t>https://scrapeops.io/python-web-scraping-playbook/python-scroll-infinite-pages/</w:t>
+          <w:t>https://urn.fi/URN:NBN:fi:oulu-202201191079</w:t>
         </w:r>
       </w:hyperlink>
       <w:r>
@@ -7453,16 +9226,18 @@
         </w:numPr>
       </w:pPr>
       <w:r>
-        <w:t>Smith, Vincent. (2019). Go Web Scraping Quick Start Guide (1</w:t>
-      </w:r>
-      <w:r>
-        <w:rPr>
-          <w:vertAlign w:val="superscript"/>
-        </w:rPr>
-        <w:t>st</w:t>
-      </w:r>
-      <w:r>
-        <w:t xml:space="preserve"> Edition). Packt Publishing.</w:t>
+        <w:t xml:space="preserve">Selenium. (n.d.). Locating Elements. Selenium. </w:t>
+      </w:r>
+      <w:hyperlink r:id="rId56" w:history="1">
+        <w:r>
+          <w:rPr>
+            <w:rStyle w:val="Hyperlink"/>
+          </w:rPr>
+          <w:t>https://selenium-python.readthedocs.io/locating-elements.html</w:t>
+        </w:r>
+      </w:hyperlink>
+      <w:r>
+        <w:t xml:space="preserve"> </w:t>
       </w:r>
     </w:p>
     <w:p>
@@ -7474,14 +9249,14 @@
         </w:numPr>
       </w:pPr>
       <w:r>
-        <w:t xml:space="preserve">Steam. (n.d.). Portal 2. Steam. </w:t>
-      </w:r>
-      <w:hyperlink r:id="rId51" w:history="1">
+        <w:t xml:space="preserve">ScrapeOps. (n.d.). How To Scroll Infinite Pages in Python. ScrapeOps. </w:t>
+      </w:r>
+      <w:hyperlink r:id="rId57" w:history="1">
         <w:r>
           <w:rPr>
             <w:rStyle w:val="Hyperlink"/>
           </w:rPr>
-          <w:t>https://store.steampowered.com/app/620/Portal_2/</w:t>
+          <w:t>https://scrapeops.io/python-web-scraping-playbook/python-scroll-infinite-pages/</w:t>
         </w:r>
       </w:hyperlink>
       <w:r>
@@ -7497,18 +9272,16 @@
         </w:numPr>
       </w:pPr>
       <w:r>
-        <w:t xml:space="preserve">Steamworks. (n.d.). Steam Direct (Joining The Steamworks Distribution Program). Steam. </w:t>
-      </w:r>
-      <w:hyperlink r:id="rId52" w:history="1">
-        <w:r>
-          <w:rPr>
-            <w:rStyle w:val="Hyperlink"/>
-          </w:rPr>
-          <w:t>https://partner.steamgames.com/steamdirect</w:t>
-        </w:r>
-      </w:hyperlink>
-      <w:r>
-        <w:t xml:space="preserve"> </w:t>
+        <w:t>Smith, Vincent. (2019). Go Web Scraping Quick Start Guide (1</w:t>
+      </w:r>
+      <w:r>
+        <w:rPr>
+          <w:vertAlign w:val="superscript"/>
+        </w:rPr>
+        <w:t>st</w:t>
+      </w:r>
+      <w:r>
+        <w:t xml:space="preserve"> Edition). Packt Publishing.</w:t>
       </w:r>
     </w:p>
     <w:p>
@@ -7520,14 +9293,14 @@
         </w:numPr>
       </w:pPr>
       <w:r>
-        <w:t xml:space="preserve">Tedboy. (n.d.). Beautiful Soup Documentation. Github. </w:t>
-      </w:r>
-      <w:hyperlink r:id="rId53" w:history="1">
+        <w:t xml:space="preserve">Steam. (n.d.). Portal 2. Steam. </w:t>
+      </w:r>
+      <w:hyperlink r:id="rId58" w:history="1">
         <w:r>
           <w:rPr>
             <w:rStyle w:val="Hyperlink"/>
           </w:rPr>
-          <w:t>https://tedboy.github.io/bs4_doc/</w:t>
+          <w:t>https://store.steampowered.com/app/620/Portal_2/</w:t>
         </w:r>
       </w:hyperlink>
       <w:r>
@@ -7543,14 +9316,22 @@
         </w:numPr>
       </w:pPr>
       <w:r>
-        <w:t xml:space="preserve">United Kingdom. (n.d.). Data protection (The UK’s data protection legislation). United Kingdom. </w:t>
-      </w:r>
-      <w:hyperlink r:id="rId54" w:history="1">
+        <w:t xml:space="preserve">Steamworks. (n.d.). Steam Direct (Joining </w:t>
+      </w:r>
+      <w:proofErr w:type="gramStart"/>
+      <w:r>
+        <w:t>The</w:t>
+      </w:r>
+      <w:proofErr w:type="gramEnd"/>
+      <w:r>
+        <w:t xml:space="preserve"> Steamworks Distribution Program). Steam. </w:t>
+      </w:r>
+      <w:hyperlink r:id="rId59" w:history="1">
         <w:r>
           <w:rPr>
             <w:rStyle w:val="Hyperlink"/>
           </w:rPr>
-          <w:t>https://www.gov.uk/data-protection</w:t>
+          <w:t>https://partner.steamgames.com/steamdirect</w:t>
         </w:r>
       </w:hyperlink>
       <w:r>
@@ -7565,21 +9346,28 @@
           <w:numId w:val="1"/>
         </w:numPr>
       </w:pPr>
-      <w:r>
-        <w:t>UKCS. (n.d.). UK copyright law: An introduction (</w:t>
-      </w:r>
-      <w:r>
-        <w:t>The Copyright, Designs and Patents Act 1988</w:t>
-      </w:r>
-      <w:r>
-        <w:t xml:space="preserve">). The UK Copyright Service. </w:t>
-      </w:r>
-      <w:hyperlink r:id="rId55" w:history="1">
+      <w:proofErr w:type="spellStart"/>
+      <w:r>
+        <w:t>Tedboy</w:t>
+      </w:r>
+      <w:proofErr w:type="spellEnd"/>
+      <w:r>
+        <w:t xml:space="preserve">. (n.d.). Beautiful Soup Documentation. </w:t>
+      </w:r>
+      <w:proofErr w:type="spellStart"/>
+      <w:r>
+        <w:t>Github</w:t>
+      </w:r>
+      <w:proofErr w:type="spellEnd"/>
+      <w:r>
+        <w:t xml:space="preserve">. </w:t>
+      </w:r>
+      <w:hyperlink r:id="rId60" w:history="1">
         <w:r>
           <w:rPr>
             <w:rStyle w:val="Hyperlink"/>
           </w:rPr>
-          <w:t>https://copyrightservice.co.uk/copyright/uk_law_summary</w:t>
+          <w:t>https://tedboy.github.io/bs4_doc/</w:t>
         </w:r>
       </w:hyperlink>
       <w:r>
@@ -7595,7 +9383,18 @@
         </w:numPr>
       </w:pPr>
       <w:r>
-        <w:t xml:space="preserve">Xiao, G. (2021). BAD BOTS: REGULATING THE SCRAPING OF PUBLIC PERSONAL INFORMATION. Harvard Journal of Law &amp; Technology, 34 (2), 701. </w:t>
+        <w:t xml:space="preserve">United Kingdom. (n.d.). Data protection (The UK’s data protection legislation). United Kingdom. </w:t>
+      </w:r>
+      <w:hyperlink r:id="rId61" w:history="1">
+        <w:r>
+          <w:rPr>
+            <w:rStyle w:val="Hyperlink"/>
+          </w:rPr>
+          <w:t>https://www.gov.uk/data-protection</w:t>
+        </w:r>
+      </w:hyperlink>
+      <w:r>
+        <w:t xml:space="preserve"> </w:t>
       </w:r>
     </w:p>
     <w:p>
@@ -7607,15 +9406,62 @@
         </w:numPr>
       </w:pPr>
       <w:r>
+        <w:t>UKCS. (n.d.). UK copyright law: An introduction (</w:t>
+      </w:r>
+      <w:r>
+        <w:t>The Copyright, Designs and Patents Act 1988</w:t>
+      </w:r>
+      <w:r>
+        <w:t xml:space="preserve">). The UK Copyright Service. </w:t>
+      </w:r>
+      <w:hyperlink r:id="rId62" w:history="1">
+        <w:r>
+          <w:rPr>
+            <w:rStyle w:val="Hyperlink"/>
+          </w:rPr>
+          <w:t>https://copyrightservice.co.uk/copyright/uk_law_summary</w:t>
+        </w:r>
+      </w:hyperlink>
+      <w:r>
+        <w:t xml:space="preserve"> </w:t>
+      </w:r>
+    </w:p>
+    <w:p>
+      <w:pPr>
+        <w:pStyle w:val="ListParagraph"/>
+        <w:numPr>
+          <w:ilvl w:val="0"/>
+          <w:numId w:val="1"/>
+        </w:numPr>
+      </w:pPr>
+      <w:r>
+        <w:t xml:space="preserve">Xiao, G. (2021). BAD BOTS: REGULATING THE SCRAPING OF PUBLIC PERSONAL INFORMATION. Harvard Journal of Law &amp; Technology, 34 (2), 701. </w:t>
+      </w:r>
+    </w:p>
+    <w:p>
+      <w:pPr>
+        <w:pStyle w:val="ListParagraph"/>
+        <w:numPr>
+          <w:ilvl w:val="0"/>
+          <w:numId w:val="1"/>
+        </w:numPr>
+      </w:pPr>
+      <w:r>
+        <w:lastRenderedPageBreak/>
         <w:t xml:space="preserve">Zhao, B. (2017). Web Scraping. </w:t>
       </w:r>
-      <w:r>
-        <w:t xml:space="preserve">Encyclopedia </w:t>
+      <w:proofErr w:type="spellStart"/>
+      <w:r>
+        <w:t>Encyclopedia</w:t>
+      </w:r>
+      <w:proofErr w:type="spellEnd"/>
+      <w:r>
+        <w:t xml:space="preserve"> </w:t>
       </w:r>
       <w:r>
         <w:t xml:space="preserve">of Big Data. </w:t>
       </w:r>
-      <w:hyperlink r:id="rId56" w:history="1">
+      <w:hyperlink r:id="rId63" w:history="1">
         <w:r>
           <w:rPr>
             <w:rStyle w:val="Hyperlink"/>
@@ -7632,10 +9478,9 @@
         <w:pStyle w:val="ListParagraph"/>
       </w:pPr>
       <w:r>
-        <w:lastRenderedPageBreak/>
         <w:t xml:space="preserve">ALT: </w:t>
       </w:r>
-      <w:hyperlink r:id="rId57" w:history="1">
+      <w:hyperlink r:id="rId64" w:history="1">
         <w:r>
           <w:rPr>
             <w:rStyle w:val="Hyperlink"/>
@@ -10140,6 +11985,7 @@
   <w:style w:type="character" w:default="1" w:styleId="DefaultParagraphFont">
     <w:name w:val="Default Paragraph Font"/>
     <w:uiPriority w:val="1"/>
+    <w:semiHidden/>
     <w:unhideWhenUsed/>
   </w:style>
   <w:style w:type="table" w:default="1" w:styleId="TableNormal">

</xml_diff>

<commit_message>
Fixed data cleaner from adding empty columns when an error occurred
</commit_message>
<xml_diff>
--- a/(0) Disertation/Dissertation.docx
+++ b/(0) Disertation/Dissertation.docx
@@ -3482,11 +3482,9 @@
       <w:r>
         <w:t xml:space="preserve"> </w:t>
       </w:r>
-      <w:proofErr w:type="gramStart"/>
-      <w:r>
-        <w:t>With this in mind, this</w:t>
-      </w:r>
-      <w:proofErr w:type="gramEnd"/>
+      <w:r>
+        <w:t>This</w:t>
+      </w:r>
       <w:r>
         <w:t xml:space="preserve"> </w:t>
       </w:r>
@@ -4240,7 +4238,22 @@
     </w:p>
     <w:p>
       <w:r>
-        <w:t>Due to scraping taking data from websites, the scraping program must be made in a way such that it cannot</w:t>
+        <w:t>Because</w:t>
+      </w:r>
+      <w:r>
+        <w:t xml:space="preserve"> </w:t>
+      </w:r>
+      <w:r>
+        <w:t xml:space="preserve">scraping </w:t>
+      </w:r>
+      <w:r>
+        <w:t>tak</w:t>
+      </w:r>
+      <w:r>
+        <w:t xml:space="preserve">es </w:t>
+      </w:r>
+      <w:r>
+        <w:t>data from websites, the scraping program must be made in a way such that it cannot</w:t>
       </w:r>
       <w:r>
         <w:t xml:space="preserve"> take data from an unauthorised source</w:t>
@@ -6640,7 +6653,7 @@
           <w:noProof/>
         </w:rPr>
         <w:drawing>
-          <wp:inline distT="0" distB="0" distL="0" distR="0" wp14:anchorId="40ABE2E5" wp14:editId="1309C562">
+          <wp:inline distT="0" distB="0" distL="0" distR="0" wp14:anchorId="40ABE2E5" wp14:editId="47153206">
             <wp:extent cx="4162425" cy="1246650"/>
             <wp:effectExtent l="38100" t="38100" r="28575" b="29845"/>
             <wp:docPr id="1701288164" name="Picture 2" descr="A computer screen with text on it&#10;&#10;AI-generated content may be incorrect."/>
@@ -6981,7 +6994,7 @@
           <w:noProof/>
         </w:rPr>
         <w:drawing>
-          <wp:inline distT="0" distB="0" distL="0" distR="0" wp14:anchorId="5F05F26C" wp14:editId="1E508BA4">
+          <wp:inline distT="0" distB="0" distL="0" distR="0" wp14:anchorId="5F05F26C" wp14:editId="2B4D146C">
             <wp:extent cx="5731510" cy="637540"/>
             <wp:effectExtent l="38100" t="38100" r="40640" b="29210"/>
             <wp:docPr id="1908628895" name="Picture 2"/>
@@ -7425,7 +7438,7 @@
           <w:noProof/>
         </w:rPr>
         <w:drawing>
-          <wp:inline distT="0" distB="0" distL="0" distR="0" wp14:anchorId="1F65946C" wp14:editId="34F46196">
+          <wp:inline distT="0" distB="0" distL="0" distR="0" wp14:anchorId="1F65946C" wp14:editId="2EB6865B">
             <wp:extent cx="5731510" cy="530860"/>
             <wp:effectExtent l="38100" t="38100" r="40640" b="40640"/>
             <wp:docPr id="1929413245" name="Picture 5"/>
@@ -8380,10 +8393,7 @@
       </w:pPr>
       <w:bookmarkStart w:id="42" w:name="_Toc203070835"/>
       <w:r>
-        <w:t>Scraping Program</w:t>
-      </w:r>
-      <w:r>
-        <w:t xml:space="preserve"> &amp; Data Analysis</w:t>
+        <w:t>Data Analysis</w:t>
       </w:r>
       <w:bookmarkEnd w:id="42"/>
     </w:p>

</xml_diff>

<commit_message>
Made begining changes to cleaner
</commit_message>
<xml_diff>
--- a/(0) Disertation/Dissertation.docx
+++ b/(0) Disertation/Dissertation.docx
@@ -3458,26 +3458,10 @@
     </w:p>
     <w:p>
       <w:r>
-        <w:t xml:space="preserve">When searching for new video games, it can be hard for uses to find games that they might be interested </w:t>
-      </w:r>
-      <w:proofErr w:type="gramStart"/>
-      <w:r>
-        <w:t>in</w:t>
-      </w:r>
-      <w:proofErr w:type="gramEnd"/>
-      <w:r>
-        <w:t xml:space="preserve"> and it can be hard for businesses to </w:t>
-      </w:r>
-      <w:r>
-        <w:t xml:space="preserve">reach new users. To help with this, using publicly data from the internet, a database could be built that, with a user interface such as a web application, could help users find games they are interested in that are </w:t>
-      </w:r>
-      <w:proofErr w:type="gramStart"/>
-      <w:r>
-        <w:t>similar to</w:t>
-      </w:r>
-      <w:proofErr w:type="gramEnd"/>
-      <w:r>
-        <w:t xml:space="preserve"> ones they already like.</w:t>
+        <w:t xml:space="preserve">When searching for new video games, it can be hard for uses to find games that they might be interested in and it can be hard for businesses to </w:t>
+      </w:r>
+      <w:r>
+        <w:t>reach new users. To help with this, using publicly data from the internet, a database could be built that, with a user interface such as a web application, could help users find games they are interested in that are similar to ones they already like.</w:t>
       </w:r>
       <w:r>
         <w:t xml:space="preserve"> </w:t>
@@ -3489,23 +3473,7 @@
         <w:t xml:space="preserve"> </w:t>
       </w:r>
       <w:r>
-        <w:t xml:space="preserve">project aims to create a web application that </w:t>
-      </w:r>
-      <w:proofErr w:type="gramStart"/>
-      <w:r>
-        <w:t>is able to</w:t>
-      </w:r>
-      <w:proofErr w:type="gramEnd"/>
-      <w:r>
-        <w:t xml:space="preserve"> help users find video games they may be interested in </w:t>
-      </w:r>
-      <w:proofErr w:type="gramStart"/>
-      <w:r>
-        <w:t>through the use of</w:t>
-      </w:r>
-      <w:proofErr w:type="gramEnd"/>
-      <w:r>
-        <w:t xml:space="preserve"> a tagging system. </w:t>
+        <w:t xml:space="preserve">project aims to create a web application that is able to help users find video games they may be interested in through the use of a tagging system. </w:t>
       </w:r>
     </w:p>
     <w:p>
@@ -3888,39 +3856,7 @@
         <w:t xml:space="preserve"> collect any personal information from any users, data privacy will still be considered by investigating the GDPR and its UK equivalent.</w:t>
       </w:r>
       <w:r>
-        <w:t xml:space="preserve"> However, this problem is not only limited to users’ personal data, but companies’ data as well along with scrapers potentially violating a company’s terms of service (Zhao, 2017). However, Zhao (2017) argues that it is difficult to prove the data’s copyright due to “only a specific section of the data [being] legally protected”, while arguing that terms of service fall into a “</w:t>
-      </w:r>
-      <w:proofErr w:type="spellStart"/>
-      <w:r>
-        <w:t>gray</w:t>
-      </w:r>
-      <w:proofErr w:type="spellEnd"/>
-      <w:r>
-        <w:t xml:space="preserve"> area”. Nonetheless, </w:t>
-      </w:r>
-      <w:proofErr w:type="gramStart"/>
-      <w:r>
-        <w:t>all of</w:t>
-      </w:r>
-      <w:proofErr w:type="gramEnd"/>
-      <w:r>
-        <w:t xml:space="preserve"> the data scraped in this project should have its source saved and, </w:t>
-      </w:r>
-      <w:proofErr w:type="gramStart"/>
-      <w:r>
-        <w:t>in</w:t>
-      </w:r>
-      <w:proofErr w:type="gramEnd"/>
-      <w:r>
-        <w:t xml:space="preserve"> the website, linked to </w:t>
-      </w:r>
-      <w:proofErr w:type="gramStart"/>
-      <w:r>
-        <w:t>in order to</w:t>
-      </w:r>
-      <w:proofErr w:type="gramEnd"/>
-      <w:r>
-        <w:t xml:space="preserve"> show that the data is from the target website and not from another source.</w:t>
+        <w:t xml:space="preserve"> However, this problem is not only limited to users’ personal data, but companies’ data as well along with scrapers potentially violating a company’s terms of service (Zhao, 2017). However, Zhao (2017) argues that it is difficult to prove the data’s copyright due to “only a specific section of the data [being] legally protected”, while arguing that terms of service fall into a “gray area”. Nonetheless, all of the data scraped in this project should have its source saved and, in the website, linked to in order to show that the data is from the target website and not from another source.</w:t>
       </w:r>
     </w:p>
     <w:p>
@@ -4205,15 +4141,7 @@
         <w:t xml:space="preserve">their email </w:t>
       </w:r>
       <w:r>
-        <w:t xml:space="preserve">at any </w:t>
-      </w:r>
-      <w:proofErr w:type="gramStart"/>
-      <w:r>
-        <w:t>time</w:t>
-      </w:r>
-      <w:proofErr w:type="gramEnd"/>
-      <w:r>
-        <w:t xml:space="preserve"> and </w:t>
+        <w:t xml:space="preserve">at any time and </w:t>
       </w:r>
       <w:r>
         <w:t xml:space="preserve">they should be able </w:t>
@@ -4292,15 +4220,7 @@
     </w:p>
     <w:p>
       <w:r>
-        <w:t xml:space="preserve">Once a person creates something, they have copyright over their creation for </w:t>
-      </w:r>
-      <w:proofErr w:type="gramStart"/>
-      <w:r>
-        <w:t>a number of</w:t>
-      </w:r>
-      <w:proofErr w:type="gramEnd"/>
-      <w:r>
-        <w:t xml:space="preserve"> years depending on what kind of creation it is (for example, literary, dramatic, musical or artistic works have a copyright of 70 years, while sound recordings have 50 years instead). This copyright gives the person the right to control how their work is used and allows them to object to distortions of their work due to being identified as the author</w:t>
+        <w:t>Once a person creates something, they have copyright over their creation for a number of years depending on what kind of creation it is (for example, literary, dramatic, musical or artistic works have a copyright of 70 years, while sound recordings have 50 years instead). This copyright gives the person the right to control how their work is used and allows them to object to distortions of their work due to being identified as the author</w:t>
       </w:r>
       <w:r>
         <w:t xml:space="preserve"> (UKCS, n.d.)</w:t>
@@ -4815,15 +4735,7 @@
         <w:t xml:space="preserve"> or ethical issues. However, the main target for this program is the online video game distributor known as Steam. However, </w:t>
       </w:r>
       <w:r>
-        <w:t xml:space="preserve">when publishing a video game on Steam through the user of “Steamworks”, the author must build their video game’s store page. The only part Steam does in the creation of this store page is that they review it after submission </w:t>
-      </w:r>
-      <w:proofErr w:type="gramStart"/>
-      <w:r>
-        <w:t>in order to</w:t>
-      </w:r>
-      <w:proofErr w:type="gramEnd"/>
-      <w:r>
-        <w:t xml:space="preserve"> confirm that it is working and not harmful (Steamworks, n.d.). Because this information is submitted by the author themselves, this project assumes that each page contains mostly accurate information about the video games themselves.</w:t>
+        <w:t>when publishing a video game on Steam through the user of “Steamworks”, the author must build their video game’s store page. The only part Steam does in the creation of this store page is that they review it after submission in order to confirm that it is working and not harmful (Steamworks, n.d.). Because this information is submitted by the author themselves, this project assumes that each page contains mostly accurate information about the video games themselves.</w:t>
       </w:r>
       <w:r>
         <w:t xml:space="preserve"> Missing or erroneous information will be fixed after scraping through normalisation.</w:t>
@@ -5209,15 +5121,7 @@
     </w:p>
     <w:p>
       <w:r>
-        <w:t xml:space="preserve">Overall, the main goal of this project is to create a website that allows for users to search for video games </w:t>
-      </w:r>
-      <w:proofErr w:type="gramStart"/>
-      <w:r>
-        <w:t>similar to</w:t>
-      </w:r>
-      <w:proofErr w:type="gramEnd"/>
-      <w:r>
-        <w:t xml:space="preserve"> ones they already like. To achieve this, this project will be split into the following parts which can be seen in the above diagram:</w:t>
+        <w:t>Overall, the main goal of this project is to create a website that allows for users to search for video games similar to ones they already like. To achieve this, this project will be split into the following parts which can be seen in the above diagram:</w:t>
       </w:r>
     </w:p>
     <w:p>
@@ -5229,15 +5133,7 @@
         </w:numPr>
       </w:pPr>
       <w:r>
-        <w:t>Scraping program: As previously described, this program will go over the target website (in this case, Steam</w:t>
-      </w:r>
-      <w:proofErr w:type="gramStart"/>
-      <w:r>
-        <w:t>), and</w:t>
-      </w:r>
-      <w:proofErr w:type="gramEnd"/>
-      <w:r>
-        <w:t xml:space="preserve"> collect data about various video games. This should be limited to low number of video games to avoid affecting Steam with high amounts of traffic and to avoid the possibility of running out of storage or the program taking too long.</w:t>
+        <w:t>Scraping program: As previously described, this program will go over the target website (in this case, Steam), and collect data about various video games. This should be limited to low number of video games to avoid affecting Steam with high amounts of traffic and to avoid the possibility of running out of storage or the program taking too long.</w:t>
       </w:r>
     </w:p>
     <w:p>
@@ -5494,15 +5390,7 @@
         <w:t xml:space="preserve">in a programmatic way </w:t>
       </w:r>
       <w:r>
-        <w:t xml:space="preserve">which allows for web scraping like the </w:t>
-      </w:r>
-      <w:proofErr w:type="gramStart"/>
-      <w:r>
-        <w:t>requests</w:t>
-      </w:r>
-      <w:proofErr w:type="gramEnd"/>
-      <w:r>
-        <w:t xml:space="preserve"> library but i</w:t>
+        <w:t>which allows for web scraping like the requests library but i</w:t>
       </w:r>
       <w:r>
         <w:t>n a browser instead of just a HTML</w:t>
@@ -5561,7 +5449,6 @@
       <w:r>
         <w:t xml:space="preserve">For the scraping program itself, the target website must have a page that lists </w:t>
       </w:r>
-      <w:proofErr w:type="gramStart"/>
       <w:r>
         <w:rPr>
           <w:i/>
@@ -5570,11 +5457,7 @@
         <w:t>all</w:t>
       </w:r>
       <w:r>
-        <w:t xml:space="preserve"> of</w:t>
-      </w:r>
-      <w:proofErr w:type="gramEnd"/>
-      <w:r>
-        <w:t xml:space="preserve"> its games. Using this page, the following should be done for each game in the list:</w:t>
+        <w:t xml:space="preserve"> of its games. Using this page, the following should be done for each game in the list:</w:t>
       </w:r>
     </w:p>
     <w:p>
@@ -5654,15 +5537,7 @@
         <w:t xml:space="preserve"> is necessary for when each video game is put on the website.</w:t>
       </w:r>
       <w:r>
-        <w:t xml:space="preserve"> The title can be found on both </w:t>
-      </w:r>
-      <w:proofErr w:type="gramStart"/>
-      <w:r>
-        <w:t>the all</w:t>
-      </w:r>
-      <w:proofErr w:type="gramEnd"/>
-      <w:r>
-        <w:t xml:space="preserve"> games page and on each game’s page as well.</w:t>
+        <w:t xml:space="preserve"> The title can be found on both the all games page and on each game’s page as well.</w:t>
       </w:r>
     </w:p>
     <w:p>
@@ -5816,15 +5691,7 @@
         <w:t>, as shown above, have multiple developers</w:t>
       </w:r>
       <w:r>
-        <w:t xml:space="preserve"> separated by commas. Data analysis can be done on the developers to determine, for example, the developer with most expensive games. This will be included </w:t>
-      </w:r>
-      <w:proofErr w:type="gramStart"/>
-      <w:r>
-        <w:t>in</w:t>
-      </w:r>
-      <w:proofErr w:type="gramEnd"/>
-      <w:r>
-        <w:t xml:space="preserve"> the website.</w:t>
+        <w:t xml:space="preserve"> separated by commas. Data analysis can be done on the developers to determine, for example, the developer with most expensive games. This will be included in the website.</w:t>
       </w:r>
     </w:p>
     <w:p>
@@ -5836,15 +5703,7 @@
         </w:numPr>
       </w:pPr>
       <w:r>
-        <w:t xml:space="preserve">Publisher(s). The company or companies that help to publish each game. As with the developers, some games have multiple publishers. This will be used for data analysis for the same reason as the developers. This will be included </w:t>
-      </w:r>
-      <w:proofErr w:type="gramStart"/>
-      <w:r>
-        <w:t>in</w:t>
-      </w:r>
-      <w:proofErr w:type="gramEnd"/>
-      <w:r>
-        <w:t xml:space="preserve"> the website.</w:t>
+        <w:t>Publisher(s). The company or companies that help to publish each game. As with the developers, some games have multiple publishers. This will be used for data analysis for the same reason as the developers. This will be included in the website.</w:t>
       </w:r>
     </w:p>
     <w:p>
@@ -5861,24 +5720,11 @@
       <w:r>
         <w:t xml:space="preserve">user </w:t>
       </w:r>
-      <w:proofErr w:type="gramStart"/>
-      <w:r>
-        <w:t>describe</w:t>
-      </w:r>
-      <w:proofErr w:type="gramEnd"/>
-      <w:r>
-        <w:t xml:space="preserve"> the content of each video game.</w:t>
-      </w:r>
-      <w:r>
-        <w:t xml:space="preserve"> This will mostly be useful </w:t>
-      </w:r>
-      <w:proofErr w:type="gramStart"/>
-      <w:r>
-        <w:t>in</w:t>
-      </w:r>
-      <w:proofErr w:type="gramEnd"/>
-      <w:r>
-        <w:t xml:space="preserve"> the website but will still be used in data analysis.</w:t>
+      <w:r>
+        <w:t>describe the content of each video game.</w:t>
+      </w:r>
+      <w:r>
+        <w:t xml:space="preserve"> This will mostly be useful in the website but will still be used in data analysis.</w:t>
       </w:r>
     </w:p>
     <w:p>
@@ -6122,15 +5968,7 @@
         <w:t xml:space="preserve">. </w:t>
       </w:r>
       <w:r>
-        <w:t xml:space="preserve">This library allows Python to communicate with a MySQL database through an API which allows for the database to be connected to and, </w:t>
-      </w:r>
-      <w:proofErr w:type="gramStart"/>
-      <w:r>
-        <w:t>through the use of</w:t>
-      </w:r>
-      <w:proofErr w:type="gramEnd"/>
-      <w:r>
-        <w:t xml:space="preserve"> a cursor, allows for the execution of SQL commands on the database</w:t>
+        <w:t>This library allows Python to communicate with a MySQL database through an API which allows for the database to be connected to and, through the use of a cursor, allows for the execution of SQL commands on the database</w:t>
       </w:r>
       <w:r>
         <w:t xml:space="preserve"> (Pypi, n.d. -e)</w:t>
@@ -6234,15 +6072,7 @@
     </w:p>
     <w:p>
       <w:r>
-        <w:t xml:space="preserve">Above is a plan for the database. In it, the green boxes are regular tables that define different bits of data. The purple boxes, however, are link tables which describe how the data in two or more tables are linked. At the most basic level, the link tables hold the ids of the columns that are linked. For example, a user in the user table linked to their review in the review table will have a column in the </w:t>
-      </w:r>
-      <w:proofErr w:type="spellStart"/>
-      <w:r>
-        <w:t>link_user_review</w:t>
-      </w:r>
-      <w:proofErr w:type="spellEnd"/>
-      <w:r>
-        <w:t xml:space="preserve"> table that holds the user’s ID and their review’s ID. </w:t>
+        <w:t xml:space="preserve">Above is a plan for the database. In it, the green boxes are regular tables that define different bits of data. The purple boxes, however, are link tables which describe how the data in two or more tables are linked. At the most basic level, the link tables hold the ids of the columns that are linked. For example, a user in the user table linked to their review in the review table will have a column in the link_user_review table that holds the user’s ID and their review’s ID. </w:t>
       </w:r>
     </w:p>
     <w:p>
@@ -6361,68 +6191,12 @@
     </w:p>
     <w:p>
       <w:r>
-        <w:t xml:space="preserve">Before writing the actual scraping program, two practice scraping programs were made. One with the requests and Beautifulsoup libraries and the other with the selenium library. Primarily, this was to learn how </w:t>
-      </w:r>
-      <w:proofErr w:type="gramStart"/>
-      <w:r>
-        <w:t>all of</w:t>
-      </w:r>
-      <w:proofErr w:type="gramEnd"/>
-      <w:r>
-        <w:t xml:space="preserve"> those libraries work and how best to write them, but it also helped to show which was faster. For both practice programs, the special “All Pages” wiki page on Wikipedia was used. This page lists </w:t>
-      </w:r>
-      <w:proofErr w:type="gramStart"/>
-      <w:r>
-        <w:t>all of</w:t>
-      </w:r>
-      <w:proofErr w:type="gramEnd"/>
-      <w:r>
-        <w:t xml:space="preserve"> the wikis on the website as links. Due to this, both practice programs went through this wiki and then to each link and collected the data from each wiki page.</w:t>
-      </w:r>
-    </w:p>
-    <w:p>
-      <w:r>
-        <w:t xml:space="preserve">The page that lists </w:t>
-      </w:r>
-      <w:proofErr w:type="gramStart"/>
-      <w:r>
-        <w:t>all of</w:t>
-      </w:r>
-      <w:proofErr w:type="gramEnd"/>
-      <w:r>
-        <w:t xml:space="preserve"> the wikis is split into multiple pages, and on each page is a link to a single wiki page. Due to this, both programs get the HTML and search for a divider element with the class of “mw-</w:t>
-      </w:r>
-      <w:proofErr w:type="spellStart"/>
-      <w:r>
-        <w:t>allpages</w:t>
-      </w:r>
-      <w:proofErr w:type="spellEnd"/>
-      <w:r>
-        <w:t xml:space="preserve">-nav” which holds </w:t>
-      </w:r>
-      <w:proofErr w:type="gramStart"/>
-      <w:r>
-        <w:t>all of</w:t>
-      </w:r>
-      <w:proofErr w:type="gramEnd"/>
-      <w:r>
-        <w:t xml:space="preserve"> the links. From there, </w:t>
-      </w:r>
-      <w:proofErr w:type="gramStart"/>
-      <w:r>
-        <w:t>all of</w:t>
-      </w:r>
-      <w:proofErr w:type="gramEnd"/>
-      <w:r>
-        <w:t xml:space="preserve"> the links are looped </w:t>
-      </w:r>
-      <w:proofErr w:type="gramStart"/>
-      <w:r>
-        <w:t>through</w:t>
-      </w:r>
-      <w:proofErr w:type="gramEnd"/>
-      <w:r>
-        <w:t xml:space="preserve"> and both programs visit the pages they hold. Once on each page, three elements are found, with those being:</w:t>
+        <w:t>Before writing the actual scraping program, two practice scraping programs were made. One with the requests and Beautifulsoup libraries and the other with the selenium library. Primarily, this was to learn how all of those libraries work and how best to write them, but it also helped to show which was faster. For both practice programs, the special “All Pages” wiki page on Wikipedia was used. This page lists all of the wikis on the website as links. Due to this, both practice programs went through this wiki and then to each link and collected the data from each wiki page.</w:t>
+      </w:r>
+    </w:p>
+    <w:p>
+      <w:r>
+        <w:t>The page that lists all of the wikis is split into multiple pages, and on each page is a link to a single wiki page. Due to this, both programs get the HTML and search for a divider element with the class of “mw-allpages-nav” which holds all of the links. From there, all of the links are looped through and both programs visit the pages they hold. Once on each page, three elements are found, with those being:</w:t>
       </w:r>
     </w:p>
     <w:p>
@@ -6434,15 +6208,7 @@
         </w:numPr>
       </w:pPr>
       <w:r>
-        <w:t>The title. This is sometimes a span element with the class of “mw-page-title-main” and other times it is instead a “h1” element with the id of “</w:t>
-      </w:r>
-      <w:proofErr w:type="spellStart"/>
-      <w:r>
-        <w:t>firstHeading</w:t>
-      </w:r>
-      <w:proofErr w:type="spellEnd"/>
-      <w:r>
-        <w:t>”.</w:t>
+        <w:t>The title. This is sometimes a span element with the class of “mw-page-title-main” and other times it is instead a “h1” element with the id of “firstHeading”.</w:t>
       </w:r>
     </w:p>
     <w:p>
@@ -6480,42 +6246,10 @@
     </w:p>
     <w:p>
       <w:r>
-        <w:t xml:space="preserve">Along with these elements, the page’s URL is also saved and after looping through </w:t>
-      </w:r>
-      <w:proofErr w:type="gramStart"/>
-      <w:r>
-        <w:t>all of</w:t>
-      </w:r>
-      <w:proofErr w:type="gramEnd"/>
-      <w:r>
-        <w:t xml:space="preserve"> the pages, both programs return to </w:t>
-      </w:r>
-      <w:proofErr w:type="gramStart"/>
-      <w:r>
-        <w:t>the all</w:t>
-      </w:r>
-      <w:proofErr w:type="gramEnd"/>
-      <w:r>
-        <w:t xml:space="preserve"> wikis page and search for a link that contains the text “Next page” and go to the next all wikis </w:t>
-      </w:r>
-      <w:proofErr w:type="gramStart"/>
-      <w:r>
-        <w:t>page</w:t>
-      </w:r>
-      <w:proofErr w:type="gramEnd"/>
-      <w:r>
-        <w:t xml:space="preserve">. </w:t>
-      </w:r>
-      <w:r>
-        <w:t xml:space="preserve">After doing this for a certain </w:t>
-      </w:r>
-      <w:proofErr w:type="gramStart"/>
-      <w:r>
-        <w:t>amount</w:t>
-      </w:r>
-      <w:proofErr w:type="gramEnd"/>
-      <w:r>
-        <w:t xml:space="preserve"> of pages specified at the start of the code, both programs save the list containing each page’s elements to a CSV file</w:t>
+        <w:t xml:space="preserve">Along with these elements, the page’s URL is also saved and after looping through all of the pages, both programs return to the all wikis page and search for a link that contains the text “Next page” and go to the next all wikis page. </w:t>
+      </w:r>
+      <w:r>
+        <w:t>After doing this for a certain amount of pages specified at the start of the code, both programs save the list containing each page’s elements to a CSV file</w:t>
       </w:r>
       <w:r>
         <w:t xml:space="preserve"> using the CSV library.</w:t>
@@ -6623,15 +6357,7 @@
         <w:t>elements could be found with the “find all” method (after initialising beautiful soup on a request’s HTML) which returns all instances of the element requested</w:t>
       </w:r>
       <w:r>
-        <w:t xml:space="preserve"> (of which elements with specific classes or ids can be requested with the </w:t>
-      </w:r>
-      <w:proofErr w:type="spellStart"/>
-      <w:r>
-        <w:t>attrs</w:t>
-      </w:r>
-      <w:proofErr w:type="spellEnd"/>
-      <w:r>
-        <w:t xml:space="preserve"> attribute)</w:t>
+        <w:t xml:space="preserve"> (of which elements with specific classes or ids can be requested with the attrs attribute)</w:t>
       </w:r>
       <w:r>
         <w:t xml:space="preserve"> which can then be looped through to handle child elements</w:t>
@@ -6728,15 +6454,7 @@
     </w:p>
     <w:p>
       <w:r>
-        <w:t xml:space="preserve">However, from experimentation, Beautiful Soup does not allow for further searches on elements returned from a search. This </w:t>
-      </w:r>
-      <w:proofErr w:type="gramStart"/>
-      <w:r>
-        <w:t>lead</w:t>
-      </w:r>
-      <w:proofErr w:type="gramEnd"/>
-      <w:r>
-        <w:t xml:space="preserve"> to the multiple nested for loops shown above which were simply trying to find the contents elements of each page. Allowing for another search would have made this egregious looping unneeded.</w:t>
+        <w:t>However, from experimentation, Beautiful Soup does not allow for further searches on elements returned from a search. This lead to the multiple nested for loops shown above which were simply trying to find the contents elements of each page. Allowing for another search would have made this egregious looping unneeded.</w:t>
       </w:r>
     </w:p>
     <w:p>
@@ -6835,15 +6553,7 @@
     </w:p>
     <w:p>
       <w:r>
-        <w:t xml:space="preserve">For the selenium program (using the Firefox web browser), the code is quite </w:t>
-      </w:r>
-      <w:proofErr w:type="gramStart"/>
-      <w:r>
-        <w:t>similar to</w:t>
-      </w:r>
-      <w:proofErr w:type="gramEnd"/>
-      <w:r>
-        <w:t xml:space="preserve"> beautiful soup. Selenium allows for the search of elements through different tag attributes rather than searching for a specific element like in beautiful soup</w:t>
+        <w:t>For the selenium program (using the Firefox web browser), the code is quite similar to beautiful soup. Selenium allows for the search of elements through different tag attributes rather than searching for a specific element like in beautiful soup</w:t>
       </w:r>
       <w:r>
         <w:t xml:space="preserve"> (Selenium)</w:t>
@@ -6863,15 +6573,7 @@
         <w:t xml:space="preserve">However, while this makes Selenium a good option for scraping, there is one major issue with its use. It takes a lot longer to scrape than the requests library. </w:t>
       </w:r>
       <w:r>
-        <w:t xml:space="preserve">Using the time library, both programs were timed on how long it took them to scrape the links from five pages of </w:t>
-      </w:r>
-      <w:proofErr w:type="gramStart"/>
-      <w:r>
-        <w:t>the all</w:t>
-      </w:r>
-      <w:proofErr w:type="gramEnd"/>
-      <w:r>
-        <w:t xml:space="preserve"> pages wiki. </w:t>
+        <w:t xml:space="preserve">Using the time library, both programs were timed on how long it took them to scrape the links from five pages of the all pages wiki. </w:t>
       </w:r>
       <w:r>
         <w:t xml:space="preserve">The Beautiful Soup program took 220 seconds (about 3 minutes), while the Selenium program took 1606 seconds (about 26 minutes). </w:t>
@@ -7527,15 +7229,7 @@
         <w:t xml:space="preserve">Though the XHR URL </w:t>
       </w:r>
       <w:r>
-        <w:t>returned the data as a JSON file, the JSON method of the requests library which decodes JSON for it to be used like a dictionary in Python (Requests Documentation, n.d.). From this, the HTML could be accessed with the key of “</w:t>
-      </w:r>
-      <w:proofErr w:type="spellStart"/>
-      <w:r>
-        <w:t>results_html</w:t>
-      </w:r>
-      <w:proofErr w:type="spellEnd"/>
-      <w:r>
-        <w:t xml:space="preserve">” which </w:t>
+        <w:t xml:space="preserve">returned the data as a JSON file, the JSON method of the requests library which decodes JSON for it to be used like a dictionary in Python (Requests Documentation, n.d.). From this, the HTML could be accessed with the key of “results_html” which </w:t>
       </w:r>
       <w:r>
         <w:t xml:space="preserve">finally </w:t>
@@ -7644,51 +7338,14 @@
         <w:t xml:space="preserve"> anchor tags mentioned at the beginning of this section are found using </w:t>
       </w:r>
       <w:r>
-        <w:t xml:space="preserve">Beautiful Soup’s </w:t>
-      </w:r>
-      <w:proofErr w:type="spellStart"/>
-      <w:r>
-        <w:t>find_all</w:t>
-      </w:r>
-      <w:proofErr w:type="spellEnd"/>
-      <w:r>
-        <w:t xml:space="preserve"> method which finds the requested elements</w:t>
-      </w:r>
-      <w:r>
-        <w:t xml:space="preserve"> (</w:t>
-      </w:r>
-      <w:proofErr w:type="spellStart"/>
-      <w:r>
-        <w:t>Tedboy</w:t>
-      </w:r>
-      <w:proofErr w:type="spellEnd"/>
-      <w:r>
-        <w:t xml:space="preserve">, n.d.). In this case, the class attribute is included in the search due to the anchors having the </w:t>
-      </w:r>
-      <w:proofErr w:type="spellStart"/>
-      <w:r>
-        <w:t>classname</w:t>
-      </w:r>
-      <w:proofErr w:type="spellEnd"/>
-      <w:r>
-        <w:t xml:space="preserve"> of </w:t>
-      </w:r>
-      <w:r>
-        <w:t>"</w:t>
-      </w:r>
-      <w:proofErr w:type="spellStart"/>
-      <w:r>
-        <w:t>search_result_row</w:t>
-      </w:r>
-      <w:proofErr w:type="spellEnd"/>
-      <w:r>
-        <w:t xml:space="preserve"> </w:t>
-      </w:r>
-      <w:proofErr w:type="spellStart"/>
-      <w:r>
-        <w:t>ds_collapse_flag</w:t>
-      </w:r>
-      <w:proofErr w:type="spellEnd"/>
+        <w:t>Beautiful Soup’s find_all method which finds the requested elements</w:t>
+      </w:r>
+      <w:r>
+        <w:t xml:space="preserve"> (Tedboy, n.d.). In this case, the class attribute is included in the search due to the anchors having the classname of </w:t>
+      </w:r>
+      <w:r>
+        <w:t>"search_result_row ds_collapse_flag</w:t>
+      </w:r>
       <w:r>
         <w:t xml:space="preserve">”. </w:t>
       </w:r>
@@ -7807,58 +7464,10 @@
     </w:p>
     <w:p>
       <w:r>
-        <w:t>For each game page, a list is created that holds the data that will be collected called “</w:t>
-      </w:r>
-      <w:proofErr w:type="spellStart"/>
-      <w:r>
-        <w:t>current_game_data</w:t>
-      </w:r>
-      <w:proofErr w:type="spellEnd"/>
-      <w:r>
-        <w:t xml:space="preserve">”. Then, for each data point that needs be collected, the program attempts to find where the data is stored in the HTML using HTML </w:t>
-      </w:r>
-      <w:proofErr w:type="spellStart"/>
-      <w:r>
-        <w:t>classnames</w:t>
-      </w:r>
-      <w:proofErr w:type="spellEnd"/>
-      <w:r>
-        <w:t xml:space="preserve"> and looping through the results found and adding them to their own list which is then appended to </w:t>
-      </w:r>
-      <w:proofErr w:type="spellStart"/>
-      <w:r>
-        <w:t>current_game_data</w:t>
-      </w:r>
-      <w:proofErr w:type="spellEnd"/>
-      <w:r>
-        <w:t>. Unless no data is found, in which case “N/A” is appended instead.</w:t>
-      </w:r>
-      <w:r>
-        <w:t xml:space="preserve"> An example of this can be seen in the above image in which the code attempts to find the divider that contains user tags, loops through them if they are found and appends them to </w:t>
-      </w:r>
-      <w:proofErr w:type="spellStart"/>
-      <w:r>
-        <w:t>user_tags</w:t>
-      </w:r>
-      <w:proofErr w:type="spellEnd"/>
-      <w:r>
-        <w:t xml:space="preserve">. </w:t>
-      </w:r>
-      <w:proofErr w:type="spellStart"/>
-      <w:r>
-        <w:t>user_tags</w:t>
-      </w:r>
-      <w:proofErr w:type="spellEnd"/>
-      <w:r>
-        <w:t xml:space="preserve"> is then appended to </w:t>
-      </w:r>
-      <w:proofErr w:type="spellStart"/>
-      <w:r>
-        <w:t>current_game_data</w:t>
-      </w:r>
-      <w:proofErr w:type="spellEnd"/>
-      <w:r>
-        <w:t>.</w:t>
+        <w:t>For each game page, a list is created that holds the data that will be collected called “current_game_data”. Then, for each data point that needs be collected, the program attempts to find where the data is stored in the HTML using HTML classnames and looping through the results found and adding them to their own list which is then appended to current_game_data. Unless no data is found, in which case “N/A” is appended instead.</w:t>
+      </w:r>
+      <w:r>
+        <w:t xml:space="preserve"> An example of this can be seen in the above image in which the code attempts to find the divider that contains user tags, loops through them if they are found and appends them to user_tags. user_tags is then appended to current_game_data.</w:t>
       </w:r>
     </w:p>
     <w:p>
@@ -8162,65 +7771,20 @@
     </w:p>
     <w:p>
       <w:r>
-        <w:t>After experimenting with this scraping program, it was found that Steam does not just sell video games, but it also sells software, hardware and game bundles. Before the data collected is saved, the type is determined by checking the page location found at the top of the page with the class name of “</w:t>
-      </w:r>
-      <w:proofErr w:type="spellStart"/>
-      <w:r>
-        <w:t>blockbg</w:t>
-      </w:r>
-      <w:proofErr w:type="spellEnd"/>
+        <w:t>After experimenting with this scraping program, it was found that Steam does not just sell video games, but it also sells software, hardware and game bundles. Before the data collected is saved, the type is determined by checking the page location found at the top of the page with the class name of “blockbg</w:t>
+      </w:r>
       <w:r>
         <w:t xml:space="preserve">” which contains the type. </w:t>
       </w:r>
     </w:p>
     <w:p>
       <w:r>
-        <w:t xml:space="preserve">After the data has been collected, the </w:t>
-      </w:r>
-      <w:proofErr w:type="spellStart"/>
-      <w:r>
-        <w:t>current_game_data</w:t>
-      </w:r>
-      <w:proofErr w:type="spellEnd"/>
-      <w:r>
-        <w:t xml:space="preserve"> list is appended to the “</w:t>
-      </w:r>
-      <w:proofErr w:type="spellStart"/>
-      <w:r>
-        <w:t>game_data</w:t>
-      </w:r>
-      <w:proofErr w:type="spellEnd"/>
-      <w:r>
-        <w:t xml:space="preserve">” list which contains </w:t>
-      </w:r>
-      <w:proofErr w:type="gramStart"/>
-      <w:r>
-        <w:t>all of</w:t>
-      </w:r>
-      <w:proofErr w:type="gramEnd"/>
-      <w:r>
-        <w:t xml:space="preserve"> the game data collected.</w:t>
-      </w:r>
-    </w:p>
-    <w:p>
-      <w:r>
-        <w:t xml:space="preserve">One thing to note is </w:t>
-      </w:r>
-      <w:proofErr w:type="gramStart"/>
-      <w:r>
-        <w:t>that,</w:t>
-      </w:r>
-      <w:proofErr w:type="gramEnd"/>
-      <w:r>
-        <w:t xml:space="preserve"> the only hardware sold on Steam is Valve’s (the company that runs Steam) own hardware. </w:t>
-      </w:r>
-      <w:proofErr w:type="gramStart"/>
-      <w:r>
-        <w:t>All of</w:t>
-      </w:r>
-      <w:proofErr w:type="gramEnd"/>
-      <w:r>
-        <w:t xml:space="preserve"> this hardware has a completely different page layout with completely different class names. Because of this, all hardware data is N/A apart from the price.</w:t>
+        <w:t>After the data has been collected, the current_game_data list is appended to the “game_data” list which contains all of the game data collected.</w:t>
+      </w:r>
+    </w:p>
+    <w:p>
+      <w:r>
+        <w:t>One thing to note is that, the only hardware sold on Steam is Valve’s (the company that runs Steam) own hardware. All of this hardware has a completely different page layout with completely different class names. Because of this, all hardware data is N/A apart from the price.</w:t>
       </w:r>
     </w:p>
     <w:p>
@@ -8304,23 +7868,7 @@
         <w:t xml:space="preserve">Python’s CSV reader method as part of the CSV library (Python documentation, n.d. - a). One important part to note is that at first, the CSV files contained odd symbols before certain parts such as the prices. </w:t>
       </w:r>
       <w:r>
-        <w:t>It was found that this was because of incorrect encoding causing the wrong characters to be displayed (</w:t>
-      </w:r>
-      <w:proofErr w:type="spellStart"/>
-      <w:r>
-        <w:t>LabEx</w:t>
-      </w:r>
-      <w:proofErr w:type="spellEnd"/>
-      <w:r>
-        <w:t>, n.d.). With research, a page of Python Documentation (</w:t>
-      </w:r>
-      <w:proofErr w:type="spellStart"/>
-      <w:r>
-        <w:t>n.d</w:t>
-      </w:r>
-      <w:proofErr w:type="spellEnd"/>
-      <w:r>
-        <w:t>) titled “Unicode HOWTO”</w:t>
+        <w:t>It was found that this was because of incorrect encoding causing the wrong characters to be displayed (LabEx, n.d.). With research, a page of Python Documentation (n.d) titled “Unicode HOWTO”</w:t>
       </w:r>
       <w:r>
         <w:t xml:space="preserve"> helped to understand some of the encoding types. Through experimentation, it was found that the UFT-8-SIG encoding method prevented encoding errors.</w:t>
@@ -8397,7 +7945,17 @@
       </w:r>
       <w:bookmarkEnd w:id="42"/>
     </w:p>
-    <w:p/>
+    <w:p>
+      <w:r>
+        <w:t xml:space="preserve">With scraping successfully saving the data of ten thousand video games, data analysis could be performed on the collected data. However, before this, the data </w:t>
+      </w:r>
+      <w:r>
+        <w:t>needed to be normalised. Unfortunately, the Pandas library used would not remove NaN and N/A values, so they were removed in Excel.</w:t>
+      </w:r>
+      <w:r>
+        <w:t xml:space="preserve"> </w:t>
+      </w:r>
+    </w:p>
     <w:p>
       <w:r>
         <w:br w:type="page"/>
@@ -8509,15 +8067,7 @@
         <w:t>, Jun</w:t>
       </w:r>
       <w:r>
-        <w:t xml:space="preserve">). Overwhelmed by Choices. American Journal of </w:t>
-      </w:r>
-      <w:proofErr w:type="gramStart"/>
-      <w:r>
-        <w:t>Neuroradiology :</w:t>
-      </w:r>
-      <w:proofErr w:type="gramEnd"/>
-      <w:r>
-        <w:t xml:space="preserve"> AJNR, 34(6), 1111–1112. </w:t>
+        <w:t xml:space="preserve">). Overwhelmed by Choices. American Journal of Neuroradiology : AJNR, 34(6), 1111–1112. </w:t>
       </w:r>
       <w:hyperlink r:id="rId30" w:history="1">
         <w:r>
@@ -8540,31 +8090,7 @@
         </w:numPr>
       </w:pPr>
       <w:r>
-        <w:t xml:space="preserve">Conklin, L., Drake, V., Strittmatter, Sven., </w:t>
-      </w:r>
-      <w:proofErr w:type="spellStart"/>
-      <w:r>
-        <w:t>Braiterman</w:t>
-      </w:r>
-      <w:proofErr w:type="spellEnd"/>
-      <w:r>
-        <w:t xml:space="preserve">, Z., &amp; </w:t>
-      </w:r>
-      <w:proofErr w:type="spellStart"/>
-      <w:r>
-        <w:t>Shostack</w:t>
-      </w:r>
-      <w:proofErr w:type="spellEnd"/>
-      <w:r>
-        <w:t xml:space="preserve">, A. (n.d.). Threat </w:t>
-      </w:r>
-      <w:proofErr w:type="spellStart"/>
-      <w:r>
-        <w:t>Modeling</w:t>
-      </w:r>
-      <w:proofErr w:type="spellEnd"/>
-      <w:r>
-        <w:t xml:space="preserve"> Process</w:t>
+        <w:t>Conklin, L., Drake, V., Strittmatter, Sven., Braiterman, Z., &amp; Shostack, A. (n.d.). Threat Modeling Process</w:t>
       </w:r>
       <w:r>
         <w:t xml:space="preserve">. OWASP. </w:t>
@@ -8772,15 +8298,7 @@
         <w:t xml:space="preserve">Jones, K., &amp; Martin, L. (2016). </w:t>
       </w:r>
       <w:r>
-        <w:t xml:space="preserve">Adapting infinite-scroll with user experience in mind. </w:t>
-      </w:r>
-      <w:proofErr w:type="spellStart"/>
-      <w:r>
-        <w:t>DiVA</w:t>
-      </w:r>
-      <w:proofErr w:type="spellEnd"/>
-      <w:r>
-        <w:t xml:space="preserve">. </w:t>
+        <w:t xml:space="preserve">Adapting infinite-scroll with user experience in mind. DiVA. </w:t>
       </w:r>
       <w:hyperlink r:id="rId39" w:history="1">
         <w:r>
@@ -8802,21 +8320,8 @@
           <w:numId w:val="1"/>
         </w:numPr>
       </w:pPr>
-      <w:proofErr w:type="spellStart"/>
-      <w:r>
-        <w:t>LabEx</w:t>
-      </w:r>
-      <w:proofErr w:type="spellEnd"/>
-      <w:r>
-        <w:t xml:space="preserve">. (n.d.). How to manage CSV file encoding. </w:t>
-      </w:r>
-      <w:proofErr w:type="spellStart"/>
-      <w:r>
-        <w:t>LabEx</w:t>
-      </w:r>
-      <w:proofErr w:type="spellEnd"/>
-      <w:r>
-        <w:t xml:space="preserve">. </w:t>
+      <w:r>
+        <w:t xml:space="preserve">LabEx. (n.d.). How to manage CSV file encoding. LabEx. </w:t>
       </w:r>
       <w:hyperlink r:id="rId40" w:history="1">
         <w:r>
@@ -9059,15 +8564,7 @@
         </w:numPr>
       </w:pPr>
       <w:r>
-        <w:t xml:space="preserve">Pypi. (n.d. -e). </w:t>
-      </w:r>
-      <w:proofErr w:type="spellStart"/>
-      <w:r>
-        <w:t>mysql</w:t>
-      </w:r>
-      <w:proofErr w:type="spellEnd"/>
-      <w:r>
-        <w:t xml:space="preserve">-connector-python 9.3.0. Pypi. </w:t>
+        <w:t xml:space="preserve">Pypi. (n.d. -e). mysql-connector-python 9.3.0. Pypi. </w:t>
       </w:r>
       <w:hyperlink r:id="rId50" w:history="1">
         <w:r>
@@ -9151,15 +8648,7 @@
         </w:numPr>
       </w:pPr>
       <w:r>
-        <w:t xml:space="preserve">Raneri, P., Montag, C., Rozgonjuk, D., Satel, J., &amp; Pontes, H. (2022, June). The role of microtransactions in Internet Gaming Disorder and Gambling Disorder: A preregistered systematic review. Addictive </w:t>
-      </w:r>
-      <w:proofErr w:type="spellStart"/>
-      <w:r>
-        <w:t>Behaviors</w:t>
-      </w:r>
-      <w:proofErr w:type="spellEnd"/>
-      <w:r>
-        <w:t xml:space="preserve"> Reports. 15, 100415. </w:t>
+        <w:t xml:space="preserve">Raneri, P., Montag, C., Rozgonjuk, D., Satel, J., &amp; Pontes, H. (2022, June). The role of microtransactions in Internet Gaming Disorder and Gambling Disorder: A preregistered systematic review. Addictive Behaviors Reports. 15, 100415. </w:t>
       </w:r>
       <w:hyperlink r:id="rId53" w:history="1">
         <w:r>
@@ -9182,15 +8671,7 @@
         </w:numPr>
       </w:pPr>
       <w:r>
-        <w:t xml:space="preserve">Requests Documentation. (n.d.). </w:t>
-      </w:r>
-      <w:proofErr w:type="spellStart"/>
-      <w:r>
-        <w:t>Quickstartn</w:t>
-      </w:r>
-      <w:proofErr w:type="spellEnd"/>
-      <w:r>
-        <w:t xml:space="preserve">. Requests Documentation. </w:t>
+        <w:t xml:space="preserve">Requests Documentation. (n.d.). Quickstartn. Requests Documentation. </w:t>
       </w:r>
       <w:hyperlink r:id="rId54" w:history="1">
         <w:r>
@@ -9326,15 +8807,7 @@
         </w:numPr>
       </w:pPr>
       <w:r>
-        <w:t xml:space="preserve">Steamworks. (n.d.). Steam Direct (Joining </w:t>
-      </w:r>
-      <w:proofErr w:type="gramStart"/>
-      <w:r>
-        <w:t>The</w:t>
-      </w:r>
-      <w:proofErr w:type="gramEnd"/>
-      <w:r>
-        <w:t xml:space="preserve"> Steamworks Distribution Program). Steam. </w:t>
+        <w:t xml:space="preserve">Steamworks. (n.d.). Steam Direct (Joining The Steamworks Distribution Program). Steam. </w:t>
       </w:r>
       <w:hyperlink r:id="rId59" w:history="1">
         <w:r>
@@ -9356,21 +8829,8 @@
           <w:numId w:val="1"/>
         </w:numPr>
       </w:pPr>
-      <w:proofErr w:type="spellStart"/>
-      <w:r>
-        <w:t>Tedboy</w:t>
-      </w:r>
-      <w:proofErr w:type="spellEnd"/>
-      <w:r>
-        <w:t xml:space="preserve">. (n.d.). Beautiful Soup Documentation. </w:t>
-      </w:r>
-      <w:proofErr w:type="spellStart"/>
-      <w:r>
-        <w:t>Github</w:t>
-      </w:r>
-      <w:proofErr w:type="spellEnd"/>
-      <w:r>
-        <w:t xml:space="preserve">. </w:t>
+      <w:r>
+        <w:t xml:space="preserve">Tedboy. (n.d.). Beautiful Soup Documentation. Github. </w:t>
       </w:r>
       <w:hyperlink r:id="rId60" w:history="1">
         <w:r>
@@ -9460,13 +8920,8 @@
         <w:lastRenderedPageBreak/>
         <w:t xml:space="preserve">Zhao, B. (2017). Web Scraping. </w:t>
       </w:r>
-      <w:proofErr w:type="spellStart"/>
-      <w:r>
-        <w:t>Encyclopedia</w:t>
-      </w:r>
-      <w:proofErr w:type="spellEnd"/>
-      <w:r>
-        <w:t xml:space="preserve"> </w:t>
+      <w:r>
+        <w:t xml:space="preserve">Encyclopedia </w:t>
       </w:r>
       <w:r>
         <w:t xml:space="preserve">of Big Data. </w:t>

</xml_diff>

<commit_message>
Games can now be seen on developer and tag pages
</commit_message>
<xml_diff>
--- a/(0) Disertation/Dissertation.docx
+++ b/(0) Disertation/Dissertation.docx
@@ -4595,26 +4595,10 @@
     </w:p>
     <w:p>
       <w:r>
-        <w:t xml:space="preserve">When searching for new video games, it can be hard for uses to find games that they might be interested </w:t>
-      </w:r>
-      <w:proofErr w:type="gramStart"/>
-      <w:r>
-        <w:t>in</w:t>
-      </w:r>
-      <w:proofErr w:type="gramEnd"/>
-      <w:r>
-        <w:t xml:space="preserve"> and it can be hard for businesses to </w:t>
-      </w:r>
-      <w:r>
-        <w:t xml:space="preserve">reach new users. To help with this, using publicly data from the internet, a database could be built that, with a user interface such as a web application, could help users find games they are interested in that are </w:t>
-      </w:r>
-      <w:proofErr w:type="gramStart"/>
-      <w:r>
-        <w:t>similar to</w:t>
-      </w:r>
-      <w:proofErr w:type="gramEnd"/>
-      <w:r>
-        <w:t xml:space="preserve"> ones they already like.</w:t>
+        <w:t xml:space="preserve">When searching for new video games, it can be hard for uses to find games that they might be interested in and it can be hard for businesses to </w:t>
+      </w:r>
+      <w:r>
+        <w:t>reach new users. To help with this, using publicly data from the internet, a database could be built that, with a user interface such as a web application, could help users find games they are interested in that are similar to ones they already like.</w:t>
       </w:r>
       <w:r>
         <w:t xml:space="preserve"> </w:t>
@@ -4626,23 +4610,7 @@
         <w:t xml:space="preserve"> </w:t>
       </w:r>
       <w:r>
-        <w:t xml:space="preserve">project aims to create a web application that </w:t>
-      </w:r>
-      <w:proofErr w:type="gramStart"/>
-      <w:r>
-        <w:t>is able to</w:t>
-      </w:r>
-      <w:proofErr w:type="gramEnd"/>
-      <w:r>
-        <w:t xml:space="preserve"> help users find video games they may be interested in </w:t>
-      </w:r>
-      <w:proofErr w:type="gramStart"/>
-      <w:r>
-        <w:t>through the use of</w:t>
-      </w:r>
-      <w:proofErr w:type="gramEnd"/>
-      <w:r>
-        <w:t xml:space="preserve"> a tagging system. </w:t>
+        <w:t xml:space="preserve">project aims to create a web application that is able to help users find video games they may be interested in through the use of a tagging system. </w:t>
       </w:r>
     </w:p>
     <w:p>
@@ -5088,15 +5056,7 @@
         <w:t xml:space="preserve">also </w:t>
       </w:r>
       <w:r>
-        <w:t xml:space="preserve">potentially </w:t>
-      </w:r>
-      <w:proofErr w:type="gramStart"/>
-      <w:r>
-        <w:t>violating</w:t>
-      </w:r>
-      <w:proofErr w:type="gramEnd"/>
-      <w:r>
-        <w:t xml:space="preserve"> a company’s terms of service (Zhao, 2017). However, Zhao (2017) argues that it is difficult to prove the data’s copyright due to “only a specific section of the data [being] legally protected”, while arguing that terms of service fall into a “gr</w:t>
+        <w:t>potentially violating a company’s terms of service (Zhao, 2017). However, Zhao (2017) argues that it is difficult to prove the data’s copyright due to “only a specific section of the data [being] legally protected”, while arguing that terms of service fall into a “gr</w:t>
       </w:r>
       <w:r>
         <w:t>e</w:t>
@@ -5108,23 +5068,7 @@
         <w:t>scraped</w:t>
       </w:r>
       <w:r>
-        <w:t xml:space="preserve"> in this project should have its source saved and, </w:t>
-      </w:r>
-      <w:proofErr w:type="gramStart"/>
-      <w:r>
-        <w:t>in</w:t>
-      </w:r>
-      <w:proofErr w:type="gramEnd"/>
-      <w:r>
-        <w:t xml:space="preserve"> the website, linked to </w:t>
-      </w:r>
-      <w:proofErr w:type="gramStart"/>
-      <w:r>
-        <w:t>in order to</w:t>
-      </w:r>
-      <w:proofErr w:type="gramEnd"/>
-      <w:r>
-        <w:t xml:space="preserve"> show that the data is from the target website and not from another source.</w:t>
+        <w:t xml:space="preserve"> in this project should have its source saved and, in the website, linked to in order to show that the data is from the target website and not from another source.</w:t>
       </w:r>
     </w:p>
     <w:p>
@@ -5480,15 +5424,7 @@
     </w:p>
     <w:p>
       <w:r>
-        <w:t xml:space="preserve">Once a person creates something, they have copyright over their creation for </w:t>
-      </w:r>
-      <w:proofErr w:type="gramStart"/>
-      <w:r>
-        <w:t>a number of</w:t>
-      </w:r>
-      <w:proofErr w:type="gramEnd"/>
-      <w:r>
-        <w:t xml:space="preserve"> years depending on what kind of creation it is (for example, literary, dramatic, musical or artistic works have a copyright of 70 years, while sound recordings have 50 years instead). This copyright gives the person the right to control how their work is used and allows them to object to distortions of their work due to being identified as the author</w:t>
+        <w:t>Once a person creates something, they have copyright over their creation for a number of years depending on what kind of creation it is (for example, literary, dramatic, musical or artistic works have a copyright of 70 years, while sound recordings have 50 years instead). This copyright gives the person the right to control how their work is used and allows them to object to distortions of their work due to being identified as the author</w:t>
       </w:r>
       <w:r>
         <w:t xml:space="preserve"> (UKCS, n.d.)</w:t>
@@ -6021,18 +5957,10 @@
         <w:t>, it is assumed</w:t>
       </w:r>
       <w:r>
-        <w:t xml:space="preserve"> that each page contains accurate information about </w:t>
-      </w:r>
-      <w:proofErr w:type="gramStart"/>
-      <w:r>
-        <w:t xml:space="preserve">the </w:t>
-      </w:r>
-      <w:r>
-        <w:t>each</w:t>
-      </w:r>
-      <w:proofErr w:type="gramEnd"/>
-      <w:r>
-        <w:t xml:space="preserve"> </w:t>
+        <w:t xml:space="preserve"> that each page contains accurate information about the </w:t>
+      </w:r>
+      <w:r>
+        <w:t xml:space="preserve">each </w:t>
       </w:r>
       <w:r>
         <w:t>video game.</w:t>
@@ -6412,27 +6340,14 @@
       <w:r>
         <w:t xml:space="preserve">Figure </w:t>
       </w:r>
-      <w:r>
-        <w:fldChar w:fldCharType="begin"/>
-      </w:r>
-      <w:r>
-        <w:instrText xml:space="preserve"> SEQ Figure \* ARABIC </w:instrText>
-      </w:r>
-      <w:r>
-        <w:fldChar w:fldCharType="separate"/>
-      </w:r>
-      <w:r>
-        <w:rPr>
-          <w:noProof/>
-        </w:rPr>
-        <w:t>1</w:t>
-      </w:r>
-      <w:r>
-        <w:rPr>
-          <w:noProof/>
-        </w:rPr>
-        <w:fldChar w:fldCharType="end"/>
-      </w:r>
+      <w:fldSimple w:instr=" SEQ Figure \* ARABIC ">
+        <w:r>
+          <w:rPr>
+            <w:noProof/>
+          </w:rPr>
+          <w:t>1</w:t>
+        </w:r>
+      </w:fldSimple>
       <w:r>
         <w:t>: Development Process</w:t>
       </w:r>
@@ -6443,15 +6358,7 @@
         <w:t>The</w:t>
       </w:r>
       <w:r>
-        <w:t xml:space="preserve"> goal of this project is to create a website that allows for users to search for video games </w:t>
-      </w:r>
-      <w:proofErr w:type="gramStart"/>
-      <w:r>
-        <w:t>similar to</w:t>
-      </w:r>
-      <w:proofErr w:type="gramEnd"/>
-      <w:r>
-        <w:t xml:space="preserve"> ones they already like. </w:t>
+        <w:t xml:space="preserve"> goal of this project is to create a website that allows for users to search for video games similar to ones they already like. </w:t>
       </w:r>
       <w:r>
         <w:t>This</w:t>
@@ -6650,27 +6557,14 @@
       <w:r>
         <w:t xml:space="preserve">Figure </w:t>
       </w:r>
-      <w:r>
-        <w:fldChar w:fldCharType="begin"/>
-      </w:r>
-      <w:r>
-        <w:instrText xml:space="preserve"> SEQ Figure \* ARABIC </w:instrText>
-      </w:r>
-      <w:r>
-        <w:fldChar w:fldCharType="separate"/>
-      </w:r>
-      <w:r>
-        <w:rPr>
-          <w:noProof/>
-        </w:rPr>
-        <w:t>2</w:t>
-      </w:r>
-      <w:r>
-        <w:rPr>
-          <w:noProof/>
-        </w:rPr>
-        <w:fldChar w:fldCharType="end"/>
-      </w:r>
+      <w:fldSimple w:instr=" SEQ Figure \* ARABIC ">
+        <w:r>
+          <w:rPr>
+            <w:noProof/>
+          </w:rPr>
+          <w:t>2</w:t>
+        </w:r>
+      </w:fldSimple>
       <w:r>
         <w:t>: Steam's All Products Page</w:t>
       </w:r>
@@ -6816,16 +6710,11 @@
     </w:p>
     <w:p>
       <w:r>
-        <w:t xml:space="preserve">Using Steam’s all games </w:t>
-      </w:r>
-      <w:proofErr w:type="gramStart"/>
-      <w:r>
-        <w:t>page</w:t>
+        <w:t>Using Steam’s all games page</w:t>
       </w:r>
       <w:r>
         <w:t>,</w:t>
       </w:r>
-      <w:proofErr w:type="gramEnd"/>
       <w:r>
         <w:t xml:space="preserve"> the following should be done for each game in the list:</w:t>
       </w:r>
@@ -6875,15 +6764,7 @@
         </w:numPr>
       </w:pPr>
       <w:r>
-        <w:t xml:space="preserve">Return to </w:t>
-      </w:r>
-      <w:proofErr w:type="gramStart"/>
-      <w:r>
-        <w:t>the all</w:t>
-      </w:r>
-      <w:proofErr w:type="gramEnd"/>
-      <w:r>
-        <w:t xml:space="preserve"> game’s page a repeat on the next game.</w:t>
+        <w:t>Return to the all game’s page a repeat on the next game.</w:t>
       </w:r>
     </w:p>
     <w:p>
@@ -7010,27 +6891,14 @@
       <w:r>
         <w:t xml:space="preserve">Figure </w:t>
       </w:r>
-      <w:r>
-        <w:fldChar w:fldCharType="begin"/>
-      </w:r>
-      <w:r>
-        <w:instrText xml:space="preserve"> SEQ Figure \* ARABIC </w:instrText>
-      </w:r>
-      <w:r>
-        <w:fldChar w:fldCharType="separate"/>
-      </w:r>
-      <w:r>
-        <w:rPr>
-          <w:noProof/>
-        </w:rPr>
-        <w:t>3</w:t>
-      </w:r>
-      <w:r>
-        <w:rPr>
-          <w:noProof/>
-        </w:rPr>
-        <w:fldChar w:fldCharType="end"/>
-      </w:r>
+      <w:fldSimple w:instr=" SEQ Figure \* ARABIC ">
+        <w:r>
+          <w:rPr>
+            <w:noProof/>
+          </w:rPr>
+          <w:t>3</w:t>
+        </w:r>
+      </w:fldSimple>
       <w:r>
         <w:t>: Steam Developers and Publishers</w:t>
       </w:r>
@@ -7204,27 +7072,14 @@
       <w:r>
         <w:t xml:space="preserve">Figure </w:t>
       </w:r>
-      <w:r>
-        <w:fldChar w:fldCharType="begin"/>
-      </w:r>
-      <w:r>
-        <w:instrText xml:space="preserve"> SEQ Figure \* ARABIC </w:instrText>
-      </w:r>
-      <w:r>
-        <w:fldChar w:fldCharType="separate"/>
-      </w:r>
-      <w:r>
-        <w:rPr>
-          <w:noProof/>
-        </w:rPr>
-        <w:t>4</w:t>
-      </w:r>
-      <w:r>
-        <w:rPr>
-          <w:noProof/>
-        </w:rPr>
-        <w:fldChar w:fldCharType="end"/>
-      </w:r>
+      <w:fldSimple w:instr=" SEQ Figure \* ARABIC ">
+        <w:r>
+          <w:rPr>
+            <w:noProof/>
+          </w:rPr>
+          <w:t>4</w:t>
+        </w:r>
+      </w:fldSimple>
       <w:r>
         <w:t>: HTML of Game Features</w:t>
       </w:r>
@@ -7474,27 +7329,14 @@
       <w:r>
         <w:t xml:space="preserve">Figure </w:t>
       </w:r>
-      <w:r>
-        <w:fldChar w:fldCharType="begin"/>
-      </w:r>
-      <w:r>
-        <w:instrText xml:space="preserve"> SEQ Figure \* ARABIC </w:instrText>
-      </w:r>
-      <w:r>
-        <w:fldChar w:fldCharType="separate"/>
-      </w:r>
-      <w:r>
-        <w:rPr>
-          <w:noProof/>
-        </w:rPr>
-        <w:t>5</w:t>
-      </w:r>
-      <w:r>
-        <w:rPr>
-          <w:noProof/>
-        </w:rPr>
-        <w:fldChar w:fldCharType="end"/>
-      </w:r>
+      <w:fldSimple w:instr=" SEQ Figure \* ARABIC ">
+        <w:r>
+          <w:rPr>
+            <w:noProof/>
+          </w:rPr>
+          <w:t>5</w:t>
+        </w:r>
+      </w:fldSimple>
       <w:r>
         <w:t>: Database Plan</w:t>
       </w:r>
@@ -7591,27 +7433,14 @@
       <w:r>
         <w:t xml:space="preserve">Figure </w:t>
       </w:r>
-      <w:r>
-        <w:fldChar w:fldCharType="begin"/>
-      </w:r>
-      <w:r>
-        <w:instrText xml:space="preserve"> SEQ Figure \* ARABIC </w:instrText>
-      </w:r>
-      <w:r>
-        <w:fldChar w:fldCharType="separate"/>
-      </w:r>
-      <w:r>
-        <w:rPr>
-          <w:noProof/>
-        </w:rPr>
-        <w:t>6</w:t>
-      </w:r>
-      <w:r>
-        <w:rPr>
-          <w:noProof/>
-        </w:rPr>
-        <w:fldChar w:fldCharType="end"/>
-      </w:r>
+      <w:fldSimple w:instr=" SEQ Figure \* ARABIC ">
+        <w:r>
+          <w:rPr>
+            <w:noProof/>
+          </w:rPr>
+          <w:t>6</w:t>
+        </w:r>
+      </w:fldSimple>
       <w:r>
         <w:t>: Database Plan (Reduced)</w:t>
       </w:r>
@@ -7670,50 +7499,21 @@
         <w:t>For practice, the</w:t>
       </w:r>
       <w:r>
-        <w:t xml:space="preserve"> special “All Pages” wiki page on Wikipedia was used. This page lists </w:t>
-      </w:r>
-      <w:proofErr w:type="gramStart"/>
-      <w:r>
-        <w:t>all of</w:t>
-      </w:r>
-      <w:proofErr w:type="gramEnd"/>
-      <w:r>
-        <w:t xml:space="preserve"> the wikis on the website as links. </w:t>
-      </w:r>
-    </w:p>
-    <w:p>
-      <w:r>
-        <w:t xml:space="preserve">The page that lists </w:t>
-      </w:r>
-      <w:proofErr w:type="gramStart"/>
-      <w:r>
-        <w:t>all of</w:t>
-      </w:r>
-      <w:proofErr w:type="gramEnd"/>
-      <w:r>
-        <w:t xml:space="preserve"> the wikis is split into multiple pages, and on each page is a link to a wiki page. </w:t>
+        <w:t xml:space="preserve"> special “All Pages” wiki page on Wikipedia was used. This page lists all of the wikis on the website as links. </w:t>
+      </w:r>
+    </w:p>
+    <w:p>
+      <w:r>
+        <w:t xml:space="preserve">The page that lists all of the wikis is split into multiple pages, and on each page is a link to a wiki page. </w:t>
       </w:r>
       <w:r>
         <w:t xml:space="preserve">Both </w:t>
       </w:r>
       <w:r>
-        <w:t xml:space="preserve">programs get the HTML and search for a divider element which holds </w:t>
-      </w:r>
-      <w:proofErr w:type="gramStart"/>
-      <w:r>
-        <w:t>all of</w:t>
-      </w:r>
-      <w:proofErr w:type="gramEnd"/>
-      <w:r>
-        <w:t xml:space="preserve"> the links. </w:t>
-      </w:r>
-      <w:proofErr w:type="gramStart"/>
-      <w:r>
-        <w:t>All of</w:t>
-      </w:r>
-      <w:proofErr w:type="gramEnd"/>
-      <w:r>
-        <w:t xml:space="preserve"> the links are then looped through with their HTML being analysed for:</w:t>
+        <w:t xml:space="preserve">programs get the HTML and search for a divider element which holds all of the links. </w:t>
+      </w:r>
+      <w:r>
+        <w:t>All of the links are then looped through with their HTML being analysed for:</w:t>
       </w:r>
     </w:p>
     <w:p>
@@ -7859,27 +7659,14 @@
       <w:r>
         <w:t xml:space="preserve">Figure </w:t>
       </w:r>
-      <w:r>
-        <w:fldChar w:fldCharType="begin"/>
-      </w:r>
-      <w:r>
-        <w:instrText xml:space="preserve"> SEQ Figure \* ARABIC </w:instrText>
-      </w:r>
-      <w:r>
-        <w:fldChar w:fldCharType="separate"/>
-      </w:r>
-      <w:r>
-        <w:rPr>
-          <w:noProof/>
-        </w:rPr>
-        <w:t>7</w:t>
-      </w:r>
-      <w:r>
-        <w:rPr>
-          <w:noProof/>
-        </w:rPr>
-        <w:fldChar w:fldCharType="end"/>
-      </w:r>
+      <w:fldSimple w:instr=" SEQ Figure \* ARABIC ">
+        <w:r>
+          <w:rPr>
+            <w:noProof/>
+          </w:rPr>
+          <w:t>7</w:t>
+        </w:r>
+      </w:fldSimple>
       <w:r>
         <w:t>: Beautiful Soup Scraping Main</w:t>
       </w:r>
@@ -7899,15 +7686,7 @@
         <w:t xml:space="preserve"> returns all instances of the element requested</w:t>
       </w:r>
       <w:r>
-        <w:t xml:space="preserve"> (of which elements with specific classes or ids can be requested with the </w:t>
-      </w:r>
-      <w:proofErr w:type="spellStart"/>
-      <w:r>
-        <w:t>attrs</w:t>
-      </w:r>
-      <w:proofErr w:type="spellEnd"/>
-      <w:r>
-        <w:t xml:space="preserve"> attribute)</w:t>
+        <w:t xml:space="preserve"> (of which elements with specific classes or ids can be requested with the attrs attribute)</w:t>
       </w:r>
       <w:r>
         <w:t xml:space="preserve"> which can then be looped through to handle child elements</w:t>
@@ -7929,7 +7708,7 @@
           <w:noProof/>
         </w:rPr>
         <w:drawing>
-          <wp:inline distT="0" distB="0" distL="0" distR="0" wp14:anchorId="40ABE2E5" wp14:editId="47153206">
+          <wp:inline distT="0" distB="0" distL="0" distR="0" wp14:anchorId="40ABE2E5" wp14:editId="1F3976DB">
             <wp:extent cx="4162425" cy="1246650"/>
             <wp:effectExtent l="38100" t="38100" r="28575" b="29845"/>
             <wp:docPr id="1701288164" name="Picture 2" descr="A computer screen with text on it&#10;&#10;AI-generated content may be incorrect."/>
@@ -7989,27 +7768,14 @@
       <w:r>
         <w:t xml:space="preserve">Figure </w:t>
       </w:r>
-      <w:r>
-        <w:fldChar w:fldCharType="begin"/>
-      </w:r>
-      <w:r>
-        <w:instrText xml:space="preserve"> SEQ Figure \* ARABIC </w:instrText>
-      </w:r>
-      <w:r>
-        <w:fldChar w:fldCharType="separate"/>
-      </w:r>
-      <w:r>
-        <w:rPr>
-          <w:noProof/>
-        </w:rPr>
-        <w:t>8</w:t>
-      </w:r>
-      <w:r>
-        <w:rPr>
-          <w:noProof/>
-        </w:rPr>
-        <w:fldChar w:fldCharType="end"/>
-      </w:r>
+      <w:fldSimple w:instr=" SEQ Figure \* ARABIC ">
+        <w:r>
+          <w:rPr>
+            <w:noProof/>
+          </w:rPr>
+          <w:t>8</w:t>
+        </w:r>
+      </w:fldSimple>
       <w:r>
         <w:t>: Beautiful Soup Scraping Per Page</w:t>
       </w:r>
@@ -8116,27 +7882,14 @@
       <w:r>
         <w:t xml:space="preserve">Figure </w:t>
       </w:r>
-      <w:r>
-        <w:fldChar w:fldCharType="begin"/>
-      </w:r>
-      <w:r>
-        <w:instrText xml:space="preserve"> SEQ Figure \* ARABIC </w:instrText>
-      </w:r>
-      <w:r>
-        <w:fldChar w:fldCharType="separate"/>
-      </w:r>
-      <w:r>
-        <w:rPr>
-          <w:noProof/>
-        </w:rPr>
-        <w:t>9</w:t>
-      </w:r>
-      <w:r>
-        <w:rPr>
-          <w:noProof/>
-        </w:rPr>
-        <w:fldChar w:fldCharType="end"/>
-      </w:r>
+      <w:fldSimple w:instr=" SEQ Figure \* ARABIC ">
+        <w:r>
+          <w:rPr>
+            <w:noProof/>
+          </w:rPr>
+          <w:t>9</w:t>
+        </w:r>
+      </w:fldSimple>
       <w:r>
         <w:t>: Selenium Scraping Main</w:t>
       </w:r>
@@ -8144,15 +7897,7 @@
     </w:p>
     <w:p>
       <w:r>
-        <w:t xml:space="preserve">For the selenium program (using the Firefox web browser), the code is quite </w:t>
-      </w:r>
-      <w:proofErr w:type="gramStart"/>
-      <w:r>
-        <w:t>similar to</w:t>
-      </w:r>
-      <w:proofErr w:type="gramEnd"/>
-      <w:r>
-        <w:t xml:space="preserve"> beautiful soup. Selenium allows for the search of elements through different tag attributes rather than searching for a specific element </w:t>
+        <w:t xml:space="preserve">For the selenium program (using the Firefox web browser), the code is quite similar to beautiful soup. Selenium allows for the search of elements through different tag attributes rather than searching for a specific element </w:t>
       </w:r>
       <w:r>
         <w:t>(Selenium</w:t>
@@ -8319,7 +8064,7 @@
           <w:noProof/>
         </w:rPr>
         <w:drawing>
-          <wp:inline distT="0" distB="0" distL="0" distR="0" wp14:anchorId="5F05F26C" wp14:editId="2B4D146C">
+          <wp:inline distT="0" distB="0" distL="0" distR="0" wp14:anchorId="5F05F26C" wp14:editId="3B6B521A">
             <wp:extent cx="5731510" cy="637540"/>
             <wp:effectExtent l="38100" t="38100" r="40640" b="29210"/>
             <wp:docPr id="1908628895" name="Picture 2"/>
@@ -8457,27 +8202,14 @@
       <w:r>
         <w:t xml:space="preserve">Figure </w:t>
       </w:r>
-      <w:r>
-        <w:fldChar w:fldCharType="begin"/>
-      </w:r>
-      <w:r>
-        <w:instrText xml:space="preserve"> SEQ Figure \* ARABIC </w:instrText>
-      </w:r>
-      <w:r>
-        <w:fldChar w:fldCharType="separate"/>
-      </w:r>
-      <w:r>
-        <w:rPr>
-          <w:noProof/>
-        </w:rPr>
-        <w:t>10</w:t>
-      </w:r>
-      <w:r>
-        <w:rPr>
-          <w:noProof/>
-        </w:rPr>
-        <w:fldChar w:fldCharType="end"/>
-      </w:r>
+      <w:fldSimple w:instr=" SEQ Figure \* ARABIC ">
+        <w:r>
+          <w:rPr>
+            <w:noProof/>
+          </w:rPr>
+          <w:t>10</w:t>
+        </w:r>
+      </w:fldSimple>
       <w:r>
         <w:t>: Per Game HTML</w:t>
       </w:r>
@@ -8574,13 +8306,8 @@
         <w:t>HTML</w:t>
       </w:r>
       <w:r>
-        <w:t xml:space="preserve"> is </w:t>
-      </w:r>
-      <w:proofErr w:type="spellStart"/>
-      <w:r>
-        <w:t>recieved</w:t>
-      </w:r>
-      <w:proofErr w:type="spellEnd"/>
+        <w:t xml:space="preserve"> is recieved</w:t>
+      </w:r>
       <w:r>
         <w:t>, no additional HTML is received</w:t>
       </w:r>
@@ -8741,27 +8468,14 @@
       <w:r>
         <w:t xml:space="preserve">Figure </w:t>
       </w:r>
-      <w:r>
-        <w:fldChar w:fldCharType="begin"/>
-      </w:r>
-      <w:r>
-        <w:instrText xml:space="preserve"> SEQ Figure \* ARABIC </w:instrText>
-      </w:r>
-      <w:r>
-        <w:fldChar w:fldCharType="separate"/>
-      </w:r>
-      <w:r>
-        <w:rPr>
-          <w:noProof/>
-        </w:rPr>
-        <w:t>11</w:t>
-      </w:r>
-      <w:r>
-        <w:rPr>
-          <w:noProof/>
-        </w:rPr>
-        <w:fldChar w:fldCharType="end"/>
-      </w:r>
+      <w:fldSimple w:instr=" SEQ Figure \* ARABIC ">
+        <w:r>
+          <w:rPr>
+            <w:noProof/>
+          </w:rPr>
+          <w:t>11</w:t>
+        </w:r>
+      </w:fldSimple>
       <w:r>
         <w:t>: Steam XHR Requests</w:t>
       </w:r>
@@ -8780,14 +8494,12 @@
       <w:r>
         <w:t xml:space="preserve">for </w:t>
       </w:r>
-      <w:proofErr w:type="spellStart"/>
       <w:r>
         <w:t>XMLHttpRequest</w:t>
       </w:r>
       <w:r>
         <w:t>s</w:t>
       </w:r>
-      <w:proofErr w:type="spellEnd"/>
       <w:r>
         <w:t xml:space="preserve"> (XHR) </w:t>
       </w:r>
@@ -8850,7 +8562,7 @@
           <w:noProof/>
         </w:rPr>
         <w:drawing>
-          <wp:inline distT="0" distB="0" distL="0" distR="0" wp14:anchorId="1F65946C" wp14:editId="2EB6865B">
+          <wp:inline distT="0" distB="0" distL="0" distR="0" wp14:anchorId="1F65946C" wp14:editId="7F820E4B">
             <wp:extent cx="5731510" cy="530860"/>
             <wp:effectExtent l="38100" t="38100" r="40640" b="40640"/>
             <wp:docPr id="1929413245" name="Picture 5"/>
@@ -8906,27 +8618,14 @@
       <w:r>
         <w:t xml:space="preserve">Figure </w:t>
       </w:r>
-      <w:r>
-        <w:fldChar w:fldCharType="begin"/>
-      </w:r>
-      <w:r>
-        <w:instrText xml:space="preserve"> SEQ Figure \* ARABIC </w:instrText>
-      </w:r>
-      <w:r>
-        <w:fldChar w:fldCharType="separate"/>
-      </w:r>
-      <w:r>
-        <w:rPr>
-          <w:noProof/>
-        </w:rPr>
-        <w:t>12</w:t>
-      </w:r>
-      <w:r>
-        <w:rPr>
-          <w:noProof/>
-        </w:rPr>
-        <w:fldChar w:fldCharType="end"/>
-      </w:r>
+      <w:fldSimple w:instr=" SEQ Figure \* ARABIC ">
+        <w:r>
+          <w:rPr>
+            <w:noProof/>
+          </w:rPr>
+          <w:t>12</w:t>
+        </w:r>
+      </w:fldSimple>
       <w:r>
         <w:t>: XHR Returned JSON</w:t>
       </w:r>
@@ -8961,15 +8660,7 @@
         <w:t xml:space="preserve">Though the XHR URL </w:t>
       </w:r>
       <w:r>
-        <w:t>returned the data as a JSON file, the JSON method of the requests library which decodes JSON for it to be used like a dictionary in Python (Requests Documentation, n.d.). From this, the HTML could be accessed with the key of “</w:t>
-      </w:r>
-      <w:proofErr w:type="spellStart"/>
-      <w:r>
-        <w:t>results_html</w:t>
-      </w:r>
-      <w:proofErr w:type="spellEnd"/>
-      <w:r>
-        <w:t xml:space="preserve">” which </w:t>
+        <w:t xml:space="preserve">returned the data as a JSON file, the JSON method of the requests library which decodes JSON for it to be used like a dictionary in Python (Requests Documentation, n.d.). From this, the HTML could be accessed with the key of “results_html” which </w:t>
       </w:r>
       <w:r>
         <w:t xml:space="preserve">finally </w:t>
@@ -9078,52 +8769,23 @@
         <w:t xml:space="preserve"> anchor tags mentioned at the beginning of this section are found using </w:t>
       </w:r>
       <w:r>
-        <w:t xml:space="preserve">Beautiful Soup’s </w:t>
-      </w:r>
-      <w:proofErr w:type="spellStart"/>
-      <w:r>
-        <w:t>find_all</w:t>
-      </w:r>
-      <w:proofErr w:type="spellEnd"/>
+        <w:t xml:space="preserve">Beautiful Soup’s find_all </w:t>
+      </w:r>
+      <w:r>
+        <w:t>method</w:t>
+      </w:r>
+      <w:r>
+        <w:t xml:space="preserve"> (Tedboy, n.d.). In this case, the class attribute is included in the search due to the anchors having the class</w:t>
+      </w:r>
       <w:r>
         <w:t xml:space="preserve"> </w:t>
       </w:r>
       <w:r>
-        <w:t>method</w:t>
-      </w:r>
-      <w:r>
-        <w:t xml:space="preserve"> (</w:t>
-      </w:r>
-      <w:proofErr w:type="spellStart"/>
-      <w:r>
-        <w:t>Tedboy</w:t>
-      </w:r>
-      <w:proofErr w:type="spellEnd"/>
-      <w:r>
-        <w:t>, n.d.). In this case, the class attribute is included in the search due to the anchors having the class</w:t>
-      </w:r>
-      <w:r>
-        <w:t xml:space="preserve"> </w:t>
-      </w:r>
-      <w:r>
         <w:t xml:space="preserve">name of </w:t>
       </w:r>
       <w:r>
-        <w:t>"</w:t>
-      </w:r>
-      <w:proofErr w:type="spellStart"/>
-      <w:r>
-        <w:t>search_result_row</w:t>
-      </w:r>
-      <w:proofErr w:type="spellEnd"/>
-      <w:r>
-        <w:t xml:space="preserve"> </w:t>
-      </w:r>
-      <w:proofErr w:type="spellStart"/>
-      <w:r>
-        <w:t>ds_collapse_flag</w:t>
-      </w:r>
-      <w:proofErr w:type="spellEnd"/>
+        <w:t>"search_result_row ds_collapse_flag</w:t>
+      </w:r>
       <w:r>
         <w:t xml:space="preserve">”. </w:t>
       </w:r>
@@ -9227,27 +8889,14 @@
       <w:r>
         <w:t xml:space="preserve">Figure </w:t>
       </w:r>
-      <w:r>
-        <w:fldChar w:fldCharType="begin"/>
-      </w:r>
-      <w:r>
-        <w:instrText xml:space="preserve"> SEQ Figure \* ARABIC </w:instrText>
-      </w:r>
-      <w:r>
-        <w:fldChar w:fldCharType="separate"/>
-      </w:r>
-      <w:r>
-        <w:rPr>
-          <w:noProof/>
-        </w:rPr>
-        <w:t>13</w:t>
-      </w:r>
-      <w:r>
-        <w:rPr>
-          <w:noProof/>
-        </w:rPr>
-        <w:fldChar w:fldCharType="end"/>
-      </w:r>
+      <w:fldSimple w:instr=" SEQ Figure \* ARABIC ">
+        <w:r>
+          <w:rPr>
+            <w:noProof/>
+          </w:rPr>
+          <w:t>13</w:t>
+        </w:r>
+      </w:fldSimple>
       <w:r>
         <w:t>: Tag Collection</w:t>
       </w:r>
@@ -9255,31 +8904,7 @@
     </w:p>
     <w:p>
       <w:r>
-        <w:t>For each game page, a list is created that holds the data that will be collected called “</w:t>
-      </w:r>
-      <w:proofErr w:type="spellStart"/>
-      <w:r>
-        <w:t>current_game_data</w:t>
-      </w:r>
-      <w:proofErr w:type="spellEnd"/>
-      <w:r>
-        <w:t xml:space="preserve">”. Then, for each data point that needs be collected, the program attempts to find where the data is stored in the HTML using HTML </w:t>
-      </w:r>
-      <w:proofErr w:type="spellStart"/>
-      <w:r>
-        <w:t>classnames</w:t>
-      </w:r>
-      <w:proofErr w:type="spellEnd"/>
-      <w:r>
-        <w:t xml:space="preserve"> and looping through the results found and adding them to their own list which is then appended to </w:t>
-      </w:r>
-      <w:proofErr w:type="spellStart"/>
-      <w:r>
-        <w:t>current_game_data</w:t>
-      </w:r>
-      <w:proofErr w:type="spellEnd"/>
-      <w:r>
-        <w:t>. Unless no data is found, in which case “N/A” is appended instead.</w:t>
+        <w:t>For each game page, a list is created that holds the data that will be collected called “current_game_data”. Then, for each data point that needs be collected, the program attempts to find where the data is stored in the HTML using HTML classnames and looping through the results found and adding them to their own list which is then appended to current_game_data. Unless no data is found, in which case “N/A” is appended instead.</w:t>
       </w:r>
     </w:p>
     <w:p>
@@ -9362,27 +8987,14 @@
       <w:r>
         <w:t xml:space="preserve">Figure </w:t>
       </w:r>
-      <w:r>
-        <w:fldChar w:fldCharType="begin"/>
-      </w:r>
-      <w:r>
-        <w:instrText xml:space="preserve"> SEQ Figure \* ARABIC </w:instrText>
-      </w:r>
-      <w:r>
-        <w:fldChar w:fldCharType="separate"/>
-      </w:r>
-      <w:r>
-        <w:rPr>
-          <w:noProof/>
-        </w:rPr>
-        <w:t>14</w:t>
-      </w:r>
-      <w:r>
-        <w:rPr>
-          <w:noProof/>
-        </w:rPr>
-        <w:fldChar w:fldCharType="end"/>
-      </w:r>
+      <w:fldSimple w:instr=" SEQ Figure \* ARABIC ">
+        <w:r>
+          <w:rPr>
+            <w:noProof/>
+          </w:rPr>
+          <w:t>14</w:t>
+        </w:r>
+      </w:fldSimple>
       <w:r>
         <w:t>: Developer and Publisher Scraping</w:t>
       </w:r>
@@ -9486,27 +9098,14 @@
       <w:r>
         <w:t xml:space="preserve">Figure </w:t>
       </w:r>
-      <w:r>
-        <w:fldChar w:fldCharType="begin"/>
-      </w:r>
-      <w:r>
-        <w:instrText xml:space="preserve"> SEQ Figure \* ARABIC </w:instrText>
-      </w:r>
-      <w:r>
-        <w:fldChar w:fldCharType="separate"/>
-      </w:r>
-      <w:r>
-        <w:rPr>
-          <w:noProof/>
-        </w:rPr>
-        <w:t>15</w:t>
-      </w:r>
-      <w:r>
-        <w:rPr>
-          <w:noProof/>
-        </w:rPr>
-        <w:fldChar w:fldCharType="end"/>
-      </w:r>
+      <w:fldSimple w:instr=" SEQ Figure \* ARABIC ">
+        <w:r>
+          <w:rPr>
+            <w:noProof/>
+          </w:rPr>
+          <w:t>15</w:t>
+        </w:r>
+      </w:fldSimple>
       <w:r>
         <w:t>: Language Collection</w:t>
       </w:r>
@@ -9597,27 +9196,14 @@
       <w:r>
         <w:t xml:space="preserve">Figure </w:t>
       </w:r>
-      <w:r>
-        <w:fldChar w:fldCharType="begin"/>
-      </w:r>
-      <w:r>
-        <w:instrText xml:space="preserve"> SEQ Figure \* ARABIC </w:instrText>
-      </w:r>
-      <w:r>
-        <w:fldChar w:fldCharType="separate"/>
-      </w:r>
-      <w:r>
-        <w:rPr>
-          <w:noProof/>
-        </w:rPr>
-        <w:t>16</w:t>
-      </w:r>
-      <w:r>
-        <w:rPr>
-          <w:noProof/>
-        </w:rPr>
-        <w:fldChar w:fldCharType="end"/>
-      </w:r>
+      <w:fldSimple w:instr=" SEQ Figure \* ARABIC ">
+        <w:r>
+          <w:rPr>
+            <w:noProof/>
+          </w:rPr>
+          <w:t>16</w:t>
+        </w:r>
+      </w:fldSimple>
       <w:r>
         <w:t>: Game Type</w:t>
       </w:r>
@@ -9625,44 +9211,15 @@
     </w:p>
     <w:p>
       <w:r>
-        <w:t>After experimenting with this scraping program, it was found that Steam also sells software, hardware and game bundles. Before the data collected is saved, the type is determined by checking the page location found at the top of the page with the class name of “</w:t>
-      </w:r>
-      <w:proofErr w:type="spellStart"/>
-      <w:r>
-        <w:t>blockbg</w:t>
-      </w:r>
-      <w:proofErr w:type="spellEnd"/>
+        <w:t>After experimenting with this scraping program, it was found that Steam also sells software, hardware and game bundles. Before the data collected is saved, the type is determined by checking the page location found at the top of the page with the class name of “blockbg</w:t>
+      </w:r>
       <w:r>
         <w:t xml:space="preserve">” which contains the type. </w:t>
       </w:r>
     </w:p>
     <w:p>
       <w:r>
-        <w:t xml:space="preserve">After the data has been collected, the </w:t>
-      </w:r>
-      <w:proofErr w:type="spellStart"/>
-      <w:r>
-        <w:t>current_game_data</w:t>
-      </w:r>
-      <w:proofErr w:type="spellEnd"/>
-      <w:r>
-        <w:t xml:space="preserve"> list is appended to the “</w:t>
-      </w:r>
-      <w:proofErr w:type="spellStart"/>
-      <w:r>
-        <w:t>game_data</w:t>
-      </w:r>
-      <w:proofErr w:type="spellEnd"/>
-      <w:r>
-        <w:t xml:space="preserve">” list which contains </w:t>
-      </w:r>
-      <w:proofErr w:type="gramStart"/>
-      <w:r>
-        <w:t>all of</w:t>
-      </w:r>
-      <w:proofErr w:type="gramEnd"/>
-      <w:r>
-        <w:t xml:space="preserve"> the game data collected.</w:t>
+        <w:t>After the data has been collected, the current_game_data list is appended to the “game_data” list which contains all of the game data collected.</w:t>
       </w:r>
     </w:p>
     <w:p>
@@ -9670,15 +9227,7 @@
         <w:t>Note: The</w:t>
       </w:r>
       <w:r>
-        <w:t xml:space="preserve"> only hardware sold on Steam is Valve’s (the company that runs Steam) own hardware. </w:t>
-      </w:r>
-      <w:proofErr w:type="gramStart"/>
-      <w:r>
-        <w:t>All of</w:t>
-      </w:r>
-      <w:proofErr w:type="gramEnd"/>
-      <w:r>
-        <w:t xml:space="preserve"> this hardware has a completely different page layout with completely different class names. Because of this, all hardware data is N/A apart from the price.</w:t>
+        <w:t xml:space="preserve"> only hardware sold on Steam is Valve’s (the company that runs Steam) own hardware. All of this hardware has a completely different page layout with completely different class names. Because of this, all hardware data is N/A apart from the price.</w:t>
       </w:r>
     </w:p>
     <w:p>
@@ -9765,29 +9314,13 @@
         <w:t xml:space="preserve">Python’s CSV reader method as part of the CSV library (Python documentation, n.d. - a). One important part to note is that at first, the CSV files contained odd symbols before certain parts such as the prices. </w:t>
       </w:r>
       <w:r>
-        <w:t>It was found that this was because of incorrect encoding causing the wrong characters to be displayed (</w:t>
-      </w:r>
-      <w:proofErr w:type="spellStart"/>
-      <w:r>
-        <w:t>LabEx</w:t>
-      </w:r>
-      <w:proofErr w:type="spellEnd"/>
-      <w:r>
-        <w:t xml:space="preserve">, n.d.). With research, a page of </w:t>
+        <w:t xml:space="preserve">It was found that this was because of incorrect encoding causing the wrong characters to be displayed (LabEx, n.d.). With research, a page of </w:t>
       </w:r>
       <w:r>
         <w:t xml:space="preserve">the </w:t>
       </w:r>
       <w:r>
-        <w:t>Python Documentation (</w:t>
-      </w:r>
-      <w:proofErr w:type="spellStart"/>
-      <w:r>
-        <w:t>n.d</w:t>
-      </w:r>
-      <w:proofErr w:type="spellEnd"/>
-      <w:r>
-        <w:t>) titled “Unicode HOWTO”</w:t>
+        <w:t>Python Documentation (n.d) titled “Unicode HOWTO”</w:t>
       </w:r>
       <w:r>
         <w:t xml:space="preserve"> helped to understand some of the encoding types. Through experimentation, it was found that the UFT-8-SIG encoding method prevented encoding errors.</w:t>
@@ -9889,11 +9422,9 @@
       <w:r>
         <w:t xml:space="preserve"> normalised. </w:t>
       </w:r>
-      <w:proofErr w:type="gramStart"/>
       <w:r>
         <w:t>Firstly</w:t>
       </w:r>
-      <w:proofErr w:type="gramEnd"/>
       <w:r>
         <w:t xml:space="preserve"> in Python using the Pandas library, to remove brackets from lists and to convert dates to numbers. Then, the data was normalised in Excel to remove N/A values.</w:t>
       </w:r>
@@ -9977,24 +9508,14 @@
       <w:r>
         <w:t xml:space="preserve">Figure </w:t>
       </w:r>
-      <w:r>
-        <w:fldChar w:fldCharType="begin"/>
-      </w:r>
-      <w:r>
-        <w:instrText xml:space="preserve"> SEQ Figure \* ARABIC </w:instrText>
-      </w:r>
-      <w:r>
-        <w:fldChar w:fldCharType="separate"/>
-      </w:r>
-      <w:r>
-        <w:rPr>
-          <w:noProof/>
-        </w:rPr>
-        <w:t>17</w:t>
-      </w:r>
-      <w:r>
-        <w:fldChar w:fldCharType="end"/>
-      </w:r>
+      <w:fldSimple w:instr=" SEQ Figure \* ARABIC ">
+        <w:r>
+          <w:rPr>
+            <w:noProof/>
+          </w:rPr>
+          <w:t>17</w:t>
+        </w:r>
+      </w:fldSimple>
       <w:r>
         <w:t>: Average Price Per Year</w:t>
       </w:r>
@@ -10035,13 +9556,7 @@
         <w:t xml:space="preserve"> which </w:t>
       </w:r>
       <w:r>
-        <w:t>caused an increase in the amount of entertainment consumed by the public (</w:t>
-      </w:r>
-      <w:r>
-        <w:t>Nawaz</w:t>
-      </w:r>
-      <w:r>
-        <w:t xml:space="preserve"> et al, 2024) which </w:t>
+        <w:t xml:space="preserve">caused an increase in the amount of entertainment consumed by the public (Nawaz et al, 2024) which </w:t>
       </w:r>
       <w:r>
         <w:t xml:space="preserve">could have caused an increase in video game prices due to labour shortages caused by COVID-19 that increased other prices, such as food (Mahmood, 2024). </w:t>
@@ -10133,24 +9648,14 @@
       <w:r>
         <w:t xml:space="preserve">Figure </w:t>
       </w:r>
-      <w:r>
-        <w:fldChar w:fldCharType="begin"/>
-      </w:r>
-      <w:r>
-        <w:instrText xml:space="preserve"> SEQ Figure \* ARABIC </w:instrText>
-      </w:r>
-      <w:r>
-        <w:fldChar w:fldCharType="separate"/>
-      </w:r>
-      <w:r>
-        <w:rPr>
-          <w:noProof/>
-        </w:rPr>
-        <w:t>18</w:t>
-      </w:r>
-      <w:r>
-        <w:fldChar w:fldCharType="end"/>
-      </w:r>
+      <w:fldSimple w:instr=" SEQ Figure \* ARABIC ">
+        <w:r>
+          <w:rPr>
+            <w:noProof/>
+          </w:rPr>
+          <w:t>18</w:t>
+        </w:r>
+      </w:fldSimple>
       <w:r>
         <w:t>: Average Price Per Month</w:t>
       </w:r>
@@ -10249,24 +9754,14 @@
       <w:r>
         <w:t xml:space="preserve">Figure </w:t>
       </w:r>
-      <w:r>
-        <w:fldChar w:fldCharType="begin"/>
-      </w:r>
-      <w:r>
-        <w:instrText xml:space="preserve"> SEQ Figure \* ARABIC </w:instrText>
-      </w:r>
-      <w:r>
-        <w:fldChar w:fldCharType="separate"/>
-      </w:r>
-      <w:r>
-        <w:rPr>
-          <w:noProof/>
-        </w:rPr>
-        <w:t>19</w:t>
-      </w:r>
-      <w:r>
-        <w:fldChar w:fldCharType="end"/>
-      </w:r>
+      <w:fldSimple w:instr=" SEQ Figure \* ARABIC ">
+        <w:r>
+          <w:rPr>
+            <w:noProof/>
+          </w:rPr>
+          <w:t>19</w:t>
+        </w:r>
+      </w:fldSimple>
       <w:r>
         <w:t>: Average Game Price Per Developer</w:t>
       </w:r>
@@ -10341,24 +9836,14 @@
       <w:r>
         <w:t xml:space="preserve">Figure </w:t>
       </w:r>
-      <w:r>
-        <w:fldChar w:fldCharType="begin"/>
-      </w:r>
-      <w:r>
-        <w:instrText xml:space="preserve"> SEQ Figure \* ARABIC </w:instrText>
-      </w:r>
-      <w:r>
-        <w:fldChar w:fldCharType="separate"/>
-      </w:r>
-      <w:r>
-        <w:rPr>
-          <w:noProof/>
-        </w:rPr>
-        <w:t>20</w:t>
-      </w:r>
-      <w:r>
-        <w:fldChar w:fldCharType="end"/>
-      </w:r>
+      <w:fldSimple w:instr=" SEQ Figure \* ARABIC ">
+        <w:r>
+          <w:rPr>
+            <w:noProof/>
+          </w:rPr>
+          <w:t>20</w:t>
+        </w:r>
+      </w:fldSimple>
       <w:r>
         <w:t>: Number of Gamers Per Developer</w:t>
       </w:r>
@@ -10369,15 +9854,7 @@
         <w:t xml:space="preserve">Next, developers and publishers were analysed. For developers, it was found </w:t>
       </w:r>
       <w:r>
-        <w:t>the developer with the highest average price was “</w:t>
-      </w:r>
-      <w:proofErr w:type="spellStart"/>
-      <w:r>
-        <w:t>NeoBards</w:t>
-      </w:r>
-      <w:proofErr w:type="spellEnd"/>
-      <w:r>
-        <w:t xml:space="preserve"> Entertainment” with an average price of £69.99. However, (of the scraped data) the highest average price developers only have one or two games. Ubisoft for example, has 124 games which is the most of any developer and their average price is £7.14 (though this is discounting their other studios). </w:t>
+        <w:t xml:space="preserve">the developer with the highest average price was “NeoBards Entertainment” with an average price of £69.99. However, (of the scraped data) the highest average price developers only have one or two games. Ubisoft for example, has 124 games which is the most of any developer and their average price is £7.14 (though this is discounting their other studios). </w:t>
       </w:r>
       <w:r>
         <w:t xml:space="preserve">One common link between expensive developers is that their game(s) are all very new with at least two being released in 2025 and one </w:t>
@@ -10459,24 +9936,14 @@
       <w:r>
         <w:t xml:space="preserve">Figure </w:t>
       </w:r>
-      <w:r>
-        <w:fldChar w:fldCharType="begin"/>
-      </w:r>
-      <w:r>
-        <w:instrText xml:space="preserve"> SEQ Figure \* ARABIC </w:instrText>
-      </w:r>
-      <w:r>
-        <w:fldChar w:fldCharType="separate"/>
-      </w:r>
-      <w:r>
-        <w:rPr>
-          <w:noProof/>
-        </w:rPr>
-        <w:t>21</w:t>
-      </w:r>
-      <w:r>
-        <w:fldChar w:fldCharType="end"/>
-      </w:r>
+      <w:fldSimple w:instr=" SEQ Figure \* ARABIC ">
+        <w:r>
+          <w:rPr>
+            <w:noProof/>
+          </w:rPr>
+          <w:t>21</w:t>
+        </w:r>
+      </w:fldSimple>
       <w:r>
         <w:t>: Average Price Per Publisher</w:t>
       </w:r>
@@ -10551,24 +10018,14 @@
       <w:r>
         <w:t xml:space="preserve">Figure </w:t>
       </w:r>
-      <w:r>
-        <w:fldChar w:fldCharType="begin"/>
-      </w:r>
-      <w:r>
-        <w:instrText xml:space="preserve"> SEQ Figure \* ARABIC </w:instrText>
-      </w:r>
-      <w:r>
-        <w:fldChar w:fldCharType="separate"/>
-      </w:r>
-      <w:r>
-        <w:rPr>
-          <w:noProof/>
-        </w:rPr>
-        <w:t>22</w:t>
-      </w:r>
-      <w:r>
-        <w:fldChar w:fldCharType="end"/>
-      </w:r>
+      <w:fldSimple w:instr=" SEQ Figure \* ARABIC ">
+        <w:r>
+          <w:rPr>
+            <w:noProof/>
+          </w:rPr>
+          <w:t>22</w:t>
+        </w:r>
+      </w:fldSimple>
       <w:r>
         <w:t>: Number of Games Per Publisher</w:t>
       </w:r>
@@ -10597,15 +10054,7 @@
     </w:p>
     <w:p>
       <w:r>
-        <w:t xml:space="preserve">Note: </w:t>
-      </w:r>
-      <w:proofErr w:type="spellStart"/>
-      <w:r>
-        <w:t>YoYo</w:t>
-      </w:r>
-      <w:proofErr w:type="spellEnd"/>
-      <w:r>
-        <w:t xml:space="preserve"> Games is featured on these graphs despite their product being software. This is because Steam strangely deems their software as a “game”</w:t>
+        <w:t>Note: YoYo Games is featured on these graphs despite their product being software. This is because Steam strangely deems their software as a “game”</w:t>
       </w:r>
       <w:r>
         <w:t>, hence why it is not mentioned.</w:t>
@@ -10695,24 +10144,14 @@
       <w:r>
         <w:t xml:space="preserve">Figure </w:t>
       </w:r>
-      <w:r>
-        <w:fldChar w:fldCharType="begin"/>
-      </w:r>
-      <w:r>
-        <w:instrText xml:space="preserve"> SEQ Figure \* ARABIC </w:instrText>
-      </w:r>
-      <w:r>
-        <w:fldChar w:fldCharType="separate"/>
-      </w:r>
-      <w:r>
-        <w:rPr>
-          <w:noProof/>
-        </w:rPr>
-        <w:t>23</w:t>
-      </w:r>
-      <w:r>
-        <w:fldChar w:fldCharType="end"/>
-      </w:r>
+      <w:fldSimple w:instr=" SEQ Figure \* ARABIC ">
+        <w:r>
+          <w:rPr>
+            <w:noProof/>
+          </w:rPr>
+          <w:t>23</w:t>
+        </w:r>
+      </w:fldSimple>
       <w:r>
         <w:t>: Average Game Price Per Genre</w:t>
       </w:r>
@@ -10787,24 +10226,14 @@
       <w:r>
         <w:t xml:space="preserve">Figure </w:t>
       </w:r>
-      <w:r>
-        <w:fldChar w:fldCharType="begin"/>
-      </w:r>
-      <w:r>
-        <w:instrText xml:space="preserve"> SEQ Figure \* ARABIC </w:instrText>
-      </w:r>
-      <w:r>
-        <w:fldChar w:fldCharType="separate"/>
-      </w:r>
-      <w:r>
-        <w:rPr>
-          <w:noProof/>
-        </w:rPr>
-        <w:t>24</w:t>
-      </w:r>
-      <w:r>
-        <w:fldChar w:fldCharType="end"/>
-      </w:r>
+      <w:fldSimple w:instr=" SEQ Figure \* ARABIC ">
+        <w:r>
+          <w:rPr>
+            <w:noProof/>
+          </w:rPr>
+          <w:t>24</w:t>
+        </w:r>
+      </w:fldSimple>
       <w:r>
         <w:t>: Number of Games Per Genre</w:t>
       </w:r>
@@ -10922,24 +10351,14 @@
       <w:r>
         <w:t xml:space="preserve">Figure </w:t>
       </w:r>
-      <w:r>
-        <w:fldChar w:fldCharType="begin"/>
-      </w:r>
-      <w:r>
-        <w:instrText xml:space="preserve"> SEQ Figure \* ARABIC </w:instrText>
-      </w:r>
-      <w:r>
-        <w:fldChar w:fldCharType="separate"/>
-      </w:r>
-      <w:r>
-        <w:rPr>
-          <w:noProof/>
-        </w:rPr>
-        <w:t>25</w:t>
-      </w:r>
-      <w:r>
-        <w:fldChar w:fldCharType="end"/>
-      </w:r>
+      <w:fldSimple w:instr=" SEQ Figure \* ARABIC ">
+        <w:r>
+          <w:rPr>
+            <w:noProof/>
+          </w:rPr>
+          <w:t>25</w:t>
+        </w:r>
+      </w:fldSimple>
       <w:r>
         <w:t>: Average Game Price Per User Tag</w:t>
       </w:r>
@@ -11012,24 +10431,14 @@
       <w:r>
         <w:t xml:space="preserve">Figure </w:t>
       </w:r>
-      <w:r>
-        <w:fldChar w:fldCharType="begin"/>
-      </w:r>
-      <w:r>
-        <w:instrText xml:space="preserve"> SEQ Figure \* ARABIC </w:instrText>
-      </w:r>
-      <w:r>
-        <w:fldChar w:fldCharType="separate"/>
-      </w:r>
-      <w:r>
-        <w:rPr>
-          <w:noProof/>
-        </w:rPr>
-        <w:t>26</w:t>
-      </w:r>
-      <w:r>
-        <w:fldChar w:fldCharType="end"/>
-      </w:r>
+      <w:fldSimple w:instr=" SEQ Figure \* ARABIC ">
+        <w:r>
+          <w:rPr>
+            <w:noProof/>
+          </w:rPr>
+          <w:t>26</w:t>
+        </w:r>
+      </w:fldSimple>
       <w:r>
         <w:t>: Number of Games Per User Tag</w:t>
       </w:r>
@@ -11037,21 +10446,16 @@
     </w:p>
     <w:p>
       <w:r>
-        <w:t>As for user tags, the most expensive seems to be “Musou” games. Allegedly, they are “Hack ‘n’ Slash”</w:t>
+        <w:t>F</w:t>
+      </w:r>
+      <w:r>
+        <w:t>or user tags, the most expensive seems to be “Musou” games. Allegedly, they are “Hack ‘n’ Slash”</w:t>
       </w:r>
       <w:r>
         <w:t xml:space="preserve"> and “Beat ‘Em Up”</w:t>
       </w:r>
       <w:r>
-        <w:t xml:space="preserve"> games </w:t>
-      </w:r>
-      <w:proofErr w:type="gramStart"/>
-      <w:r>
-        <w:t>similar to</w:t>
-      </w:r>
-      <w:proofErr w:type="gramEnd"/>
-      <w:r>
-        <w:t xml:space="preserve"> “Dynasty Warriors” </w:t>
+        <w:t xml:space="preserve"> games similar to “Dynasty Warriors” </w:t>
       </w:r>
       <w:r>
         <w:t xml:space="preserve">(Cruz, 2025) which is supported by looking at the games with this tag. </w:t>
@@ -11150,24 +10554,14 @@
       <w:r>
         <w:t xml:space="preserve">Figure </w:t>
       </w:r>
-      <w:r>
-        <w:fldChar w:fldCharType="begin"/>
-      </w:r>
-      <w:r>
-        <w:instrText xml:space="preserve"> SEQ Figure \* ARABIC </w:instrText>
-      </w:r>
-      <w:r>
-        <w:fldChar w:fldCharType="separate"/>
-      </w:r>
-      <w:r>
-        <w:rPr>
-          <w:noProof/>
-        </w:rPr>
-        <w:t>27</w:t>
-      </w:r>
-      <w:r>
-        <w:fldChar w:fldCharType="end"/>
-      </w:r>
+      <w:fldSimple w:instr=" SEQ Figure \* ARABIC ">
+        <w:r>
+          <w:rPr>
+            <w:noProof/>
+          </w:rPr>
+          <w:t>27</w:t>
+        </w:r>
+      </w:fldSimple>
       <w:r>
         <w:t>: Average Game Price Per Feature</w:t>
       </w:r>
@@ -11240,24 +10634,14 @@
       <w:r>
         <w:t xml:space="preserve">Figure </w:t>
       </w:r>
-      <w:r>
-        <w:fldChar w:fldCharType="begin"/>
-      </w:r>
-      <w:r>
-        <w:instrText xml:space="preserve"> SEQ Figure \* ARABIC </w:instrText>
-      </w:r>
-      <w:r>
-        <w:fldChar w:fldCharType="separate"/>
-      </w:r>
-      <w:r>
-        <w:rPr>
-          <w:noProof/>
-        </w:rPr>
-        <w:t>28</w:t>
-      </w:r>
-      <w:r>
-        <w:fldChar w:fldCharType="end"/>
-      </w:r>
+      <w:fldSimple w:instr=" SEQ Figure \* ARABIC ">
+        <w:r>
+          <w:rPr>
+            <w:noProof/>
+          </w:rPr>
+          <w:t>28</w:t>
+        </w:r>
+      </w:fldSimple>
       <w:r>
         <w:t>: Number of Games Per Feature</w:t>
       </w:r>
@@ -11265,26 +10649,21 @@
     </w:p>
     <w:p>
       <w:r>
-        <w:t xml:space="preserve">Finally for data analysis, the features were analysed. </w:t>
-      </w:r>
-      <w:r>
-        <w:t xml:space="preserve">It was found that HDR available was the most expensive of </w:t>
-      </w:r>
-      <w:proofErr w:type="gramStart"/>
-      <w:r>
-        <w:t>all of</w:t>
-      </w:r>
-      <w:proofErr w:type="gramEnd"/>
-      <w:r>
-        <w:t xml:space="preserve"> the features, but the range of prices for the games that have this feature is quite wide going from £0.44p to £91.99. It seems the reason </w:t>
-      </w:r>
+        <w:t>Finally</w:t>
+      </w:r>
+      <w:r>
+        <w:t xml:space="preserve">, </w:t>
+      </w:r>
+      <w:r>
+        <w:t xml:space="preserve">the features were analysed. </w:t>
+      </w:r>
+      <w:r>
+        <w:t xml:space="preserve">It was found that HDR available was the most expensive of all of the features, but the range of prices for the games that have this feature is quite wide going from £0.44p to £91.99. It seems the reason for this is that the expensive games that have this feature are unreleased or are very recent. </w:t>
+      </w:r>
+    </w:p>
+    <w:p>
       <w:r>
         <w:lastRenderedPageBreak/>
-        <w:t xml:space="preserve">for this is that the expensive games that have this feature are unreleased or are very recent. </w:t>
-      </w:r>
-    </w:p>
-    <w:p>
-      <w:r>
         <w:t>The next most expensive feature is VR which, considering how new VR is, could imply that VR is expensive to develop for.</w:t>
       </w:r>
     </w:p>
@@ -11399,15 +10778,7 @@
         <w:t>, Jun</w:t>
       </w:r>
       <w:r>
-        <w:t xml:space="preserve">). Overwhelmed by Choices. American Journal of </w:t>
-      </w:r>
-      <w:proofErr w:type="gramStart"/>
-      <w:r>
-        <w:t>Neuroradiology :</w:t>
-      </w:r>
-      <w:proofErr w:type="gramEnd"/>
-      <w:r>
-        <w:t xml:space="preserve"> AJNR, 34(6), 1111–1112. </w:t>
+        <w:t xml:space="preserve">). Overwhelmed by Choices. American Journal of Neuroradiology : AJNR, 34(6), 1111–1112. </w:t>
       </w:r>
       <w:hyperlink r:id="rId42" w:history="1">
         <w:r>
@@ -11430,31 +10801,7 @@
         </w:numPr>
       </w:pPr>
       <w:r>
-        <w:t xml:space="preserve">Conklin, L., Drake, V., Strittmatter, Sven., </w:t>
-      </w:r>
-      <w:proofErr w:type="spellStart"/>
-      <w:r>
-        <w:t>Braiterman</w:t>
-      </w:r>
-      <w:proofErr w:type="spellEnd"/>
-      <w:r>
-        <w:t xml:space="preserve">, Z., &amp; </w:t>
-      </w:r>
-      <w:proofErr w:type="spellStart"/>
-      <w:r>
-        <w:t>Shostack</w:t>
-      </w:r>
-      <w:proofErr w:type="spellEnd"/>
-      <w:r>
-        <w:t xml:space="preserve">, A. (n.d.). Threat </w:t>
-      </w:r>
-      <w:proofErr w:type="spellStart"/>
-      <w:r>
-        <w:t>Modeling</w:t>
-      </w:r>
-      <w:proofErr w:type="spellEnd"/>
-      <w:r>
-        <w:t xml:space="preserve"> Process</w:t>
+        <w:t>Conklin, L., Drake, V., Strittmatter, Sven., Braiterman, Z., &amp; Shostack, A. (n.d.). Threat Modeling Process</w:t>
       </w:r>
       <w:r>
         <w:t xml:space="preserve">. OWASP. </w:t>
@@ -11605,15 +10952,7 @@
         <w:t>How ‘Dynasty Warriors’ Created One of Gaming’s Best Action Subgenres</w:t>
       </w:r>
       <w:r>
-        <w:t xml:space="preserve">. </w:t>
-      </w:r>
-      <w:proofErr w:type="spellStart"/>
-      <w:r>
-        <w:t>RollingStone</w:t>
-      </w:r>
-      <w:proofErr w:type="spellEnd"/>
-      <w:r>
-        <w:t xml:space="preserve">. </w:t>
+        <w:t xml:space="preserve">. RollingStone. </w:t>
       </w:r>
       <w:hyperlink r:id="rId48" w:history="1">
         <w:r>
@@ -11708,15 +11047,7 @@
         <w:t xml:space="preserve">Jones, K., &amp; Martin, L. (2016). </w:t>
       </w:r>
       <w:r>
-        <w:t xml:space="preserve">Adapting infinite-scroll with user experience in mind. </w:t>
-      </w:r>
-      <w:proofErr w:type="spellStart"/>
-      <w:r>
-        <w:t>DiVA</w:t>
-      </w:r>
-      <w:proofErr w:type="spellEnd"/>
-      <w:r>
-        <w:t xml:space="preserve">. </w:t>
+        <w:t xml:space="preserve">Adapting infinite-scroll with user experience in mind. DiVA. </w:t>
       </w:r>
       <w:hyperlink r:id="rId52" w:history="1">
         <w:r>
@@ -11738,21 +11069,8 @@
           <w:numId w:val="1"/>
         </w:numPr>
       </w:pPr>
-      <w:proofErr w:type="spellStart"/>
-      <w:r>
-        <w:t>LabEx</w:t>
-      </w:r>
-      <w:proofErr w:type="spellEnd"/>
-      <w:r>
-        <w:t xml:space="preserve">. (n.d.). How to manage CSV file encoding. </w:t>
-      </w:r>
-      <w:proofErr w:type="spellStart"/>
-      <w:r>
-        <w:t>LabEx</w:t>
-      </w:r>
-      <w:proofErr w:type="spellEnd"/>
-      <w:r>
-        <w:t xml:space="preserve">. </w:t>
+      <w:r>
+        <w:t xml:space="preserve">LabEx. (n.d.). How to manage CSV file encoding. LabEx. </w:t>
       </w:r>
       <w:hyperlink r:id="rId53" w:history="1">
         <w:r>
@@ -12053,15 +11371,7 @@
         </w:numPr>
       </w:pPr>
       <w:r>
-        <w:t xml:space="preserve">Pypi. (n.d. -e). </w:t>
-      </w:r>
-      <w:proofErr w:type="spellStart"/>
-      <w:r>
-        <w:t>mysql</w:t>
-      </w:r>
-      <w:proofErr w:type="spellEnd"/>
-      <w:r>
-        <w:t xml:space="preserve">-connector-python 9.3.0. Pypi. </w:t>
+        <w:t xml:space="preserve">Pypi. (n.d. -e). mysql-connector-python 9.3.0. Pypi. </w:t>
       </w:r>
       <w:hyperlink r:id="rId65" w:history="1">
         <w:r>
@@ -12145,15 +11455,7 @@
         </w:numPr>
       </w:pPr>
       <w:r>
-        <w:t xml:space="preserve">Raneri, P., Montag, C., Rozgonjuk, D., Satel, J., &amp; Pontes, H. (2022, June). The role of microtransactions in Internet Gaming Disorder and Gambling Disorder: A preregistered systematic review. Addictive </w:t>
-      </w:r>
-      <w:proofErr w:type="spellStart"/>
-      <w:r>
-        <w:t>Behaviors</w:t>
-      </w:r>
-      <w:proofErr w:type="spellEnd"/>
-      <w:r>
-        <w:t xml:space="preserve"> Reports. 15, 100415. </w:t>
+        <w:t xml:space="preserve">Raneri, P., Montag, C., Rozgonjuk, D., Satel, J., &amp; Pontes, H. (2022, June). The role of microtransactions in Internet Gaming Disorder and Gambling Disorder: A preregistered systematic review. Addictive Behaviors Reports. 15, 100415. </w:t>
       </w:r>
       <w:hyperlink r:id="rId68" w:history="1">
         <w:r>
@@ -12176,15 +11478,7 @@
         </w:numPr>
       </w:pPr>
       <w:r>
-        <w:t xml:space="preserve">Requests Documentation. (n.d.). </w:t>
-      </w:r>
-      <w:proofErr w:type="spellStart"/>
-      <w:r>
-        <w:t>Quickstartn</w:t>
-      </w:r>
-      <w:proofErr w:type="spellEnd"/>
-      <w:r>
-        <w:t xml:space="preserve">. Requests Documentation. </w:t>
+        <w:t xml:space="preserve">Requests Documentation. (n.d.). Quickstartn. Requests Documentation. </w:t>
       </w:r>
       <w:hyperlink r:id="rId69" w:history="1">
         <w:r>
@@ -12321,15 +11615,7 @@
       </w:pPr>
       <w:r>
         <w:lastRenderedPageBreak/>
-        <w:t xml:space="preserve">Steamworks. (n.d.). Steam Direct (Joining </w:t>
-      </w:r>
-      <w:proofErr w:type="gramStart"/>
-      <w:r>
-        <w:t>The</w:t>
-      </w:r>
-      <w:proofErr w:type="gramEnd"/>
-      <w:r>
-        <w:t xml:space="preserve"> Steamworks Distribution Program). Steam. </w:t>
+        <w:t xml:space="preserve">Steamworks. (n.d.). Steam Direct (Joining The Steamworks Distribution Program). Steam. </w:t>
       </w:r>
       <w:hyperlink r:id="rId74" w:history="1">
         <w:r>
@@ -12351,21 +11637,8 @@
           <w:numId w:val="1"/>
         </w:numPr>
       </w:pPr>
-      <w:proofErr w:type="spellStart"/>
-      <w:r>
-        <w:t>Tedboy</w:t>
-      </w:r>
-      <w:proofErr w:type="spellEnd"/>
-      <w:r>
-        <w:t xml:space="preserve">. (n.d.). Beautiful Soup Documentation. </w:t>
-      </w:r>
-      <w:proofErr w:type="spellStart"/>
-      <w:r>
-        <w:t>Github</w:t>
-      </w:r>
-      <w:proofErr w:type="spellEnd"/>
-      <w:r>
-        <w:t xml:space="preserve">. </w:t>
+      <w:r>
+        <w:t xml:space="preserve">Tedboy. (n.d.). Beautiful Soup Documentation. Github. </w:t>
       </w:r>
       <w:hyperlink r:id="rId75" w:history="1">
         <w:r>
@@ -12486,13 +11759,8 @@
       <w:r>
         <w:t xml:space="preserve">Zhao, B. (2017). Web Scraping. </w:t>
       </w:r>
-      <w:proofErr w:type="spellStart"/>
-      <w:r>
-        <w:t>Encyclopedia</w:t>
-      </w:r>
-      <w:proofErr w:type="spellEnd"/>
-      <w:r>
-        <w:t xml:space="preserve"> </w:t>
+      <w:r>
+        <w:t xml:space="preserve">Encyclopedia </w:t>
       </w:r>
       <w:r>
         <w:t xml:space="preserve">of Big Data. </w:t>
@@ -15021,6 +14289,7 @@
   <w:style w:type="character" w:default="1" w:styleId="DefaultParagraphFont">
     <w:name w:val="Default Paragraph Font"/>
     <w:uiPriority w:val="1"/>
+    <w:semiHidden/>
     <w:unhideWhenUsed/>
   </w:style>
   <w:style w:type="table" w:default="1" w:styleId="TableNormal">

</xml_diff>

<commit_message>
Started writing about database in report
</commit_message>
<xml_diff>
--- a/(0) Disertation/Dissertation.docx
+++ b/(0) Disertation/Dissertation.docx
@@ -4595,10 +4595,26 @@
     </w:p>
     <w:p>
       <w:r>
-        <w:t xml:space="preserve">When searching for new video games, it can be hard for uses to find games that they might be interested in and it can be hard for businesses to </w:t>
-      </w:r>
-      <w:r>
-        <w:t>reach new users. To help with this, using publicly data from the internet, a database could be built that, with a user interface such as a web application, could help users find games they are interested in that are similar to ones they already like.</w:t>
+        <w:t xml:space="preserve">When searching for new video games, it can be hard for uses to find games that they might be interested </w:t>
+      </w:r>
+      <w:proofErr w:type="gramStart"/>
+      <w:r>
+        <w:t>in</w:t>
+      </w:r>
+      <w:proofErr w:type="gramEnd"/>
+      <w:r>
+        <w:t xml:space="preserve"> and it can be hard for businesses to </w:t>
+      </w:r>
+      <w:r>
+        <w:t xml:space="preserve">reach new users. To help with this, using publicly data from the internet, a database could be built that, with a user interface such as a web application, could help users find games they are interested in that are </w:t>
+      </w:r>
+      <w:proofErr w:type="gramStart"/>
+      <w:r>
+        <w:t>similar to</w:t>
+      </w:r>
+      <w:proofErr w:type="gramEnd"/>
+      <w:r>
+        <w:t xml:space="preserve"> ones they already like.</w:t>
       </w:r>
       <w:r>
         <w:t xml:space="preserve"> </w:t>
@@ -4610,7 +4626,23 @@
         <w:t xml:space="preserve"> </w:t>
       </w:r>
       <w:r>
-        <w:t xml:space="preserve">project aims to create a web application that is able to help users find video games they may be interested in through the use of a tagging system. </w:t>
+        <w:t xml:space="preserve">project aims to create a web application that </w:t>
+      </w:r>
+      <w:proofErr w:type="gramStart"/>
+      <w:r>
+        <w:t>is able to</w:t>
+      </w:r>
+      <w:proofErr w:type="gramEnd"/>
+      <w:r>
+        <w:t xml:space="preserve"> help users find video games they may be interested in </w:t>
+      </w:r>
+      <w:proofErr w:type="gramStart"/>
+      <w:r>
+        <w:t>through the use of</w:t>
+      </w:r>
+      <w:proofErr w:type="gramEnd"/>
+      <w:r>
+        <w:t xml:space="preserve"> a tagging system. </w:t>
       </w:r>
     </w:p>
     <w:p>
@@ -5056,7 +5088,15 @@
         <w:t xml:space="preserve">also </w:t>
       </w:r>
       <w:r>
-        <w:t>potentially violating a company’s terms of service (Zhao, 2017). However, Zhao (2017) argues that it is difficult to prove the data’s copyright due to “only a specific section of the data [being] legally protected”, while arguing that terms of service fall into a “gr</w:t>
+        <w:t xml:space="preserve">potentially </w:t>
+      </w:r>
+      <w:proofErr w:type="gramStart"/>
+      <w:r>
+        <w:t>violating</w:t>
+      </w:r>
+      <w:proofErr w:type="gramEnd"/>
+      <w:r>
+        <w:t xml:space="preserve"> a company’s terms of service (Zhao, 2017). However, Zhao (2017) argues that it is difficult to prove the data’s copyright due to “only a specific section of the data [being] legally protected”, while arguing that terms of service fall into a “gr</w:t>
       </w:r>
       <w:r>
         <w:t>e</w:t>
@@ -5068,7 +5108,23 @@
         <w:t>scraped</w:t>
       </w:r>
       <w:r>
-        <w:t xml:space="preserve"> in this project should have its source saved and, in the website, linked to in order to show that the data is from the target website and not from another source.</w:t>
+        <w:t xml:space="preserve"> in this project should have its source saved and, </w:t>
+      </w:r>
+      <w:proofErr w:type="gramStart"/>
+      <w:r>
+        <w:t>in</w:t>
+      </w:r>
+      <w:proofErr w:type="gramEnd"/>
+      <w:r>
+        <w:t xml:space="preserve"> the website, linked to </w:t>
+      </w:r>
+      <w:proofErr w:type="gramStart"/>
+      <w:r>
+        <w:t>in order to</w:t>
+      </w:r>
+      <w:proofErr w:type="gramEnd"/>
+      <w:r>
+        <w:t xml:space="preserve"> show that the data is from the target website and not from another source.</w:t>
       </w:r>
     </w:p>
     <w:p>
@@ -5424,7 +5480,15 @@
     </w:p>
     <w:p>
       <w:r>
-        <w:t>Once a person creates something, they have copyright over their creation for a number of years depending on what kind of creation it is (for example, literary, dramatic, musical or artistic works have a copyright of 70 years, while sound recordings have 50 years instead). This copyright gives the person the right to control how their work is used and allows them to object to distortions of their work due to being identified as the author</w:t>
+        <w:t xml:space="preserve">Once a person creates something, they have copyright over their creation for </w:t>
+      </w:r>
+      <w:proofErr w:type="gramStart"/>
+      <w:r>
+        <w:t>a number of</w:t>
+      </w:r>
+      <w:proofErr w:type="gramEnd"/>
+      <w:r>
+        <w:t xml:space="preserve"> years depending on what kind of creation it is (for example, literary, dramatic, musical or artistic works have a copyright of 70 years, while sound recordings have 50 years instead). This copyright gives the person the right to control how their work is used and allows them to object to distortions of their work due to being identified as the author</w:t>
       </w:r>
       <w:r>
         <w:t xml:space="preserve"> (UKCS, n.d.)</w:t>
@@ -5957,10 +6021,18 @@
         <w:t>, it is assumed</w:t>
       </w:r>
       <w:r>
-        <w:t xml:space="preserve"> that each page contains accurate information about the </w:t>
-      </w:r>
-      <w:r>
-        <w:t xml:space="preserve">each </w:t>
+        <w:t xml:space="preserve"> that each page contains accurate information about </w:t>
+      </w:r>
+      <w:proofErr w:type="gramStart"/>
+      <w:r>
+        <w:t xml:space="preserve">the </w:t>
+      </w:r>
+      <w:r>
+        <w:t>each</w:t>
+      </w:r>
+      <w:proofErr w:type="gramEnd"/>
+      <w:r>
+        <w:t xml:space="preserve"> </w:t>
       </w:r>
       <w:r>
         <w:t>video game.</w:t>
@@ -6358,7 +6430,15 @@
         <w:t>The</w:t>
       </w:r>
       <w:r>
-        <w:t xml:space="preserve"> goal of this project is to create a website that allows for users to search for video games similar to ones they already like. </w:t>
+        <w:t xml:space="preserve"> goal of this project is to create a website that allows for users to search for video games </w:t>
+      </w:r>
+      <w:proofErr w:type="gramStart"/>
+      <w:r>
+        <w:t>similar to</w:t>
+      </w:r>
+      <w:proofErr w:type="gramEnd"/>
+      <w:r>
+        <w:t xml:space="preserve"> ones they already like. </w:t>
       </w:r>
       <w:r>
         <w:t>This</w:t>
@@ -6710,7 +6790,15 @@
     </w:p>
     <w:p>
       <w:r>
-        <w:t>Using Steam’s all games page</w:t>
+        <w:t xml:space="preserve">Using </w:t>
+      </w:r>
+      <w:proofErr w:type="gramStart"/>
+      <w:r>
+        <w:t>Steam’s</w:t>
+      </w:r>
+      <w:proofErr w:type="gramEnd"/>
+      <w:r>
+        <w:t xml:space="preserve"> all games page</w:t>
       </w:r>
       <w:r>
         <w:t>,</w:t>
@@ -6764,7 +6852,15 @@
         </w:numPr>
       </w:pPr>
       <w:r>
-        <w:t>Return to the all game’s page a repeat on the next game.</w:t>
+        <w:t xml:space="preserve">Return to </w:t>
+      </w:r>
+      <w:proofErr w:type="gramStart"/>
+      <w:r>
+        <w:t>the all</w:t>
+      </w:r>
+      <w:proofErr w:type="gramEnd"/>
+      <w:r>
+        <w:t xml:space="preserve"> game’s page a repeat on the next game.</w:t>
       </w:r>
     </w:p>
     <w:p>
@@ -7499,21 +7595,50 @@
         <w:t>For practice, the</w:t>
       </w:r>
       <w:r>
-        <w:t xml:space="preserve"> special “All Pages” wiki page on Wikipedia was used. This page lists all of the wikis on the website as links. </w:t>
-      </w:r>
-    </w:p>
-    <w:p>
-      <w:r>
-        <w:t xml:space="preserve">The page that lists all of the wikis is split into multiple pages, and on each page is a link to a wiki page. </w:t>
+        <w:t xml:space="preserve"> special “All Pages” wiki page on Wikipedia was used. This page lists </w:t>
+      </w:r>
+      <w:proofErr w:type="gramStart"/>
+      <w:r>
+        <w:t>all of</w:t>
+      </w:r>
+      <w:proofErr w:type="gramEnd"/>
+      <w:r>
+        <w:t xml:space="preserve"> the wikis on the website as links. </w:t>
+      </w:r>
+    </w:p>
+    <w:p>
+      <w:r>
+        <w:t xml:space="preserve">The page that lists </w:t>
+      </w:r>
+      <w:proofErr w:type="gramStart"/>
+      <w:r>
+        <w:t>all of</w:t>
+      </w:r>
+      <w:proofErr w:type="gramEnd"/>
+      <w:r>
+        <w:t xml:space="preserve"> the wikis is split into multiple pages, and on each page is a link to a wiki page. </w:t>
       </w:r>
       <w:r>
         <w:t xml:space="preserve">Both </w:t>
       </w:r>
       <w:r>
-        <w:t xml:space="preserve">programs get the HTML and search for a divider element which holds all of the links. </w:t>
-      </w:r>
-      <w:r>
-        <w:t>All of the links are then looped through with their HTML being analysed for:</w:t>
+        <w:t xml:space="preserve">programs get the HTML and search for a divider element which holds </w:t>
+      </w:r>
+      <w:proofErr w:type="gramStart"/>
+      <w:r>
+        <w:t>all of</w:t>
+      </w:r>
+      <w:proofErr w:type="gramEnd"/>
+      <w:r>
+        <w:t xml:space="preserve"> the links. </w:t>
+      </w:r>
+      <w:proofErr w:type="gramStart"/>
+      <w:r>
+        <w:t>All of</w:t>
+      </w:r>
+      <w:proofErr w:type="gramEnd"/>
+      <w:r>
+        <w:t xml:space="preserve"> the links are then looped through with their HTML being analysed for:</w:t>
       </w:r>
     </w:p>
     <w:p>
@@ -7686,7 +7811,15 @@
         <w:t xml:space="preserve"> returns all instances of the element requested</w:t>
       </w:r>
       <w:r>
-        <w:t xml:space="preserve"> (of which elements with specific classes or ids can be requested with the attrs attribute)</w:t>
+        <w:t xml:space="preserve"> (of which elements with specific classes or ids can be requested with the </w:t>
+      </w:r>
+      <w:proofErr w:type="spellStart"/>
+      <w:r>
+        <w:t>attrs</w:t>
+      </w:r>
+      <w:proofErr w:type="spellEnd"/>
+      <w:r>
+        <w:t xml:space="preserve"> attribute)</w:t>
       </w:r>
       <w:r>
         <w:t xml:space="preserve"> which can then be looped through to handle child elements</w:t>
@@ -7708,7 +7841,7 @@
           <w:noProof/>
         </w:rPr>
         <w:drawing>
-          <wp:inline distT="0" distB="0" distL="0" distR="0" wp14:anchorId="40ABE2E5" wp14:editId="1F3976DB">
+          <wp:inline distT="0" distB="0" distL="0" distR="0" wp14:anchorId="40ABE2E5" wp14:editId="3F934B27">
             <wp:extent cx="4162425" cy="1246650"/>
             <wp:effectExtent l="38100" t="38100" r="28575" b="29845"/>
             <wp:docPr id="1701288164" name="Picture 2" descr="A computer screen with text on it&#10;&#10;AI-generated content may be incorrect."/>
@@ -7897,7 +8030,15 @@
     </w:p>
     <w:p>
       <w:r>
-        <w:t xml:space="preserve">For the selenium program (using the Firefox web browser), the code is quite similar to beautiful soup. Selenium allows for the search of elements through different tag attributes rather than searching for a specific element </w:t>
+        <w:t xml:space="preserve">For the selenium program (using the Firefox web browser), the code is quite </w:t>
+      </w:r>
+      <w:proofErr w:type="gramStart"/>
+      <w:r>
+        <w:t>similar to</w:t>
+      </w:r>
+      <w:proofErr w:type="gramEnd"/>
+      <w:r>
+        <w:t xml:space="preserve"> beautiful soup. Selenium allows for the search of elements through different tag attributes rather than searching for a specific element </w:t>
       </w:r>
       <w:r>
         <w:t>(Selenium</w:t>
@@ -8064,7 +8205,7 @@
           <w:noProof/>
         </w:rPr>
         <w:drawing>
-          <wp:inline distT="0" distB="0" distL="0" distR="0" wp14:anchorId="5F05F26C" wp14:editId="3B6B521A">
+          <wp:inline distT="0" distB="0" distL="0" distR="0" wp14:anchorId="5F05F26C" wp14:editId="360381B2">
             <wp:extent cx="5731510" cy="637540"/>
             <wp:effectExtent l="38100" t="38100" r="40640" b="29210"/>
             <wp:docPr id="1908628895" name="Picture 2"/>
@@ -8306,8 +8447,13 @@
         <w:t>HTML</w:t>
       </w:r>
       <w:r>
-        <w:t xml:space="preserve"> is recieved</w:t>
-      </w:r>
+        <w:t xml:space="preserve"> is </w:t>
+      </w:r>
+      <w:proofErr w:type="spellStart"/>
+      <w:r>
+        <w:t>recieved</w:t>
+      </w:r>
+      <w:proofErr w:type="spellEnd"/>
       <w:r>
         <w:t>, no additional HTML is received</w:t>
       </w:r>
@@ -8494,12 +8640,14 @@
       <w:r>
         <w:t xml:space="preserve">for </w:t>
       </w:r>
+      <w:proofErr w:type="spellStart"/>
       <w:r>
         <w:t>XMLHttpRequest</w:t>
       </w:r>
       <w:r>
         <w:t>s</w:t>
       </w:r>
+      <w:proofErr w:type="spellEnd"/>
       <w:r>
         <w:t xml:space="preserve"> (XHR) </w:t>
       </w:r>
@@ -8562,7 +8710,7 @@
           <w:noProof/>
         </w:rPr>
         <w:drawing>
-          <wp:inline distT="0" distB="0" distL="0" distR="0" wp14:anchorId="1F65946C" wp14:editId="7F820E4B">
+          <wp:inline distT="0" distB="0" distL="0" distR="0" wp14:anchorId="1F65946C" wp14:editId="1A0E69F4">
             <wp:extent cx="5731510" cy="530860"/>
             <wp:effectExtent l="38100" t="38100" r="40640" b="40640"/>
             <wp:docPr id="1929413245" name="Picture 5"/>
@@ -8660,7 +8808,15 @@
         <w:t xml:space="preserve">Though the XHR URL </w:t>
       </w:r>
       <w:r>
-        <w:t xml:space="preserve">returned the data as a JSON file, the JSON method of the requests library which decodes JSON for it to be used like a dictionary in Python (Requests Documentation, n.d.). From this, the HTML could be accessed with the key of “results_html” which </w:t>
+        <w:t>returned the data as a JSON file, the JSON method of the requests library which decodes JSON for it to be used like a dictionary in Python (Requests Documentation, n.d.). From this, the HTML could be accessed with the key of “</w:t>
+      </w:r>
+      <w:proofErr w:type="spellStart"/>
+      <w:r>
+        <w:t>results_html</w:t>
+      </w:r>
+      <w:proofErr w:type="spellEnd"/>
+      <w:r>
+        <w:t xml:space="preserve">” which </w:t>
       </w:r>
       <w:r>
         <w:t xml:space="preserve">finally </w:t>
@@ -8769,13 +8925,29 @@
         <w:t xml:space="preserve"> anchor tags mentioned at the beginning of this section are found using </w:t>
       </w:r>
       <w:r>
-        <w:t xml:space="preserve">Beautiful Soup’s find_all </w:t>
+        <w:t xml:space="preserve">Beautiful Soup’s </w:t>
+      </w:r>
+      <w:proofErr w:type="spellStart"/>
+      <w:r>
+        <w:t>find_all</w:t>
+      </w:r>
+      <w:proofErr w:type="spellEnd"/>
+      <w:r>
+        <w:t xml:space="preserve"> </w:t>
       </w:r>
       <w:r>
         <w:t>method</w:t>
       </w:r>
       <w:r>
-        <w:t xml:space="preserve"> (Tedboy, n.d.). In this case, the class attribute is included in the search due to the anchors having the class</w:t>
+        <w:t xml:space="preserve"> (</w:t>
+      </w:r>
+      <w:proofErr w:type="spellStart"/>
+      <w:r>
+        <w:t>Tedboy</w:t>
+      </w:r>
+      <w:proofErr w:type="spellEnd"/>
+      <w:r>
+        <w:t>, n.d.). In this case, the class attribute is included in the search due to the anchors having the class</w:t>
       </w:r>
       <w:r>
         <w:t xml:space="preserve"> </w:t>
@@ -8784,8 +8956,21 @@
         <w:t xml:space="preserve">name of </w:t>
       </w:r>
       <w:r>
-        <w:t>"search_result_row ds_collapse_flag</w:t>
-      </w:r>
+        <w:t>"</w:t>
+      </w:r>
+      <w:proofErr w:type="spellStart"/>
+      <w:r>
+        <w:t>search_result_row</w:t>
+      </w:r>
+      <w:proofErr w:type="spellEnd"/>
+      <w:r>
+        <w:t xml:space="preserve"> </w:t>
+      </w:r>
+      <w:proofErr w:type="spellStart"/>
+      <w:r>
+        <w:t>ds_collapse_flag</w:t>
+      </w:r>
+      <w:proofErr w:type="spellEnd"/>
       <w:r>
         <w:t xml:space="preserve">”. </w:t>
       </w:r>
@@ -8904,7 +9089,31 @@
     </w:p>
     <w:p>
       <w:r>
-        <w:t>For each game page, a list is created that holds the data that will be collected called “current_game_data”. Then, for each data point that needs be collected, the program attempts to find where the data is stored in the HTML using HTML classnames and looping through the results found and adding them to their own list which is then appended to current_game_data. Unless no data is found, in which case “N/A” is appended instead.</w:t>
+        <w:t>For each game page, a list is created that holds the data that will be collected called “</w:t>
+      </w:r>
+      <w:proofErr w:type="spellStart"/>
+      <w:r>
+        <w:t>current_game_data</w:t>
+      </w:r>
+      <w:proofErr w:type="spellEnd"/>
+      <w:r>
+        <w:t xml:space="preserve">”. Then, for each data point that needs be collected, the program attempts to find where the data is stored in the HTML using HTML </w:t>
+      </w:r>
+      <w:proofErr w:type="spellStart"/>
+      <w:r>
+        <w:t>classnames</w:t>
+      </w:r>
+      <w:proofErr w:type="spellEnd"/>
+      <w:r>
+        <w:t xml:space="preserve"> and looping through the results found and adding them to their own list which is then appended to </w:t>
+      </w:r>
+      <w:proofErr w:type="spellStart"/>
+      <w:r>
+        <w:t>current_game_data</w:t>
+      </w:r>
+      <w:proofErr w:type="spellEnd"/>
+      <w:r>
+        <w:t>. Unless no data is found, in which case “N/A” is appended instead.</w:t>
       </w:r>
     </w:p>
     <w:p>
@@ -9211,15 +9420,44 @@
     </w:p>
     <w:p>
       <w:r>
-        <w:t>After experimenting with this scraping program, it was found that Steam also sells software, hardware and game bundles. Before the data collected is saved, the type is determined by checking the page location found at the top of the page with the class name of “blockbg</w:t>
-      </w:r>
+        <w:t>After experimenting with this scraping program, it was found that Steam also sells software, hardware and game bundles. Before the data collected is saved, the type is determined by checking the page location found at the top of the page with the class name of “</w:t>
+      </w:r>
+      <w:proofErr w:type="spellStart"/>
+      <w:r>
+        <w:t>blockbg</w:t>
+      </w:r>
+      <w:proofErr w:type="spellEnd"/>
       <w:r>
         <w:t xml:space="preserve">” which contains the type. </w:t>
       </w:r>
     </w:p>
     <w:p>
       <w:r>
-        <w:t>After the data has been collected, the current_game_data list is appended to the “game_data” list which contains all of the game data collected.</w:t>
+        <w:t xml:space="preserve">After the data has been collected, the </w:t>
+      </w:r>
+      <w:proofErr w:type="spellStart"/>
+      <w:r>
+        <w:t>current_game_data</w:t>
+      </w:r>
+      <w:proofErr w:type="spellEnd"/>
+      <w:r>
+        <w:t xml:space="preserve"> list is appended to the “</w:t>
+      </w:r>
+      <w:proofErr w:type="spellStart"/>
+      <w:r>
+        <w:t>game_data</w:t>
+      </w:r>
+      <w:proofErr w:type="spellEnd"/>
+      <w:r>
+        <w:t xml:space="preserve">” list which contains </w:t>
+      </w:r>
+      <w:proofErr w:type="gramStart"/>
+      <w:r>
+        <w:t>all of</w:t>
+      </w:r>
+      <w:proofErr w:type="gramEnd"/>
+      <w:r>
+        <w:t xml:space="preserve"> the game data collected.</w:t>
       </w:r>
     </w:p>
     <w:p>
@@ -9227,7 +9465,15 @@
         <w:t>Note: The</w:t>
       </w:r>
       <w:r>
-        <w:t xml:space="preserve"> only hardware sold on Steam is Valve’s (the company that runs Steam) own hardware. All of this hardware has a completely different page layout with completely different class names. Because of this, all hardware data is N/A apart from the price.</w:t>
+        <w:t xml:space="preserve"> only hardware sold on Steam is Valve’s (the company that runs Steam) own hardware. </w:t>
+      </w:r>
+      <w:proofErr w:type="gramStart"/>
+      <w:r>
+        <w:t>All of</w:t>
+      </w:r>
+      <w:proofErr w:type="gramEnd"/>
+      <w:r>
+        <w:t xml:space="preserve"> this hardware has a completely different page layout with completely different class names. Because of this, all hardware data is N/A apart from the price.</w:t>
       </w:r>
     </w:p>
     <w:p>
@@ -9314,13 +9560,29 @@
         <w:t xml:space="preserve">Python’s CSV reader method as part of the CSV library (Python documentation, n.d. - a). One important part to note is that at first, the CSV files contained odd symbols before certain parts such as the prices. </w:t>
       </w:r>
       <w:r>
-        <w:t xml:space="preserve">It was found that this was because of incorrect encoding causing the wrong characters to be displayed (LabEx, n.d.). With research, a page of </w:t>
+        <w:t>It was found that this was because of incorrect encoding causing the wrong characters to be displayed (</w:t>
+      </w:r>
+      <w:proofErr w:type="spellStart"/>
+      <w:r>
+        <w:t>LabEx</w:t>
+      </w:r>
+      <w:proofErr w:type="spellEnd"/>
+      <w:r>
+        <w:t xml:space="preserve">, n.d.). With research, a page of </w:t>
       </w:r>
       <w:r>
         <w:t xml:space="preserve">the </w:t>
       </w:r>
       <w:r>
-        <w:t>Python Documentation (n.d) titled “Unicode HOWTO”</w:t>
+        <w:t>Python Documentation (</w:t>
+      </w:r>
+      <w:proofErr w:type="spellStart"/>
+      <w:r>
+        <w:t>n.d</w:t>
+      </w:r>
+      <w:proofErr w:type="spellEnd"/>
+      <w:r>
+        <w:t>) titled “Unicode HOWTO”</w:t>
       </w:r>
       <w:r>
         <w:t xml:space="preserve"> helped to understand some of the encoding types. Through experimentation, it was found that the UFT-8-SIG encoding method prevented encoding errors.</w:t>
@@ -9422,9 +9684,11 @@
       <w:r>
         <w:t xml:space="preserve"> normalised. </w:t>
       </w:r>
+      <w:proofErr w:type="gramStart"/>
       <w:r>
         <w:t>Firstly</w:t>
       </w:r>
+      <w:proofErr w:type="gramEnd"/>
       <w:r>
         <w:t xml:space="preserve"> in Python using the Pandas library, to remove brackets from lists and to convert dates to numbers. Then, the data was normalised in Excel to remove N/A values.</w:t>
       </w:r>
@@ -9854,7 +10118,15 @@
         <w:t xml:space="preserve">Next, developers and publishers were analysed. For developers, it was found </w:t>
       </w:r>
       <w:r>
-        <w:t xml:space="preserve">the developer with the highest average price was “NeoBards Entertainment” with an average price of £69.99. However, (of the scraped data) the highest average price developers only have one or two games. Ubisoft for example, has 124 games which is the most of any developer and their average price is £7.14 (though this is discounting their other studios). </w:t>
+        <w:t>the developer with the highest average price was “</w:t>
+      </w:r>
+      <w:proofErr w:type="spellStart"/>
+      <w:r>
+        <w:t>NeoBards</w:t>
+      </w:r>
+      <w:proofErr w:type="spellEnd"/>
+      <w:r>
+        <w:t xml:space="preserve"> Entertainment” with an average price of £69.99. However, (of the scraped data) the highest average price developers only have one or two games. Ubisoft for example, has 124 games which is the most of any developer and their average price is £7.14 (though this is discounting their other studios). </w:t>
       </w:r>
       <w:r>
         <w:t xml:space="preserve">One common link between expensive developers is that their game(s) are all very new with at least two being released in 2025 and one </w:t>
@@ -10054,7 +10326,15 @@
     </w:p>
     <w:p>
       <w:r>
-        <w:t>Note: YoYo Games is featured on these graphs despite their product being software. This is because Steam strangely deems their software as a “game”</w:t>
+        <w:t xml:space="preserve">Note: </w:t>
+      </w:r>
+      <w:proofErr w:type="spellStart"/>
+      <w:r>
+        <w:t>YoYo</w:t>
+      </w:r>
+      <w:proofErr w:type="spellEnd"/>
+      <w:r>
+        <w:t xml:space="preserve"> Games is featured on these graphs despite their product being software. This is because Steam strangely deems their software as a “game”</w:t>
       </w:r>
       <w:r>
         <w:t>, hence why it is not mentioned.</w:t>
@@ -10455,7 +10735,15 @@
         <w:t xml:space="preserve"> and “Beat ‘Em Up”</w:t>
       </w:r>
       <w:r>
-        <w:t xml:space="preserve"> games similar to “Dynasty Warriors” </w:t>
+        <w:t xml:space="preserve"> games </w:t>
+      </w:r>
+      <w:proofErr w:type="gramStart"/>
+      <w:r>
+        <w:t>similar to</w:t>
+      </w:r>
+      <w:proofErr w:type="gramEnd"/>
+      <w:r>
+        <w:t xml:space="preserve"> “Dynasty Warriors” </w:t>
       </w:r>
       <w:r>
         <w:t xml:space="preserve">(Cruz, 2025) which is supported by looking at the games with this tag. </w:t>
@@ -10658,7 +10946,15 @@
         <w:t xml:space="preserve">the features were analysed. </w:t>
       </w:r>
       <w:r>
-        <w:t xml:space="preserve">It was found that HDR available was the most expensive of all of the features, but the range of prices for the games that have this feature is quite wide going from £0.44p to £91.99. It seems the reason for this is that the expensive games that have this feature are unreleased or are very recent. </w:t>
+        <w:t xml:space="preserve">It was found that HDR available was the most expensive of </w:t>
+      </w:r>
+      <w:proofErr w:type="gramStart"/>
+      <w:r>
+        <w:t>all of</w:t>
+      </w:r>
+      <w:proofErr w:type="gramEnd"/>
+      <w:r>
+        <w:t xml:space="preserve"> the features, but the range of prices for the games that have this feature is quite wide going from £0.44p to £91.99. It seems the reason for this is that the expensive games that have this feature are unreleased or are very recent. </w:t>
       </w:r>
     </w:p>
     <w:p>
@@ -10683,7 +10979,405 @@
       </w:r>
       <w:bookmarkEnd w:id="59"/>
     </w:p>
-    <w:p/>
+    <w:p>
+      <w:pPr>
+        <w:keepNext/>
+        <w:jc w:val="center"/>
+      </w:pPr>
+      <w:r>
+        <w:rPr>
+          <w:noProof/>
+        </w:rPr>
+        <w:drawing>
+          <wp:inline distT="0" distB="0" distL="0" distR="0" wp14:anchorId="222B98B1" wp14:editId="11B64E17">
+            <wp:extent cx="4524375" cy="1633593"/>
+            <wp:effectExtent l="38100" t="38100" r="28575" b="43180"/>
+            <wp:docPr id="1276531658" name="Picture 1" descr="A screenshot of a computer program&#10;&#10;AI-generated content may be incorrect."/>
+            <wp:cNvGraphicFramePr>
+              <a:graphicFrameLocks xmlns:a="http://schemas.openxmlformats.org/drawingml/2006/main" noChangeAspect="1"/>
+            </wp:cNvGraphicFramePr>
+            <a:graphic xmlns:a="http://schemas.openxmlformats.org/drawingml/2006/main">
+              <a:graphicData uri="http://schemas.openxmlformats.org/drawingml/2006/picture">
+                <pic:pic xmlns:pic="http://schemas.openxmlformats.org/drawingml/2006/picture">
+                  <pic:nvPicPr>
+                    <pic:cNvPr id="1276531658" name="Picture 1" descr="A screenshot of a computer program&#10;&#10;AI-generated content may be incorrect."/>
+                    <pic:cNvPicPr>
+                      <a:picLocks noChangeAspect="1" noChangeArrowheads="1"/>
+                    </pic:cNvPicPr>
+                  </pic:nvPicPr>
+                  <pic:blipFill>
+                    <a:blip r:embed="rId41">
+                      <a:extLst>
+                        <a:ext uri="{28A0092B-C50C-407E-A947-70E740481C1C}">
+                          <a14:useLocalDpi xmlns:a14="http://schemas.microsoft.com/office/drawing/2010/main" val="0"/>
+                        </a:ext>
+                      </a:extLst>
+                    </a:blip>
+                    <a:srcRect/>
+                    <a:stretch>
+                      <a:fillRect/>
+                    </a:stretch>
+                  </pic:blipFill>
+                  <pic:spPr bwMode="auto">
+                    <a:xfrm>
+                      <a:off x="0" y="0"/>
+                      <a:ext cx="4545617" cy="1641263"/>
+                    </a:xfrm>
+                    <a:prstGeom prst="rect">
+                      <a:avLst/>
+                    </a:prstGeom>
+                    <a:noFill/>
+                    <a:ln w="38100">
+                      <a:solidFill>
+                        <a:schemeClr val="accent4"/>
+                      </a:solidFill>
+                    </a:ln>
+                  </pic:spPr>
+                </pic:pic>
+              </a:graphicData>
+            </a:graphic>
+          </wp:inline>
+        </w:drawing>
+      </w:r>
+    </w:p>
+    <w:p>
+      <w:pPr>
+        <w:pStyle w:val="Caption"/>
+        <w:jc w:val="center"/>
+      </w:pPr>
+      <w:r>
+        <w:t xml:space="preserve">Figure </w:t>
+      </w:r>
+      <w:fldSimple w:instr=" SEQ Figure \* ARABIC ">
+        <w:r>
+          <w:rPr>
+            <w:noProof/>
+          </w:rPr>
+          <w:t>29</w:t>
+        </w:r>
+      </w:fldSimple>
+      <w:r>
+        <w:t>: Games Table</w:t>
+      </w:r>
+    </w:p>
+    <w:p>
+      <w:pPr>
+        <w:keepNext/>
+        <w:jc w:val="center"/>
+      </w:pPr>
+      <w:r>
+        <w:rPr>
+          <w:noProof/>
+        </w:rPr>
+        <w:drawing>
+          <wp:inline distT="0" distB="0" distL="0" distR="0" wp14:anchorId="17546002" wp14:editId="6C23A896">
+            <wp:extent cx="4181475" cy="1816998"/>
+            <wp:effectExtent l="38100" t="38100" r="28575" b="31115"/>
+            <wp:docPr id="1576260093" name="Picture 2" descr="A screen shot of a computer program&#10;&#10;AI-generated content may be incorrect."/>
+            <wp:cNvGraphicFramePr>
+              <a:graphicFrameLocks xmlns:a="http://schemas.openxmlformats.org/drawingml/2006/main" noChangeAspect="1"/>
+            </wp:cNvGraphicFramePr>
+            <a:graphic xmlns:a="http://schemas.openxmlformats.org/drawingml/2006/main">
+              <a:graphicData uri="http://schemas.openxmlformats.org/drawingml/2006/picture">
+                <pic:pic xmlns:pic="http://schemas.openxmlformats.org/drawingml/2006/picture">
+                  <pic:nvPicPr>
+                    <pic:cNvPr id="1576260093" name="Picture 2" descr="A screen shot of a computer program&#10;&#10;AI-generated content may be incorrect."/>
+                    <pic:cNvPicPr>
+                      <a:picLocks noChangeAspect="1" noChangeArrowheads="1"/>
+                    </pic:cNvPicPr>
+                  </pic:nvPicPr>
+                  <pic:blipFill>
+                    <a:blip r:embed="rId42">
+                      <a:extLst>
+                        <a:ext uri="{28A0092B-C50C-407E-A947-70E740481C1C}">
+                          <a14:useLocalDpi xmlns:a14="http://schemas.microsoft.com/office/drawing/2010/main" val="0"/>
+                        </a:ext>
+                      </a:extLst>
+                    </a:blip>
+                    <a:srcRect/>
+                    <a:stretch>
+                      <a:fillRect/>
+                    </a:stretch>
+                  </pic:blipFill>
+                  <pic:spPr bwMode="auto">
+                    <a:xfrm>
+                      <a:off x="0" y="0"/>
+                      <a:ext cx="4198275" cy="1824298"/>
+                    </a:xfrm>
+                    <a:prstGeom prst="rect">
+                      <a:avLst/>
+                    </a:prstGeom>
+                    <a:noFill/>
+                    <a:ln w="38100">
+                      <a:solidFill>
+                        <a:schemeClr val="accent4"/>
+                      </a:solidFill>
+                    </a:ln>
+                  </pic:spPr>
+                </pic:pic>
+              </a:graphicData>
+            </a:graphic>
+          </wp:inline>
+        </w:drawing>
+      </w:r>
+    </w:p>
+    <w:p>
+      <w:pPr>
+        <w:pStyle w:val="Caption"/>
+        <w:jc w:val="center"/>
+      </w:pPr>
+      <w:r>
+        <w:t xml:space="preserve">Figure </w:t>
+      </w:r>
+      <w:fldSimple w:instr=" SEQ Figure \* ARABIC ">
+        <w:r>
+          <w:rPr>
+            <w:noProof/>
+          </w:rPr>
+          <w:t>30</w:t>
+        </w:r>
+      </w:fldSimple>
+      <w:r>
+        <w:t>: Developers Table</w:t>
+      </w:r>
+    </w:p>
+    <w:p>
+      <w:pPr>
+        <w:keepNext/>
+        <w:jc w:val="center"/>
+      </w:pPr>
+      <w:r>
+        <w:rPr>
+          <w:noProof/>
+        </w:rPr>
+        <w:drawing>
+          <wp:inline distT="0" distB="0" distL="0" distR="0" wp14:anchorId="791141A5" wp14:editId="21533350">
+            <wp:extent cx="3362325" cy="1752600"/>
+            <wp:effectExtent l="38100" t="38100" r="47625" b="38100"/>
+            <wp:docPr id="1624777207" name="Picture 3" descr="A computer screen shot of a computer code&#10;&#10;AI-generated content may be incorrect."/>
+            <wp:cNvGraphicFramePr>
+              <a:graphicFrameLocks xmlns:a="http://schemas.openxmlformats.org/drawingml/2006/main" noChangeAspect="1"/>
+            </wp:cNvGraphicFramePr>
+            <a:graphic xmlns:a="http://schemas.openxmlformats.org/drawingml/2006/main">
+              <a:graphicData uri="http://schemas.openxmlformats.org/drawingml/2006/picture">
+                <pic:pic xmlns:pic="http://schemas.openxmlformats.org/drawingml/2006/picture">
+                  <pic:nvPicPr>
+                    <pic:cNvPr id="1624777207" name="Picture 3" descr="A computer screen shot of a computer code&#10;&#10;AI-generated content may be incorrect."/>
+                    <pic:cNvPicPr>
+                      <a:picLocks noChangeAspect="1" noChangeArrowheads="1"/>
+                    </pic:cNvPicPr>
+                  </pic:nvPicPr>
+                  <pic:blipFill>
+                    <a:blip r:embed="rId43">
+                      <a:extLst>
+                        <a:ext uri="{28A0092B-C50C-407E-A947-70E740481C1C}">
+                          <a14:useLocalDpi xmlns:a14="http://schemas.microsoft.com/office/drawing/2010/main" val="0"/>
+                        </a:ext>
+                      </a:extLst>
+                    </a:blip>
+                    <a:srcRect/>
+                    <a:stretch>
+                      <a:fillRect/>
+                    </a:stretch>
+                  </pic:blipFill>
+                  <pic:spPr bwMode="auto">
+                    <a:xfrm>
+                      <a:off x="0" y="0"/>
+                      <a:ext cx="3362325" cy="1752600"/>
+                    </a:xfrm>
+                    <a:prstGeom prst="rect">
+                      <a:avLst/>
+                    </a:prstGeom>
+                    <a:noFill/>
+                    <a:ln w="38100">
+                      <a:solidFill>
+                        <a:schemeClr val="accent4"/>
+                      </a:solidFill>
+                    </a:ln>
+                  </pic:spPr>
+                </pic:pic>
+              </a:graphicData>
+            </a:graphic>
+          </wp:inline>
+        </w:drawing>
+      </w:r>
+    </w:p>
+    <w:p>
+      <w:pPr>
+        <w:pStyle w:val="Caption"/>
+        <w:jc w:val="center"/>
+      </w:pPr>
+      <w:r>
+        <w:t xml:space="preserve">Figure </w:t>
+      </w:r>
+      <w:fldSimple w:instr=" SEQ Figure \* ARABIC ">
+        <w:r>
+          <w:rPr>
+            <w:noProof/>
+          </w:rPr>
+          <w:t>31</w:t>
+        </w:r>
+      </w:fldSimple>
+      <w:r>
+        <w:t>: Tags Table</w:t>
+      </w:r>
+    </w:p>
+    <w:p>
+      <w:proofErr w:type="gramStart"/>
+      <w:r>
+        <w:t>All of</w:t>
+      </w:r>
+      <w:proofErr w:type="gramEnd"/>
+      <w:r>
+        <w:t xml:space="preserve"> the tables were implemented and can be viewed when exploring the database, however, only four of them are used by the website with those being the above three and the </w:t>
+      </w:r>
+      <w:proofErr w:type="gramStart"/>
+      <w:r>
+        <w:t>users</w:t>
+      </w:r>
+      <w:proofErr w:type="gramEnd"/>
+      <w:r>
+        <w:t xml:space="preserve"> table. The database works well and </w:t>
+      </w:r>
+      <w:proofErr w:type="gramStart"/>
+      <w:r>
+        <w:t>is able to</w:t>
+      </w:r>
+      <w:proofErr w:type="gramEnd"/>
+      <w:r>
+        <w:t xml:space="preserve"> store game data in the way that was planned, though there were some modifications to the database such as adding the ability for inputted data (such as a new game) to be denied</w:t>
+      </w:r>
+      <w:r>
+        <w:t>.</w:t>
+      </w:r>
+    </w:p>
+    <w:p>
+      <w:r>
+        <w:t>(Continued…)</w:t>
+      </w:r>
+    </w:p>
+    <w:p>
+      <w:r>
+        <w:br w:type="page"/>
+      </w:r>
+    </w:p>
+    <w:p>
+      <w:pPr>
+        <w:jc w:val="center"/>
+      </w:pPr>
+      <w:r>
+        <w:rPr>
+          <w:noProof/>
+        </w:rPr>
+        <w:lastRenderedPageBreak/>
+        <w:drawing>
+          <wp:inline distT="0" distB="0" distL="0" distR="0" wp14:anchorId="67CBF42A" wp14:editId="53610CC2">
+            <wp:extent cx="4014436" cy="3000375"/>
+            <wp:effectExtent l="57150" t="57150" r="62865" b="47625"/>
+            <wp:docPr id="1513805016" name="Picture 1" descr="A computer screen shot of text&#10;&#10;AI-generated content may be incorrect."/>
+            <wp:cNvGraphicFramePr>
+              <a:graphicFrameLocks xmlns:a="http://schemas.openxmlformats.org/drawingml/2006/main" noChangeAspect="1"/>
+            </wp:cNvGraphicFramePr>
+            <a:graphic xmlns:a="http://schemas.openxmlformats.org/drawingml/2006/main">
+              <a:graphicData uri="http://schemas.openxmlformats.org/drawingml/2006/picture">
+                <pic:pic xmlns:pic="http://schemas.openxmlformats.org/drawingml/2006/picture">
+                  <pic:nvPicPr>
+                    <pic:cNvPr id="1513805016" name="Picture 1" descr="A computer screen shot of text&#10;&#10;AI-generated content may be incorrect."/>
+                    <pic:cNvPicPr/>
+                  </pic:nvPicPr>
+                  <pic:blipFill>
+                    <a:blip r:embed="rId44">
+                      <a:extLst>
+                        <a:ext uri="{28A0092B-C50C-407E-A947-70E740481C1C}">
+                          <a14:useLocalDpi xmlns:a14="http://schemas.microsoft.com/office/drawing/2010/main" val="0"/>
+                        </a:ext>
+                      </a:extLst>
+                    </a:blip>
+                    <a:stretch>
+                      <a:fillRect/>
+                    </a:stretch>
+                  </pic:blipFill>
+                  <pic:spPr>
+                    <a:xfrm>
+                      <a:off x="0" y="0"/>
+                      <a:ext cx="4018438" cy="3003366"/>
+                    </a:xfrm>
+                    <a:prstGeom prst="rect">
+                      <a:avLst/>
+                    </a:prstGeom>
+                    <a:ln w="57150">
+                      <a:solidFill>
+                        <a:schemeClr val="accent4"/>
+                      </a:solidFill>
+                    </a:ln>
+                  </pic:spPr>
+                </pic:pic>
+              </a:graphicData>
+            </a:graphic>
+          </wp:inline>
+        </w:drawing>
+      </w:r>
+    </w:p>
+    <w:p>
+      <w:r>
+        <w:t xml:space="preserve">The database was communicated with through four files (named database handlers) which handled users, administrator commands, table links and more general requests such as retrieving game information. </w:t>
+      </w:r>
+      <w:proofErr w:type="gramStart"/>
+      <w:r>
+        <w:t>All of</w:t>
+      </w:r>
+      <w:proofErr w:type="gramEnd"/>
+      <w:r>
+        <w:t xml:space="preserve"> these files contain functions that follow the pattern seen in the above image, that is: Connect to the database, </w:t>
+      </w:r>
+      <w:r>
+        <w:t>execute SQL commands, close the connection and then return any data.</w:t>
+      </w:r>
+    </w:p>
+    <w:p>
+      <w:r>
+        <w:t>Talk about the command that gets games from searched tags (</w:t>
+      </w:r>
+      <w:proofErr w:type="spellStart"/>
+      <w:r>
+        <w:t>game_get_selection</w:t>
+      </w:r>
+      <w:proofErr w:type="spellEnd"/>
+      <w:r>
+        <w:t>)</w:t>
+      </w:r>
+    </w:p>
+    <w:p>
+      <w:r>
+        <w:t>Then talk about the CSV data loader and how bad that is.</w:t>
+      </w:r>
+    </w:p>
+    <w:p>
+      <w:proofErr w:type="gramStart"/>
+      <w:r>
+        <w:t>How’s</w:t>
+      </w:r>
+      <w:proofErr w:type="gramEnd"/>
+      <w:r>
+        <w:t xml:space="preserve"> a third sound to you by the way? Because </w:t>
+      </w:r>
+      <w:proofErr w:type="gramStart"/>
+      <w:r>
+        <w:t>that’s</w:t>
+      </w:r>
+      <w:proofErr w:type="gramEnd"/>
+      <w:r>
+        <w:t xml:space="preserve"> honestly the best </w:t>
+      </w:r>
+      <w:proofErr w:type="gramStart"/>
+      <w:r>
+        <w:t>you’re</w:t>
+      </w:r>
+      <w:proofErr w:type="gramEnd"/>
+      <w:r>
+        <w:t xml:space="preserve"> getting if you even pass.</w:t>
+      </w:r>
+    </w:p>
     <w:p>
       <w:r>
         <w:br w:type="page"/>
@@ -10751,7 +11445,7 @@
       <w:r>
         <w:t xml:space="preserve">. Beautiful Soup. </w:t>
       </w:r>
-      <w:hyperlink r:id="rId41" w:history="1">
+      <w:hyperlink r:id="rId45" w:history="1">
         <w:r>
           <w:rPr>
             <w:rStyle w:val="Hyperlink"/>
@@ -10778,9 +11472,17 @@
         <w:t>, Jun</w:t>
       </w:r>
       <w:r>
-        <w:t xml:space="preserve">). Overwhelmed by Choices. American Journal of Neuroradiology : AJNR, 34(6), 1111–1112. </w:t>
-      </w:r>
-      <w:hyperlink r:id="rId42" w:history="1">
+        <w:t xml:space="preserve">). Overwhelmed by Choices. American Journal of </w:t>
+      </w:r>
+      <w:proofErr w:type="gramStart"/>
+      <w:r>
+        <w:t>Neuroradiology :</w:t>
+      </w:r>
+      <w:proofErr w:type="gramEnd"/>
+      <w:r>
+        <w:t xml:space="preserve"> AJNR, 34(6), 1111–1112. </w:t>
+      </w:r>
+      <w:hyperlink r:id="rId46" w:history="1">
         <w:r>
           <w:rPr>
             <w:rStyle w:val="Hyperlink"/>
@@ -10801,12 +11503,36 @@
         </w:numPr>
       </w:pPr>
       <w:r>
-        <w:t>Conklin, L., Drake, V., Strittmatter, Sven., Braiterman, Z., &amp; Shostack, A. (n.d.). Threat Modeling Process</w:t>
+        <w:t xml:space="preserve">Conklin, L., Drake, V., Strittmatter, Sven., </w:t>
+      </w:r>
+      <w:proofErr w:type="spellStart"/>
+      <w:r>
+        <w:t>Braiterman</w:t>
+      </w:r>
+      <w:proofErr w:type="spellEnd"/>
+      <w:r>
+        <w:t xml:space="preserve">, Z., &amp; </w:t>
+      </w:r>
+      <w:proofErr w:type="spellStart"/>
+      <w:r>
+        <w:t>Shostack</w:t>
+      </w:r>
+      <w:proofErr w:type="spellEnd"/>
+      <w:r>
+        <w:t xml:space="preserve">, A. (n.d.). Threat </w:t>
+      </w:r>
+      <w:proofErr w:type="spellStart"/>
+      <w:r>
+        <w:t>Modeling</w:t>
+      </w:r>
+      <w:proofErr w:type="spellEnd"/>
+      <w:r>
+        <w:t xml:space="preserve"> Process</w:t>
       </w:r>
       <w:r>
         <w:t xml:space="preserve">. OWASP. </w:t>
       </w:r>
-      <w:hyperlink r:id="rId43" w:history="1">
+      <w:hyperlink r:id="rId47" w:history="1">
         <w:r>
           <w:rPr>
             <w:rStyle w:val="Hyperlink"/>
@@ -10838,7 +11564,7 @@
       <w:r>
         <w:t xml:space="preserve">). Computer Misuse Act. The Code for Crown Prosecutors. </w:t>
       </w:r>
-      <w:hyperlink r:id="rId44" w:history="1">
+      <w:hyperlink r:id="rId48" w:history="1">
         <w:r>
           <w:rPr>
             <w:rStyle w:val="Hyperlink"/>
@@ -10870,7 +11596,7 @@
       <w:r>
         <w:t xml:space="preserve">, b). Fraud Act 2006. The Code for Crown Prosecutors. </w:t>
       </w:r>
-      <w:hyperlink r:id="rId45" w:history="1">
+      <w:hyperlink r:id="rId49" w:history="1">
         <w:r>
           <w:rPr>
             <w:rStyle w:val="Hyperlink"/>
@@ -10893,7 +11619,7 @@
       <w:r>
         <w:t xml:space="preserve">GDPR. (n.d.). What is GDPR, the EU’s new data protection law? GDPR. </w:t>
       </w:r>
-      <w:hyperlink r:id="rId46" w:history="1">
+      <w:hyperlink r:id="rId50" w:history="1">
         <w:r>
           <w:rPr>
             <w:rStyle w:val="Hyperlink"/>
@@ -10916,7 +11642,7 @@
       <w:r>
         <w:t xml:space="preserve">Creativyst Software. (n.d.). How To: The Comma Separated Value (CSV) File Format. Creativyst Software. </w:t>
       </w:r>
-      <w:hyperlink r:id="rId47" w:history="1">
+      <w:hyperlink r:id="rId51" w:history="1">
         <w:r>
           <w:rPr>
             <w:rStyle w:val="Hyperlink"/>
@@ -10952,9 +11678,17 @@
         <w:t>How ‘Dynasty Warriors’ Created One of Gaming’s Best Action Subgenres</w:t>
       </w:r>
       <w:r>
-        <w:t xml:space="preserve">. RollingStone. </w:t>
-      </w:r>
-      <w:hyperlink r:id="rId48" w:history="1">
+        <w:t xml:space="preserve">. </w:t>
+      </w:r>
+      <w:proofErr w:type="spellStart"/>
+      <w:r>
+        <w:t>RollingStone</w:t>
+      </w:r>
+      <w:proofErr w:type="spellEnd"/>
+      <w:r>
+        <w:t xml:space="preserve">. </w:t>
+      </w:r>
+      <w:hyperlink r:id="rId52" w:history="1">
         <w:r>
           <w:rPr>
             <w:rStyle w:val="Hyperlink"/>
@@ -10977,7 +11711,7 @@
       <w:r>
         <w:t xml:space="preserve">GeeksForGeeks. (2025). Python Web Scraping Tutorial. GeeksForGeeks. </w:t>
       </w:r>
-      <w:hyperlink r:id="rId49" w:history="1">
+      <w:hyperlink r:id="rId53" w:history="1">
         <w:r>
           <w:rPr>
             <w:rStyle w:val="Hyperlink"/>
@@ -11000,7 +11734,7 @@
       <w:r>
         <w:t xml:space="preserve">Interaction Design Foundation. (n.d.). Infinite Scrolling. Interaction Design Foundation. </w:t>
       </w:r>
-      <w:hyperlink r:id="rId50" w:history="1">
+      <w:hyperlink r:id="rId54" w:history="1">
         <w:r>
           <w:rPr>
             <w:rStyle w:val="Hyperlink"/>
@@ -11023,7 +11757,7 @@
       <w:r>
         <w:t xml:space="preserve">Iwanna, B., Rizvi, S., Ahmed, S., Dengel, A., &amp; Uchida, S. Judging a Book By its Cover. Cornell University. </w:t>
       </w:r>
-      <w:hyperlink r:id="rId51" w:history="1">
+      <w:hyperlink r:id="rId55" w:history="1">
         <w:r>
           <w:rPr>
             <w:rStyle w:val="Hyperlink"/>
@@ -11047,9 +11781,17 @@
         <w:t xml:space="preserve">Jones, K., &amp; Martin, L. (2016). </w:t>
       </w:r>
       <w:r>
-        <w:t xml:space="preserve">Adapting infinite-scroll with user experience in mind. DiVA. </w:t>
-      </w:r>
-      <w:hyperlink r:id="rId52" w:history="1">
+        <w:t xml:space="preserve">Adapting infinite-scroll with user experience in mind. </w:t>
+      </w:r>
+      <w:proofErr w:type="spellStart"/>
+      <w:r>
+        <w:t>DiVA</w:t>
+      </w:r>
+      <w:proofErr w:type="spellEnd"/>
+      <w:r>
+        <w:t xml:space="preserve">. </w:t>
+      </w:r>
+      <w:hyperlink r:id="rId56" w:history="1">
         <w:r>
           <w:rPr>
             <w:rStyle w:val="Hyperlink"/>
@@ -11069,10 +11811,23 @@
           <w:numId w:val="1"/>
         </w:numPr>
       </w:pPr>
-      <w:r>
-        <w:t xml:space="preserve">LabEx. (n.d.). How to manage CSV file encoding. LabEx. </w:t>
-      </w:r>
-      <w:hyperlink r:id="rId53" w:history="1">
+      <w:proofErr w:type="spellStart"/>
+      <w:r>
+        <w:t>LabEx</w:t>
+      </w:r>
+      <w:proofErr w:type="spellEnd"/>
+      <w:r>
+        <w:t xml:space="preserve">. (n.d.). How to manage CSV file encoding. </w:t>
+      </w:r>
+      <w:proofErr w:type="spellStart"/>
+      <w:r>
+        <w:t>LabEx</w:t>
+      </w:r>
+      <w:proofErr w:type="spellEnd"/>
+      <w:r>
+        <w:t xml:space="preserve">. </w:t>
+      </w:r>
+      <w:hyperlink r:id="rId57" w:history="1">
         <w:r>
           <w:rPr>
             <w:rStyle w:val="Hyperlink"/>
@@ -11101,7 +11856,7 @@
       <w:r>
         <w:t xml:space="preserve">). A descriptive study of assumptions in STRIDE security threat modelling. Software and Systems Modelling, 21(6), 2311-2328. </w:t>
       </w:r>
-      <w:hyperlink r:id="rId54" w:history="1">
+      <w:hyperlink r:id="rId58" w:history="1">
         <w:r>
           <w:rPr>
             <w:rStyle w:val="Hyperlink"/>
@@ -11136,7 +11891,7 @@
       <w:r>
         <w:t xml:space="preserve">). The effects of COVID-19 on agriculture supply chain, food security, and environment: a review. Environmental Science. </w:t>
       </w:r>
-      <w:hyperlink r:id="rId55" w:history="1">
+      <w:hyperlink r:id="rId59" w:history="1">
         <w:r>
           <w:rPr>
             <w:rStyle w:val="Hyperlink"/>
@@ -11165,7 +11920,7 @@
       <w:r>
         <w:t xml:space="preserve">. MDN Web Docs. </w:t>
       </w:r>
-      <w:hyperlink r:id="rId56" w:history="1">
+      <w:hyperlink r:id="rId60" w:history="1">
         <w:r>
           <w:rPr>
             <w:rStyle w:val="Hyperlink"/>
@@ -11189,7 +11944,7 @@
         <w:lastRenderedPageBreak/>
         <w:t xml:space="preserve">Microsoft Learn. (2009). The STRIDE Threat Model. Microsoft Learn. </w:t>
       </w:r>
-      <w:hyperlink r:id="rId57" w:history="1">
+      <w:hyperlink r:id="rId61" w:history="1">
         <w:r>
           <w:rPr>
             <w:rStyle w:val="Hyperlink"/>
@@ -11212,7 +11967,7 @@
       <w:r>
         <w:t xml:space="preserve">Microsoft Support. (n.d.). Create or edit .csv files to import into Outlook. Microsoft Support. </w:t>
       </w:r>
-      <w:hyperlink r:id="rId58" w:history="1">
+      <w:hyperlink r:id="rId62" w:history="1">
         <w:r>
           <w:rPr>
             <w:rStyle w:val="Hyperlink"/>
@@ -11232,7 +11987,7 @@
       <w:r>
         <w:t xml:space="preserve">MySQL. (n.d.). 1.2.1 What is MySQL? MySQL Documentation. </w:t>
       </w:r>
-      <w:hyperlink r:id="rId59" w:history="1">
+      <w:hyperlink r:id="rId63" w:history="1">
         <w:r>
           <w:rPr>
             <w:rStyle w:val="Hyperlink"/>
@@ -11255,7 +12010,7 @@
       <w:r>
         <w:t xml:space="preserve">Nawaz, S., Bhowmik, J., Linden, T., &amp; Mitchell, M. (2024, September). Adapting to the new normal: Understanding the impact of COVID-19 on technology usage and human behaviour. Entertainment Computing, 51, 100726. </w:t>
       </w:r>
-      <w:hyperlink r:id="rId60" w:tgtFrame="_blank" w:tooltip="Persistent link using digital object identifier" w:history="1">
+      <w:hyperlink r:id="rId64" w:tgtFrame="_blank" w:tooltip="Persistent link using digital object identifier" w:history="1">
         <w:r>
           <w:rPr>
             <w:rStyle w:val="Hyperlink"/>
@@ -11278,7 +12033,7 @@
       <w:r>
         <w:t xml:space="preserve">Pypi. (n.d. -a). requests 2.32.3. Pypi. </w:t>
       </w:r>
-      <w:hyperlink r:id="rId61" w:history="1">
+      <w:hyperlink r:id="rId65" w:history="1">
         <w:r>
           <w:rPr>
             <w:rStyle w:val="Hyperlink"/>
@@ -11304,7 +12059,7 @@
       <w:r>
         <w:t xml:space="preserve">soup4 4.13.4. Pypi. </w:t>
       </w:r>
-      <w:hyperlink r:id="rId62" w:history="1">
+      <w:hyperlink r:id="rId66" w:history="1">
         <w:r>
           <w:rPr>
             <w:rStyle w:val="Hyperlink"/>
@@ -11327,7 +12082,7 @@
       <w:r>
         <w:t xml:space="preserve">Pypi. (n.d. -c). selenium 4.33.0. Pypi. </w:t>
       </w:r>
-      <w:hyperlink r:id="rId63" w:history="1">
+      <w:hyperlink r:id="rId67" w:history="1">
         <w:r>
           <w:rPr>
             <w:rStyle w:val="Hyperlink"/>
@@ -11350,7 +12105,7 @@
       <w:r>
         <w:t xml:space="preserve">Pypi. (n.d. -d). schedule 1.2.2. Pypi. </w:t>
       </w:r>
-      <w:hyperlink r:id="rId64" w:history="1">
+      <w:hyperlink r:id="rId68" w:history="1">
         <w:r>
           <w:rPr>
             <w:rStyle w:val="Hyperlink"/>
@@ -11371,9 +12126,17 @@
         </w:numPr>
       </w:pPr>
       <w:r>
-        <w:t xml:space="preserve">Pypi. (n.d. -e). mysql-connector-python 9.3.0. Pypi. </w:t>
-      </w:r>
-      <w:hyperlink r:id="rId65" w:history="1">
+        <w:t xml:space="preserve">Pypi. (n.d. -e). </w:t>
+      </w:r>
+      <w:proofErr w:type="spellStart"/>
+      <w:r>
+        <w:t>mysql</w:t>
+      </w:r>
+      <w:proofErr w:type="spellEnd"/>
+      <w:r>
+        <w:t xml:space="preserve">-connector-python 9.3.0. Pypi. </w:t>
+      </w:r>
+      <w:hyperlink r:id="rId69" w:history="1">
         <w:r>
           <w:rPr>
             <w:rStyle w:val="Hyperlink"/>
@@ -11402,7 +12165,7 @@
       <w:r>
         <w:t xml:space="preserve">). csv – CSV File Reading and Writing. Python. </w:t>
       </w:r>
-      <w:hyperlink r:id="rId66" w:history="1">
+      <w:hyperlink r:id="rId70" w:history="1">
         <w:r>
           <w:rPr>
             <w:rStyle w:val="Hyperlink"/>
@@ -11434,7 +12197,7 @@
       <w:r>
         <w:t xml:space="preserve">Unicode HOWTO. Python. </w:t>
       </w:r>
-      <w:hyperlink r:id="rId67" w:history="1">
+      <w:hyperlink r:id="rId71" w:history="1">
         <w:r>
           <w:rPr>
             <w:rStyle w:val="Hyperlink"/>
@@ -11455,9 +12218,17 @@
         </w:numPr>
       </w:pPr>
       <w:r>
-        <w:t xml:space="preserve">Raneri, P., Montag, C., Rozgonjuk, D., Satel, J., &amp; Pontes, H. (2022, June). The role of microtransactions in Internet Gaming Disorder and Gambling Disorder: A preregistered systematic review. Addictive Behaviors Reports. 15, 100415. </w:t>
-      </w:r>
-      <w:hyperlink r:id="rId68" w:history="1">
+        <w:t xml:space="preserve">Raneri, P., Montag, C., Rozgonjuk, D., Satel, J., &amp; Pontes, H. (2022, June). The role of microtransactions in Internet Gaming Disorder and Gambling Disorder: A preregistered systematic review. Addictive </w:t>
+      </w:r>
+      <w:proofErr w:type="spellStart"/>
+      <w:r>
+        <w:t>Behaviors</w:t>
+      </w:r>
+      <w:proofErr w:type="spellEnd"/>
+      <w:r>
+        <w:t xml:space="preserve"> Reports. 15, 100415. </w:t>
+      </w:r>
+      <w:hyperlink r:id="rId72" w:history="1">
         <w:r>
           <w:rPr>
             <w:rStyle w:val="Hyperlink"/>
@@ -11478,9 +12249,17 @@
         </w:numPr>
       </w:pPr>
       <w:r>
-        <w:t xml:space="preserve">Requests Documentation. (n.d.). Quickstartn. Requests Documentation. </w:t>
-      </w:r>
-      <w:hyperlink r:id="rId69" w:history="1">
+        <w:t xml:space="preserve">Requests Documentation. (n.d.). </w:t>
+      </w:r>
+      <w:proofErr w:type="spellStart"/>
+      <w:r>
+        <w:t>Quickstartn</w:t>
+      </w:r>
+      <w:proofErr w:type="spellEnd"/>
+      <w:r>
+        <w:t xml:space="preserve">. Requests Documentation. </w:t>
+      </w:r>
+      <w:hyperlink r:id="rId73" w:history="1">
         <w:r>
           <w:rPr>
             <w:rStyle w:val="Hyperlink"/>
@@ -11503,7 +12282,7 @@
       <w:r>
         <w:t xml:space="preserve">Samuli, K. (2022, January 19th). Pricing economics of video games: a panel data study on the effects of versioning on revenue. University of Oulu Repository. </w:t>
       </w:r>
-      <w:hyperlink r:id="rId70" w:history="1">
+      <w:hyperlink r:id="rId74" w:history="1">
         <w:r>
           <w:rPr>
             <w:rStyle w:val="Hyperlink"/>
@@ -11526,7 +12305,7 @@
       <w:r>
         <w:t xml:space="preserve">Selenium. (n.d.). Locating Elements. Selenium. </w:t>
       </w:r>
-      <w:hyperlink r:id="rId71" w:history="1">
+      <w:hyperlink r:id="rId75" w:history="1">
         <w:r>
           <w:rPr>
             <w:rStyle w:val="Hyperlink"/>
@@ -11549,7 +12328,7 @@
       <w:r>
         <w:t xml:space="preserve">ScrapeOps. (n.d.). How To Scroll Infinite Pages in Python. ScrapeOps. </w:t>
       </w:r>
-      <w:hyperlink r:id="rId72" w:history="1">
+      <w:hyperlink r:id="rId76" w:history="1">
         <w:r>
           <w:rPr>
             <w:rStyle w:val="Hyperlink"/>
@@ -11593,7 +12372,7 @@
       <w:r>
         <w:t xml:space="preserve">Steam. (n.d.). Portal 2. Steam. </w:t>
       </w:r>
-      <w:hyperlink r:id="rId73" w:history="1">
+      <w:hyperlink r:id="rId77" w:history="1">
         <w:r>
           <w:rPr>
             <w:rStyle w:val="Hyperlink"/>
@@ -11615,9 +12394,17 @@
       </w:pPr>
       <w:r>
         <w:lastRenderedPageBreak/>
-        <w:t xml:space="preserve">Steamworks. (n.d.). Steam Direct (Joining The Steamworks Distribution Program). Steam. </w:t>
-      </w:r>
-      <w:hyperlink r:id="rId74" w:history="1">
+        <w:t xml:space="preserve">Steamworks. (n.d.). Steam Direct (Joining </w:t>
+      </w:r>
+      <w:proofErr w:type="gramStart"/>
+      <w:r>
+        <w:t>The</w:t>
+      </w:r>
+      <w:proofErr w:type="gramEnd"/>
+      <w:r>
+        <w:t xml:space="preserve"> Steamworks Distribution Program). Steam. </w:t>
+      </w:r>
+      <w:hyperlink r:id="rId78" w:history="1">
         <w:r>
           <w:rPr>
             <w:rStyle w:val="Hyperlink"/>
@@ -11637,10 +12424,23 @@
           <w:numId w:val="1"/>
         </w:numPr>
       </w:pPr>
-      <w:r>
-        <w:t xml:space="preserve">Tedboy. (n.d.). Beautiful Soup Documentation. Github. </w:t>
-      </w:r>
-      <w:hyperlink r:id="rId75" w:history="1">
+      <w:proofErr w:type="spellStart"/>
+      <w:r>
+        <w:t>Tedboy</w:t>
+      </w:r>
+      <w:proofErr w:type="spellEnd"/>
+      <w:r>
+        <w:t xml:space="preserve">. (n.d.). Beautiful Soup Documentation. </w:t>
+      </w:r>
+      <w:proofErr w:type="spellStart"/>
+      <w:r>
+        <w:t>Github</w:t>
+      </w:r>
+      <w:proofErr w:type="spellEnd"/>
+      <w:r>
+        <w:t xml:space="preserve">. </w:t>
+      </w:r>
+      <w:hyperlink r:id="rId79" w:history="1">
         <w:r>
           <w:rPr>
             <w:rStyle w:val="Hyperlink"/>
@@ -11663,7 +12463,7 @@
       <w:r>
         <w:t xml:space="preserve">United Kingdom. (n.d.). Data protection (The UK’s data protection legislation). United Kingdom. </w:t>
       </w:r>
-      <w:hyperlink r:id="rId76" w:history="1">
+      <w:hyperlink r:id="rId80" w:history="1">
         <w:r>
           <w:rPr>
             <w:rStyle w:val="Hyperlink"/>
@@ -11692,7 +12492,7 @@
       <w:r>
         <w:t xml:space="preserve">). The UK Copyright Service. </w:t>
       </w:r>
-      <w:hyperlink r:id="rId77" w:history="1">
+      <w:hyperlink r:id="rId81" w:history="1">
         <w:r>
           <w:rPr>
             <w:rStyle w:val="Hyperlink"/>
@@ -11724,7 +12524,7 @@
       <w:r>
         <w:t xml:space="preserve">). Tim Schafer persuades fans to finance next adventure game. Wired. Archive: </w:t>
       </w:r>
-      <w:hyperlink r:id="rId78" w:history="1">
+      <w:hyperlink r:id="rId82" w:history="1">
         <w:r>
           <w:rPr>
             <w:rStyle w:val="Hyperlink"/>
@@ -11759,13 +12559,18 @@
       <w:r>
         <w:t xml:space="preserve">Zhao, B. (2017). Web Scraping. </w:t>
       </w:r>
-      <w:r>
-        <w:t xml:space="preserve">Encyclopedia </w:t>
+      <w:proofErr w:type="spellStart"/>
+      <w:r>
+        <w:t>Encyclopedia</w:t>
+      </w:r>
+      <w:proofErr w:type="spellEnd"/>
+      <w:r>
+        <w:t xml:space="preserve"> </w:t>
       </w:r>
       <w:r>
         <w:t xml:space="preserve">of Big Data. </w:t>
       </w:r>
-      <w:hyperlink r:id="rId79" w:history="1">
+      <w:hyperlink r:id="rId83" w:history="1">
         <w:r>
           <w:rPr>
             <w:rStyle w:val="Hyperlink"/>
@@ -11784,7 +12589,7 @@
       <w:r>
         <w:t xml:space="preserve">ALT: </w:t>
       </w:r>
-      <w:hyperlink r:id="rId80" w:history="1">
+      <w:hyperlink r:id="rId84" w:history="1">
         <w:r>
           <w:rPr>
             <w:rStyle w:val="Hyperlink"/>

</xml_diff>

<commit_message>
Various rewrites of report
</commit_message>
<xml_diff>
--- a/(0) Disertation/Dissertation.docx
+++ b/(0) Disertation/Dissertation.docx
@@ -4595,7 +4595,13 @@
     </w:p>
     <w:p>
       <w:r>
-        <w:t xml:space="preserve">When searching for new video games, it can be hard for uses to find games that they might be interested </w:t>
+        <w:t>When searching for new video games, it can be hard for use</w:t>
+      </w:r>
+      <w:r>
+        <w:t>r</w:t>
+      </w:r>
+      <w:r>
+        <w:t xml:space="preserve">s to find games that they might be interested </w:t>
       </w:r>
       <w:proofErr w:type="gramStart"/>
       <w:r>
@@ -4606,7 +4612,13 @@
         <w:t xml:space="preserve"> and it can be hard for businesses to </w:t>
       </w:r>
       <w:r>
-        <w:t xml:space="preserve">reach new users. To help with this, using publicly data from the internet, a database could be built that, with a user interface such as a web application, could help users find games they are interested in that are </w:t>
+        <w:t>reach new users. To help with this, using publicly</w:t>
+      </w:r>
+      <w:r>
+        <w:t xml:space="preserve"> available</w:t>
+      </w:r>
+      <w:r>
+        <w:t xml:space="preserve"> data from the internet, a database could be built that, with a user interface such as a web application, could help users find games they are interested in that are </w:t>
       </w:r>
       <w:proofErr w:type="gramStart"/>
       <w:r>
@@ -4650,7 +4662,13 @@
         <w:t xml:space="preserve">To start, this document will conduct a review of the literature regarding this topic, specifically </w:t>
       </w:r>
       <w:r>
-        <w:t>the reason for a tagging website, what scraping is and the reason for using it and the law and security issues this project needs to acknowledge</w:t>
+        <w:t xml:space="preserve">the reason for a tagging website, what scraping is and the reason for using it </w:t>
+      </w:r>
+      <w:r>
+        <w:t>along with</w:t>
+      </w:r>
+      <w:r>
+        <w:t xml:space="preserve"> the law and security issues this project needs to acknowledge</w:t>
       </w:r>
       <w:r>
         <w:t xml:space="preserve">. </w:t>
@@ -4774,13 +4792,31 @@
         <w:t>They</w:t>
       </w:r>
       <w:r>
-        <w:t xml:space="preserve"> also taking longer to choose. Castillo (2013) </w:t>
+        <w:t xml:space="preserve"> also ta</w:t>
+      </w:r>
+      <w:r>
+        <w:t>ke</w:t>
+      </w:r>
+      <w:r>
+        <w:t xml:space="preserve"> longer to choose. Castillo (2013) </w:t>
       </w:r>
       <w:r>
         <w:t>states that</w:t>
       </w:r>
       <w:r>
-        <w:t>, when someone knows or has expertise about the items or options in a choice, they will be able to give a more confident choice than when they know little about the items or options</w:t>
+        <w:t xml:space="preserve">, when someone knows or has expertise about the items or options in a choice, they will be able to </w:t>
+      </w:r>
+      <w:r>
+        <w:t>make</w:t>
+      </w:r>
+      <w:r>
+        <w:t xml:space="preserve"> a more confident </w:t>
+      </w:r>
+      <w:r>
+        <w:t>decision</w:t>
+      </w:r>
+      <w:r>
+        <w:t xml:space="preserve"> than when they know little about the items or options</w:t>
       </w:r>
       <w:r>
         <w:t xml:space="preserve">. </w:t>
@@ -4999,7 +5035,7 @@
         <w:t xml:space="preserve"> and Zhao (2017)</w:t>
       </w:r>
       <w:r>
-        <w:t>, a way to use the internet to collection public information for a specific purpose</w:t>
+        <w:t>, a way to use the internet to collect public information for a specific purpose</w:t>
       </w:r>
       <w:r>
         <w:t xml:space="preserve"> such as </w:t>
@@ -5017,11 +5053,16 @@
         <w:t>It allows an easier way to collect information from a public source without needing to request it (Smith 2019)</w:t>
       </w:r>
       <w:r>
-        <w:t xml:space="preserve"> This can be done by a human manually or a bot automatically (Zhao, 2017)</w:t>
-      </w:r>
-      <w:r>
         <w:t>.</w:t>
       </w:r>
+    </w:p>
+    <w:p>
+      <w:r>
+        <w:t>This can be done by a human manually or a bot automatically (Zhao, 2017)</w:t>
+      </w:r>
+      <w:r>
+        <w:t>.</w:t>
+      </w:r>
       <w:r>
         <w:t xml:space="preserve"> An example of this given by Smith (2019) is for the indexing of a search engine by having a scraping program go from website to website to collect the information on each page and allow each page to be search</w:t>
       </w:r>
@@ -5090,11 +5131,9 @@
       <w:r>
         <w:t xml:space="preserve">potentially </w:t>
       </w:r>
-      <w:proofErr w:type="gramStart"/>
-      <w:r>
-        <w:t>violating</w:t>
-      </w:r>
-      <w:proofErr w:type="gramEnd"/>
+      <w:r>
+        <w:t>violate</w:t>
+      </w:r>
       <w:r>
         <w:t xml:space="preserve"> a company’s terms of service (Zhao, 2017). However, Zhao (2017) argues that it is difficult to prove the data’s copyright due to “only a specific section of the data [being] legally protected”, while arguing that terms of service fall into a “gr</w:t>
       </w:r>
@@ -5108,15 +5147,7 @@
         <w:t>scraped</w:t>
       </w:r>
       <w:r>
-        <w:t xml:space="preserve"> in this project should have its source saved and, </w:t>
-      </w:r>
-      <w:proofErr w:type="gramStart"/>
-      <w:r>
-        <w:t>in</w:t>
-      </w:r>
-      <w:proofErr w:type="gramEnd"/>
-      <w:r>
-        <w:t xml:space="preserve"> the website, linked to </w:t>
+        <w:t xml:space="preserve"> in this project should have its source saved and, in the website, linked to </w:t>
       </w:r>
       <w:proofErr w:type="gramStart"/>
       <w:r>
@@ -6000,7 +6031,25 @@
     </w:p>
     <w:p>
       <w:r>
-        <w:t>Due to this project using scraping, it runs the risk of collecting data that is not entirely accurate and data that might contain biases</w:t>
+        <w:t xml:space="preserve">Due </w:t>
+      </w:r>
+      <w:r>
+        <w:t xml:space="preserve">to </w:t>
+      </w:r>
+      <w:r>
+        <w:t>t</w:t>
+      </w:r>
+      <w:r>
+        <w:t xml:space="preserve">he use of </w:t>
+      </w:r>
+      <w:r>
+        <w:t xml:space="preserve">scraping, </w:t>
+      </w:r>
+      <w:r>
+        <w:t>there is a</w:t>
+      </w:r>
+      <w:r>
+        <w:t xml:space="preserve"> risk of collecting data that is not entirely accurate and data that might contain biases</w:t>
       </w:r>
       <w:r>
         <w:t xml:space="preserve"> or ethical issues. However, the main target for this program is the online video game distributor known as Steam. </w:t>
@@ -6015,7 +6064,13 @@
         <w:t>reviewing</w:t>
       </w:r>
       <w:r>
-        <w:t xml:space="preserve"> it to confirm that it is working and not harmful (Steamworks, n.d.). Because this information is submitted by the author themselves</w:t>
+        <w:t xml:space="preserve"> it to confirm that it is working and not harmful (Steamworks, n.d.). </w:t>
+      </w:r>
+      <w:r>
+        <w:t>Since</w:t>
+      </w:r>
+      <w:r>
+        <w:t xml:space="preserve"> this information is submitted by the author themselves</w:t>
       </w:r>
       <w:r>
         <w:t>, it is assumed</w:t>
@@ -6459,7 +6514,14 @@
         </w:numPr>
       </w:pPr>
       <w:r>
-        <w:t xml:space="preserve">Scraping program: </w:t>
+        <w:rPr>
+          <w:b/>
+          <w:bCs/>
+        </w:rPr>
+        <w:t>Scraping program:</w:t>
+      </w:r>
+      <w:r>
+        <w:t xml:space="preserve"> </w:t>
       </w:r>
       <w:r>
         <w:t xml:space="preserve">This </w:t>
@@ -6492,7 +6554,14 @@
         </w:numPr>
       </w:pPr>
       <w:r>
-        <w:t xml:space="preserve">CSV: The data is then saved using the comma separated values format which will then be normalised using Excel </w:t>
+        <w:rPr>
+          <w:b/>
+          <w:bCs/>
+        </w:rPr>
+        <w:t>CSV:</w:t>
+      </w:r>
+      <w:r>
+        <w:t xml:space="preserve"> The data is then saved using the comma separated values format which will then be normalised using Excel </w:t>
       </w:r>
       <w:r>
         <w:t>and</w:t>
@@ -6516,7 +6585,14 @@
         </w:numPr>
       </w:pPr>
       <w:r>
-        <w:t xml:space="preserve">MySQL database: The normalised data will be loaded into a MySQL database using Python. </w:t>
+        <w:rPr>
+          <w:b/>
+          <w:bCs/>
+        </w:rPr>
+        <w:t>MySQL database:</w:t>
+      </w:r>
+      <w:r>
+        <w:t xml:space="preserve"> The normalised data will be loaded into a MySQL database using Python. </w:t>
       </w:r>
     </w:p>
     <w:p>
@@ -6528,7 +6604,14 @@
         </w:numPr>
       </w:pPr>
       <w:r>
-        <w:t xml:space="preserve">Website: </w:t>
+        <w:rPr>
+          <w:b/>
+          <w:bCs/>
+        </w:rPr>
+        <w:t>Website:</w:t>
+      </w:r>
+      <w:r>
+        <w:t xml:space="preserve"> </w:t>
       </w:r>
       <w:r>
         <w:t>Allows users to search for video games.</w:t>
@@ -6790,15 +6873,7 @@
     </w:p>
     <w:p>
       <w:r>
-        <w:t xml:space="preserve">Using </w:t>
-      </w:r>
-      <w:proofErr w:type="gramStart"/>
-      <w:r>
-        <w:t>Steam’s</w:t>
-      </w:r>
-      <w:proofErr w:type="gramEnd"/>
-      <w:r>
-        <w:t xml:space="preserve"> all games page</w:t>
+        <w:t>Using Steam’s all games page</w:t>
       </w:r>
       <w:r>
         <w:t>,</w:t>
@@ -7193,7 +7268,18 @@
         <w:t>“Features”. The features seem to describe the</w:t>
       </w:r>
       <w:r>
-        <w:t xml:space="preserve"> gameplay features that make up a game such as the game being singleplayer or multiplayer, what the game can be played on, if the game has achievements or if there are any third part agreements that need to be made to play the game. This section does not have a header and so the name of this data is taken from the HTML</w:t>
+        <w:t xml:space="preserve"> gameplay features that make up a game such as the game being singleplayer or multiplayer, what the game can be played on, if the game has achievements or if there are any </w:t>
+      </w:r>
+      <w:proofErr w:type="gramStart"/>
+      <w:r>
+        <w:t>third part</w:t>
+      </w:r>
+      <w:r>
+        <w:t>y</w:t>
+      </w:r>
+      <w:proofErr w:type="gramEnd"/>
+      <w:r>
+        <w:t xml:space="preserve"> agreements that need to be made to play the game. This section does not have a header and so the name of this data is taken from the HTML</w:t>
       </w:r>
       <w:r>
         <w:t xml:space="preserve"> class it is within.</w:t>
@@ -7841,7 +7927,7 @@
           <w:noProof/>
         </w:rPr>
         <w:drawing>
-          <wp:inline distT="0" distB="0" distL="0" distR="0" wp14:anchorId="40ABE2E5" wp14:editId="3F934B27">
+          <wp:inline distT="0" distB="0" distL="0" distR="0" wp14:anchorId="40ABE2E5" wp14:editId="5150F0DB">
             <wp:extent cx="4162425" cy="1246650"/>
             <wp:effectExtent l="38100" t="38100" r="28575" b="29845"/>
             <wp:docPr id="1701288164" name="Picture 2" descr="A computer screen with text on it&#10;&#10;AI-generated content may be incorrect."/>
@@ -8061,7 +8147,13 @@
         <w:t>i</w:t>
       </w:r>
       <w:r>
-        <w:t xml:space="preserve">t takes a longer to scrape than the requests library. </w:t>
+        <w:t>t takes a longer</w:t>
+      </w:r>
+      <w:r>
+        <w:t xml:space="preserve"> time</w:t>
+      </w:r>
+      <w:r>
+        <w:t xml:space="preserve"> to scrape than the requests library. </w:t>
       </w:r>
       <w:r>
         <w:t xml:space="preserve">Using the time library, both programs were timed </w:t>
@@ -8205,7 +8297,7 @@
           <w:noProof/>
         </w:rPr>
         <w:drawing>
-          <wp:inline distT="0" distB="0" distL="0" distR="0" wp14:anchorId="5F05F26C" wp14:editId="360381B2">
+          <wp:inline distT="0" distB="0" distL="0" distR="0" wp14:anchorId="5F05F26C" wp14:editId="6A90D53A">
             <wp:extent cx="5731510" cy="637540"/>
             <wp:effectExtent l="38100" t="38100" r="40640" b="29210"/>
             <wp:docPr id="1908628895" name="Picture 2"/>
@@ -8449,11 +8541,9 @@
       <w:r>
         <w:t xml:space="preserve"> is </w:t>
       </w:r>
-      <w:proofErr w:type="spellStart"/>
-      <w:r>
-        <w:t>recieved</w:t>
-      </w:r>
-      <w:proofErr w:type="spellEnd"/>
+      <w:r>
+        <w:t>received</w:t>
+      </w:r>
       <w:r>
         <w:t>, no additional HTML is received</w:t>
       </w:r>
@@ -8710,7 +8800,7 @@
           <w:noProof/>
         </w:rPr>
         <w:drawing>
-          <wp:inline distT="0" distB="0" distL="0" distR="0" wp14:anchorId="1F65946C" wp14:editId="1A0E69F4">
+          <wp:inline distT="0" distB="0" distL="0" distR="0" wp14:anchorId="1F65946C" wp14:editId="1E02C01D">
             <wp:extent cx="5731510" cy="530860"/>
             <wp:effectExtent l="38100" t="38100" r="40640" b="40640"/>
             <wp:docPr id="1929413245" name="Picture 5"/>
@@ -11258,6 +11348,9 @@
     </w:p>
     <w:p>
       <w:r>
+        <w:t>\</w:t>
+      </w:r>
+      <w:r>
         <w:br w:type="page"/>
       </w:r>
     </w:p>
@@ -11328,13 +11421,104 @@
       </w:r>
       <w:proofErr w:type="gramEnd"/>
       <w:r>
-        <w:t xml:space="preserve"> these files contain functions that follow the pattern seen in the above image, that is: Connect to the database, </w:t>
+        <w:t xml:space="preserve"> these files contain functions that follow the pattern seen in the above image, that is:</w:t>
+      </w:r>
+      <w:r>
+        <w:t xml:space="preserve"> They c</w:t>
+      </w:r>
+      <w:r>
+        <w:t xml:space="preserve">onnect to the database, </w:t>
       </w:r>
       <w:r>
         <w:t>execute SQL commands, close the connection and then return any data.</w:t>
       </w:r>
     </w:p>
     <w:p>
+      <w:pPr>
+        <w:keepNext/>
+        <w:jc w:val="center"/>
+      </w:pPr>
+      <w:r>
+        <w:rPr>
+          <w:noProof/>
+        </w:rPr>
+        <w:drawing>
+          <wp:inline distT="0" distB="0" distL="0" distR="0" wp14:anchorId="592FE0B6" wp14:editId="54515BEE">
+            <wp:extent cx="5731510" cy="544195"/>
+            <wp:effectExtent l="38100" t="38100" r="40640" b="46355"/>
+            <wp:docPr id="1175305096" name="Picture 1"/>
+            <wp:cNvGraphicFramePr>
+              <a:graphicFrameLocks xmlns:a="http://schemas.openxmlformats.org/drawingml/2006/main" noChangeAspect="1"/>
+            </wp:cNvGraphicFramePr>
+            <a:graphic xmlns:a="http://schemas.openxmlformats.org/drawingml/2006/main">
+              <a:graphicData uri="http://schemas.openxmlformats.org/drawingml/2006/picture">
+                <pic:pic xmlns:pic="http://schemas.openxmlformats.org/drawingml/2006/picture">
+                  <pic:nvPicPr>
+                    <pic:cNvPr id="1175305096" name="Picture 1175305096"/>
+                    <pic:cNvPicPr/>
+                  </pic:nvPicPr>
+                  <pic:blipFill>
+                    <a:blip r:embed="rId45" cstate="print">
+                      <a:extLst>
+                        <a:ext uri="{28A0092B-C50C-407E-A947-70E740481C1C}">
+                          <a14:useLocalDpi xmlns:a14="http://schemas.microsoft.com/office/drawing/2010/main" val="0"/>
+                        </a:ext>
+                      </a:extLst>
+                    </a:blip>
+                    <a:stretch>
+                      <a:fillRect/>
+                    </a:stretch>
+                  </pic:blipFill>
+                  <pic:spPr>
+                    <a:xfrm>
+                      <a:off x="0" y="0"/>
+                      <a:ext cx="5731510" cy="544195"/>
+                    </a:xfrm>
+                    <a:prstGeom prst="rect">
+                      <a:avLst/>
+                    </a:prstGeom>
+                    <a:ln w="38100">
+                      <a:solidFill>
+                        <a:schemeClr val="accent4"/>
+                      </a:solidFill>
+                    </a:ln>
+                  </pic:spPr>
+                </pic:pic>
+              </a:graphicData>
+            </a:graphic>
+          </wp:inline>
+        </w:drawing>
+      </w:r>
+    </w:p>
+    <w:p>
+      <w:pPr>
+        <w:pStyle w:val="Caption"/>
+        <w:jc w:val="center"/>
+      </w:pPr>
+      <w:r>
+        <w:t xml:space="preserve">Figure </w:t>
+      </w:r>
+      <w:fldSimple w:instr=" SEQ Figure \* ARABIC ">
+        <w:r>
+          <w:rPr>
+            <w:noProof/>
+          </w:rPr>
+          <w:t>32</w:t>
+        </w:r>
+      </w:fldSimple>
+      <w:r>
+        <w:t xml:space="preserve">: Search Game </w:t>
+      </w:r>
+      <w:proofErr w:type="gramStart"/>
+      <w:r>
+        <w:t>By</w:t>
+      </w:r>
+      <w:proofErr w:type="gramEnd"/>
+      <w:r>
+        <w:t xml:space="preserve"> Tag Command</w:t>
+      </w:r>
+    </w:p>
+    <w:p>
       <w:r>
         <w:t>Talk about the command that gets games from searched tags (</w:t>
       </w:r>
@@ -11353,29 +11537,8 @@
       </w:r>
     </w:p>
     <w:p>
-      <w:proofErr w:type="gramStart"/>
-      <w:r>
-        <w:t>How’s</w:t>
-      </w:r>
-      <w:proofErr w:type="gramEnd"/>
-      <w:r>
-        <w:t xml:space="preserve"> a third sound to you by the way? Because </w:t>
-      </w:r>
-      <w:proofErr w:type="gramStart"/>
-      <w:r>
-        <w:t>that’s</w:t>
-      </w:r>
-      <w:proofErr w:type="gramEnd"/>
-      <w:r>
-        <w:t xml:space="preserve"> honestly the best </w:t>
-      </w:r>
-      <w:proofErr w:type="gramStart"/>
-      <w:r>
-        <w:t>you’re</w:t>
-      </w:r>
-      <w:proofErr w:type="gramEnd"/>
-      <w:r>
-        <w:t xml:space="preserve"> getting if you even pass.</w:t>
+      <w:r>
+        <w:t>How’s a third sound to you by the way? Because that’s honestly the best you’re getting if you even pass.</w:t>
       </w:r>
     </w:p>
     <w:p>
@@ -11445,7 +11608,7 @@
       <w:r>
         <w:t xml:space="preserve">. Beautiful Soup. </w:t>
       </w:r>
-      <w:hyperlink r:id="rId45" w:history="1">
+      <w:hyperlink r:id="rId46" w:history="1">
         <w:r>
           <w:rPr>
             <w:rStyle w:val="Hyperlink"/>
@@ -11482,7 +11645,7 @@
       <w:r>
         <w:t xml:space="preserve"> AJNR, 34(6), 1111–1112. </w:t>
       </w:r>
-      <w:hyperlink r:id="rId46" w:history="1">
+      <w:hyperlink r:id="rId47" w:history="1">
         <w:r>
           <w:rPr>
             <w:rStyle w:val="Hyperlink"/>
@@ -11532,7 +11695,7 @@
       <w:r>
         <w:t xml:space="preserve">. OWASP. </w:t>
       </w:r>
-      <w:hyperlink r:id="rId47" w:history="1">
+      <w:hyperlink r:id="rId48" w:history="1">
         <w:r>
           <w:rPr>
             <w:rStyle w:val="Hyperlink"/>
@@ -11564,7 +11727,7 @@
       <w:r>
         <w:t xml:space="preserve">). Computer Misuse Act. The Code for Crown Prosecutors. </w:t>
       </w:r>
-      <w:hyperlink r:id="rId48" w:history="1">
+      <w:hyperlink r:id="rId49" w:history="1">
         <w:r>
           <w:rPr>
             <w:rStyle w:val="Hyperlink"/>
@@ -11596,7 +11759,7 @@
       <w:r>
         <w:t xml:space="preserve">, b). Fraud Act 2006. The Code for Crown Prosecutors. </w:t>
       </w:r>
-      <w:hyperlink r:id="rId49" w:history="1">
+      <w:hyperlink r:id="rId50" w:history="1">
         <w:r>
           <w:rPr>
             <w:rStyle w:val="Hyperlink"/>
@@ -11619,7 +11782,7 @@
       <w:r>
         <w:t xml:space="preserve">GDPR. (n.d.). What is GDPR, the EU’s new data protection law? GDPR. </w:t>
       </w:r>
-      <w:hyperlink r:id="rId50" w:history="1">
+      <w:hyperlink r:id="rId51" w:history="1">
         <w:r>
           <w:rPr>
             <w:rStyle w:val="Hyperlink"/>
@@ -11642,7 +11805,7 @@
       <w:r>
         <w:t xml:space="preserve">Creativyst Software. (n.d.). How To: The Comma Separated Value (CSV) File Format. Creativyst Software. </w:t>
       </w:r>
-      <w:hyperlink r:id="rId51" w:history="1">
+      <w:hyperlink r:id="rId52" w:history="1">
         <w:r>
           <w:rPr>
             <w:rStyle w:val="Hyperlink"/>
@@ -11688,7 +11851,7 @@
       <w:r>
         <w:t xml:space="preserve">. </w:t>
       </w:r>
-      <w:hyperlink r:id="rId52" w:history="1">
+      <w:hyperlink r:id="rId53" w:history="1">
         <w:r>
           <w:rPr>
             <w:rStyle w:val="Hyperlink"/>
@@ -11711,7 +11874,7 @@
       <w:r>
         <w:t xml:space="preserve">GeeksForGeeks. (2025). Python Web Scraping Tutorial. GeeksForGeeks. </w:t>
       </w:r>
-      <w:hyperlink r:id="rId53" w:history="1">
+      <w:hyperlink r:id="rId54" w:history="1">
         <w:r>
           <w:rPr>
             <w:rStyle w:val="Hyperlink"/>
@@ -11734,7 +11897,7 @@
       <w:r>
         <w:t xml:space="preserve">Interaction Design Foundation. (n.d.). Infinite Scrolling. Interaction Design Foundation. </w:t>
       </w:r>
-      <w:hyperlink r:id="rId54" w:history="1">
+      <w:hyperlink r:id="rId55" w:history="1">
         <w:r>
           <w:rPr>
             <w:rStyle w:val="Hyperlink"/>
@@ -11757,7 +11920,7 @@
       <w:r>
         <w:t xml:space="preserve">Iwanna, B., Rizvi, S., Ahmed, S., Dengel, A., &amp; Uchida, S. Judging a Book By its Cover. Cornell University. </w:t>
       </w:r>
-      <w:hyperlink r:id="rId55" w:history="1">
+      <w:hyperlink r:id="rId56" w:history="1">
         <w:r>
           <w:rPr>
             <w:rStyle w:val="Hyperlink"/>
@@ -11791,7 +11954,7 @@
       <w:r>
         <w:t xml:space="preserve">. </w:t>
       </w:r>
-      <w:hyperlink r:id="rId56" w:history="1">
+      <w:hyperlink r:id="rId57" w:history="1">
         <w:r>
           <w:rPr>
             <w:rStyle w:val="Hyperlink"/>
@@ -11827,7 +11990,7 @@
       <w:r>
         <w:t xml:space="preserve">. </w:t>
       </w:r>
-      <w:hyperlink r:id="rId57" w:history="1">
+      <w:hyperlink r:id="rId58" w:history="1">
         <w:r>
           <w:rPr>
             <w:rStyle w:val="Hyperlink"/>
@@ -11856,7 +12019,7 @@
       <w:r>
         <w:t xml:space="preserve">). A descriptive study of assumptions in STRIDE security threat modelling. Software and Systems Modelling, 21(6), 2311-2328. </w:t>
       </w:r>
-      <w:hyperlink r:id="rId58" w:history="1">
+      <w:hyperlink r:id="rId59" w:history="1">
         <w:r>
           <w:rPr>
             <w:rStyle w:val="Hyperlink"/>
@@ -11891,7 +12054,7 @@
       <w:r>
         <w:t xml:space="preserve">). The effects of COVID-19 on agriculture supply chain, food security, and environment: a review. Environmental Science. </w:t>
       </w:r>
-      <w:hyperlink r:id="rId59" w:history="1">
+      <w:hyperlink r:id="rId60" w:history="1">
         <w:r>
           <w:rPr>
             <w:rStyle w:val="Hyperlink"/>
@@ -11920,7 +12083,7 @@
       <w:r>
         <w:t xml:space="preserve">. MDN Web Docs. </w:t>
       </w:r>
-      <w:hyperlink r:id="rId60" w:history="1">
+      <w:hyperlink r:id="rId61" w:history="1">
         <w:r>
           <w:rPr>
             <w:rStyle w:val="Hyperlink"/>
@@ -11944,7 +12107,7 @@
         <w:lastRenderedPageBreak/>
         <w:t xml:space="preserve">Microsoft Learn. (2009). The STRIDE Threat Model. Microsoft Learn. </w:t>
       </w:r>
-      <w:hyperlink r:id="rId61" w:history="1">
+      <w:hyperlink r:id="rId62" w:history="1">
         <w:r>
           <w:rPr>
             <w:rStyle w:val="Hyperlink"/>
@@ -11967,7 +12130,7 @@
       <w:r>
         <w:t xml:space="preserve">Microsoft Support. (n.d.). Create or edit .csv files to import into Outlook. Microsoft Support. </w:t>
       </w:r>
-      <w:hyperlink r:id="rId62" w:history="1">
+      <w:hyperlink r:id="rId63" w:history="1">
         <w:r>
           <w:rPr>
             <w:rStyle w:val="Hyperlink"/>
@@ -11987,7 +12150,7 @@
       <w:r>
         <w:t xml:space="preserve">MySQL. (n.d.). 1.2.1 What is MySQL? MySQL Documentation. </w:t>
       </w:r>
-      <w:hyperlink r:id="rId63" w:history="1">
+      <w:hyperlink r:id="rId64" w:history="1">
         <w:r>
           <w:rPr>
             <w:rStyle w:val="Hyperlink"/>
@@ -12010,7 +12173,7 @@
       <w:r>
         <w:t xml:space="preserve">Nawaz, S., Bhowmik, J., Linden, T., &amp; Mitchell, M. (2024, September). Adapting to the new normal: Understanding the impact of COVID-19 on technology usage and human behaviour. Entertainment Computing, 51, 100726. </w:t>
       </w:r>
-      <w:hyperlink r:id="rId64" w:tgtFrame="_blank" w:tooltip="Persistent link using digital object identifier" w:history="1">
+      <w:hyperlink r:id="rId65" w:tgtFrame="_blank" w:tooltip="Persistent link using digital object identifier" w:history="1">
         <w:r>
           <w:rPr>
             <w:rStyle w:val="Hyperlink"/>
@@ -12033,7 +12196,7 @@
       <w:r>
         <w:t xml:space="preserve">Pypi. (n.d. -a). requests 2.32.3. Pypi. </w:t>
       </w:r>
-      <w:hyperlink r:id="rId65" w:history="1">
+      <w:hyperlink r:id="rId66" w:history="1">
         <w:r>
           <w:rPr>
             <w:rStyle w:val="Hyperlink"/>
@@ -12059,7 +12222,7 @@
       <w:r>
         <w:t xml:space="preserve">soup4 4.13.4. Pypi. </w:t>
       </w:r>
-      <w:hyperlink r:id="rId66" w:history="1">
+      <w:hyperlink r:id="rId67" w:history="1">
         <w:r>
           <w:rPr>
             <w:rStyle w:val="Hyperlink"/>
@@ -12082,7 +12245,7 @@
       <w:r>
         <w:t xml:space="preserve">Pypi. (n.d. -c). selenium 4.33.0. Pypi. </w:t>
       </w:r>
-      <w:hyperlink r:id="rId67" w:history="1">
+      <w:hyperlink r:id="rId68" w:history="1">
         <w:r>
           <w:rPr>
             <w:rStyle w:val="Hyperlink"/>
@@ -12105,7 +12268,7 @@
       <w:r>
         <w:t xml:space="preserve">Pypi. (n.d. -d). schedule 1.2.2. Pypi. </w:t>
       </w:r>
-      <w:hyperlink r:id="rId68" w:history="1">
+      <w:hyperlink r:id="rId69" w:history="1">
         <w:r>
           <w:rPr>
             <w:rStyle w:val="Hyperlink"/>
@@ -12136,7 +12299,7 @@
       <w:r>
         <w:t xml:space="preserve">-connector-python 9.3.0. Pypi. </w:t>
       </w:r>
-      <w:hyperlink r:id="rId69" w:history="1">
+      <w:hyperlink r:id="rId70" w:history="1">
         <w:r>
           <w:rPr>
             <w:rStyle w:val="Hyperlink"/>
@@ -12165,7 +12328,7 @@
       <w:r>
         <w:t xml:space="preserve">). csv – CSV File Reading and Writing. Python. </w:t>
       </w:r>
-      <w:hyperlink r:id="rId70" w:history="1">
+      <w:hyperlink r:id="rId71" w:history="1">
         <w:r>
           <w:rPr>
             <w:rStyle w:val="Hyperlink"/>
@@ -12197,7 +12360,7 @@
       <w:r>
         <w:t xml:space="preserve">Unicode HOWTO. Python. </w:t>
       </w:r>
-      <w:hyperlink r:id="rId71" w:history="1">
+      <w:hyperlink r:id="rId72" w:history="1">
         <w:r>
           <w:rPr>
             <w:rStyle w:val="Hyperlink"/>
@@ -12228,7 +12391,7 @@
       <w:r>
         <w:t xml:space="preserve"> Reports. 15, 100415. </w:t>
       </w:r>
-      <w:hyperlink r:id="rId72" w:history="1">
+      <w:hyperlink r:id="rId73" w:history="1">
         <w:r>
           <w:rPr>
             <w:rStyle w:val="Hyperlink"/>
@@ -12259,7 +12422,7 @@
       <w:r>
         <w:t xml:space="preserve">. Requests Documentation. </w:t>
       </w:r>
-      <w:hyperlink r:id="rId73" w:history="1">
+      <w:hyperlink r:id="rId74" w:history="1">
         <w:r>
           <w:rPr>
             <w:rStyle w:val="Hyperlink"/>
@@ -12282,7 +12445,7 @@
       <w:r>
         <w:t xml:space="preserve">Samuli, K. (2022, January 19th). Pricing economics of video games: a panel data study on the effects of versioning on revenue. University of Oulu Repository. </w:t>
       </w:r>
-      <w:hyperlink r:id="rId74" w:history="1">
+      <w:hyperlink r:id="rId75" w:history="1">
         <w:r>
           <w:rPr>
             <w:rStyle w:val="Hyperlink"/>
@@ -12305,7 +12468,7 @@
       <w:r>
         <w:t xml:space="preserve">Selenium. (n.d.). Locating Elements. Selenium. </w:t>
       </w:r>
-      <w:hyperlink r:id="rId75" w:history="1">
+      <w:hyperlink r:id="rId76" w:history="1">
         <w:r>
           <w:rPr>
             <w:rStyle w:val="Hyperlink"/>
@@ -12328,7 +12491,7 @@
       <w:r>
         <w:t xml:space="preserve">ScrapeOps. (n.d.). How To Scroll Infinite Pages in Python. ScrapeOps. </w:t>
       </w:r>
-      <w:hyperlink r:id="rId76" w:history="1">
+      <w:hyperlink r:id="rId77" w:history="1">
         <w:r>
           <w:rPr>
             <w:rStyle w:val="Hyperlink"/>
@@ -12372,7 +12535,7 @@
       <w:r>
         <w:t xml:space="preserve">Steam. (n.d.). Portal 2. Steam. </w:t>
       </w:r>
-      <w:hyperlink r:id="rId77" w:history="1">
+      <w:hyperlink r:id="rId78" w:history="1">
         <w:r>
           <w:rPr>
             <w:rStyle w:val="Hyperlink"/>
@@ -12404,7 +12567,7 @@
       <w:r>
         <w:t xml:space="preserve"> Steamworks Distribution Program). Steam. </w:t>
       </w:r>
-      <w:hyperlink r:id="rId78" w:history="1">
+      <w:hyperlink r:id="rId79" w:history="1">
         <w:r>
           <w:rPr>
             <w:rStyle w:val="Hyperlink"/>
@@ -12440,7 +12603,7 @@
       <w:r>
         <w:t xml:space="preserve">. </w:t>
       </w:r>
-      <w:hyperlink r:id="rId79" w:history="1">
+      <w:hyperlink r:id="rId80" w:history="1">
         <w:r>
           <w:rPr>
             <w:rStyle w:val="Hyperlink"/>
@@ -12463,7 +12626,7 @@
       <w:r>
         <w:t xml:space="preserve">United Kingdom. (n.d.). Data protection (The UK’s data protection legislation). United Kingdom. </w:t>
       </w:r>
-      <w:hyperlink r:id="rId80" w:history="1">
+      <w:hyperlink r:id="rId81" w:history="1">
         <w:r>
           <w:rPr>
             <w:rStyle w:val="Hyperlink"/>
@@ -12492,7 +12655,7 @@
       <w:r>
         <w:t xml:space="preserve">). The UK Copyright Service. </w:t>
       </w:r>
-      <w:hyperlink r:id="rId81" w:history="1">
+      <w:hyperlink r:id="rId82" w:history="1">
         <w:r>
           <w:rPr>
             <w:rStyle w:val="Hyperlink"/>
@@ -12524,7 +12687,7 @@
       <w:r>
         <w:t xml:space="preserve">). Tim Schafer persuades fans to finance next adventure game. Wired. Archive: </w:t>
       </w:r>
-      <w:hyperlink r:id="rId82" w:history="1">
+      <w:hyperlink r:id="rId83" w:history="1">
         <w:r>
           <w:rPr>
             <w:rStyle w:val="Hyperlink"/>
@@ -12570,7 +12733,7 @@
       <w:r>
         <w:t xml:space="preserve">of Big Data. </w:t>
       </w:r>
-      <w:hyperlink r:id="rId83" w:history="1">
+      <w:hyperlink r:id="rId84" w:history="1">
         <w:r>
           <w:rPr>
             <w:rStyle w:val="Hyperlink"/>
@@ -12589,7 +12752,7 @@
       <w:r>
         <w:t xml:space="preserve">ALT: </w:t>
       </w:r>
-      <w:hyperlink r:id="rId84" w:history="1">
+      <w:hyperlink r:id="rId85" w:history="1">
         <w:r>
           <w:rPr>
             <w:rStyle w:val="Hyperlink"/>

</xml_diff>